<commit_message>
Prefer U.S.-based references in the Week 5–8 Project Plan.
Swap non-seminal empirical, SME-size, cyber, and methods-application citations to verified U.S. sources; keep the designated seminal set; bold leftover non-U.S. list entries.

Co-authored-by: delano2x-Procedurals <delano2x-Procedurals@users.noreply.github.com>
</commit_message>
<xml_diff>
--- a/downloads/MW_Wk5_to_wk8_Edit_6Sep26.docx
+++ b/downloads/MW_Wk5_to_wk8_Edit_6Sep26.docx
@@ -586,7 +586,7 @@
           <w:sz w:val="24"/>
           <w:szCs w:val="24"/>
         </w:rPr>
-        <w:t>The general problem is that many U.S. small and medium-sized enterprises (SMEs) suffer avoidable organizational harm during cyber disruptions because they fail to consistently translate IT Disaster Recovery as a Service (ITDRPaaS) capabilities into governed, auditable, and defensible recoverability assurance (Federal Bureau of Investigation, 2024; Verizon, 2025). This inconsistency is particularly pronounced when decision authority is fragmented and oversight is applied inconsistently under pressure (Lowry et al., 2025; Park et al., 2023). Consequently, these disruptions lead to prolonged system downtime, uneven or slow recovery processes, compromised data integrity, and a diminished ability to demonstrate that restoration actions meet acceptable operational and risk thresholds during crisis conditions (Lowry et al., 2025; Park et al., 2023). This issue is most acutely felt by IT and network managers within U.S. SMEs, who bear responsibility for recovery while coordinating across internal teams and external service providers in environments where stakeholder priorities are often in flux (Molete et al., 2025). Furthermore, existing governance arrangements frequently fail to establish clear decision rights, accountability structures, or time-sensitive escalation pathways (Mitchell et al., 1997; Park et al., 2023). Despite increasing scholarship on IT centralization, resilience, and cybersecurity oversight, research remains limited on how U.S. SME IT and network managers operationalize disaster-recovery governance in practice when shifting stakeholder priorities undermine decision rights, escalation pathways, and standards for defensible recoverability assurance (Lowry et al., 2025; Park et al., 2023).</w:t>
+        <w:t>The general problem is that many U.S. small and medium-sized enterprises (SMEs) suffer avoidable organizational harm during cyber disruptions because they fail to consistently translate IT Disaster Recovery as a Service (ITDRPaaS) capabilities into governed, auditable, and defensible recoverability assurance (Federal Bureau of Investigation, 2024; Verizon, 2025). This inconsistency is particularly pronounced when decision authority is fragmented and oversight is applied inconsistently under pressure (Lowry et al., 2025; Park et al., 2023). Consequently, these disruptions lead to prolonged system downtime, uneven or slow recovery processes, compromised data integrity, and a diminished ability to demonstrate that restoration actions meet acceptable operational and risk thresholds during crisis conditions (Lowry et al., 2025; Park et al., 2023). This issue is most acutely felt by IT and network managers within U.S. SMEs, who bear responsibility for recovery while coordinating across internal teams and external service providers in environments where stakeholder priorities are often in flux (Ampel et al., 2024). Furthermore, existing governance arrangements frequently fail to establish clear decision rights, accountability structures, or time-sensitive escalation pathways (Mitchell et al., 1997; Park et al., 2023). Despite increasing scholarship on IT centralization, resilience, and cybersecurity oversight, research remains limited on how U.S. SME IT and network managers operationalize disaster-recovery governance in practice when shifting stakeholder priorities undermine decision rights, escalation pathways, and standards for defensible recoverability assurance (Lowry et al., 2025; Park et al., 2023).</w:t>
       </w:r>
       <w:commentRangeStart w:id="3"/>
       <w:commentRangeStart w:id="4"/>
@@ -2343,11 +2343,12 @@
       <w:r>
         <w:rPr>
           <w:rFonts w:ascii="Times New Roman" w:hAnsi="Times New Roman" w:eastAsia="Times New Roman"/>
+          <w:b w:val="0"/>
           <w:color w:val="000000" w:themeColor="text1"/>
           <w:sz w:val="24"/>
           <w:szCs w:val="28"/>
         </w:rPr>
-        <w:t>The study’s methodological approach is a generic qualitative inquiry (GQI), selected to investigate how U.S. SME IT and network managers perceive and interpret the governance challenges associated with establishing and managing ITDRPaaS (Caelli et al., 2003; Kahlke, 2014; Percy et al., 2015). This approach aligns with the topic and problem because it prioritizes managers’ sense-making of operational recovery processes over a confirmatory audit of written plans (Percy et al., 2015). GQI interview practice uses a flexible protocol that probes for clarification in participants’ terms. Thematic analysis uses prior literature as orientation rather than a rigid coding mandate (Braun &amp; Clarke, 2019; Fereday &amp; Muir-Cochrane, 2006). Honoring participants’ accounts is both an ethical and a methodological discipline: it protects their descriptions, makes researcher influence visible, and keeps interpretations accountable to the named incident.</w:t>
+        <w:t>The study’s methodological approach is a generic qualitative inquiry (GQI), selected to investigate how U.S. SME IT and network managers perceive and interpret the governance challenges associated with establishing and managing ITDRPaaS (Caelli et al., 2003; Kahlke, 2014; Percy et al., 2015). This approach aligns with the topic and problem because it prioritizes managers’ sense-making of operational recovery processes over a confirmatory audit of written plans (Percy et al., 2015). GQI interview practice uses a flexible protocol that probes for clarification in participants’ terms. Thematic analysis uses prior literature as orientation rather than a rigid coding mandate (Saldaña, 2021; Fereday &amp; Muir-Cochrane, 2006). Honoring participants’ accounts is both an ethical and a methodological discipline: it protects their descriptions, makes researcher influence visible, and keeps interpretations accountable to the named incident.</w:t>
       </w:r>
       <w:r>
         <w:rPr>
@@ -2695,11 +2696,12 @@
       <w:r>
         <w:rPr>
           <w:rFonts w:ascii="Times New Roman" w:hAnsi="Times New Roman" w:eastAsia="Times New Roman"/>
+          <w:b w:val="0"/>
           <w:color w:val="000000" w:themeColor="text1"/>
           <w:sz w:val="24"/>
           <w:szCs w:val="28"/>
         </w:rPr>
-        <w:t>The target population comprises IT and network managers (or equivalent titles such as systems, infrastructure, or IT operations managers) employed by U.S. small and medium enterprises of 10 to 200 employees (Ekinci et al., 2025). Eligible participants have responsibility for, or direct participation in, IT disaster recovery involving an external platform or managed recovery service (ITDRPaaS or functionally equivalent cloud recovery). Population characteristics therefore center on role authority, U.S. SME employment, and recent platform-mediated recovery exposure rather than executive-only or vendor-side perspectives. The study is not limited to a single organizational site; participants will be drawn from multiple U.S. SME contexts in which IT systems are operationally critical. The locked sample is 12 interviews. That number is justified by information power for a narrow aim and a specific population (Malterud et al., 2016) and is the school-required fixed count rather than a range. Guest et al. (2006) is reserved for later stopping discussion only and is not the interview method.</w:t>
+        <w:t>The target population comprises IT and network managers (or equivalent titles such as systems, infrastructure, or IT operations managers) employed by U.S. small and medium enterprises of 10 to 200 employees (U.S. Small Business Administration, 2026). Eligible participants have responsibility for, or direct participation in, IT disaster recovery involving an external platform or managed recovery service (ITDRPaaS or functionally equivalent cloud recovery). Population characteristics therefore center on role authority, U.S. SME employment, and recent platform-mediated recovery exposure rather than executive-only or vendor-side perspectives. The study is not limited to a single organizational site; participants will be drawn from multiple U.S. SME contexts in which IT systems are operationally critical. The locked sample is 12 interviews. That number is justified by information power for a narrow aim and a specific population (Malterud et al., 2016) and is the school-required fixed count rather than a range. Guest et al. (2006) is reserved for later stopping discussion only and is not the interview method.</w:t>
       </w:r>
       <w:commentRangeStart w:id="12"/>
       <w:commentRangeStart w:id="13"/>
@@ -3098,11 +3100,12 @@
       <w:r>
         <w:rPr>
           <w:rFonts w:ascii="Times New Roman" w:hAnsi="Times New Roman" w:eastAsia="Times New Roman"/>
+          <w:b w:val="0"/>
           <w:color w:val="000000" w:themeColor="text1"/>
           <w:sz w:val="24"/>
           <w:szCs w:val="28"/>
         </w:rPr>
-        <w:t>This study does not operationalize independent or dependent variables. Constructs function as interpretive lenses in a generic qualitative inquiry (Caelli et al., 2003; Percy et al., 2015). If a participant names ISO, NIST, or BCM materials, those names are context in the spoken account. They are not coding systems, treatment conditions, or researcher-administered checklists. The study does not use experimental manipulation, a Likert salience inventory, or a hypothesized path model. Semi-structured critical-incident interviews will be used to explore how managers encounter the constructs in one named event, producing descriptive thematic insight rather than population-level causal inference (Flanagan, 1954; Chell, 2004). The framework remains anchored in stakeholder-salience theory: managers prioritize stakeholder claims through power, legitimacy, and urgency (Mitchell et al., 1997).</w:t>
+        <w:t>This study does not operationalize independent or dependent variables. Constructs function as interpretive lenses in a generic qualitative inquiry (Caelli et al., 2003; Percy et al., 2015). If a participant names ISO, NIST, or BCM materials, those names are context in the spoken account. They are not coding systems, treatment conditions, or researcher-administered checklists. The study does not use experimental manipulation, a Likert salience inventory, or a hypothesized path model. Semi-structured critical-incident interviews will be used to explore how managers encounter the constructs in one named event, producing descriptive thematic insight rather than population-level causal inference (Flanagan, 1954; Gremler, 2004). The framework remains anchored in stakeholder-salience theory: managers prioritize stakeholder claims through power, legitimacy, and urgency (Mitchell et al., 1997).</w:t>
       </w:r>
       <w:r>
         <w:rPr>
@@ -5072,7 +5075,7 @@
           <w:color w:val="000000" w:themeColor="text1"/>
           <w:sz w:val="24"/>
         </w:rPr>
-        <w:t>Operational procedures begin with purposive and criterion sampling to identify qualified participants (Percy et al., 2015). The locked sample is 12. Inclusion requires service as an IT or network manager (or equivalent systems, infrastructure, or IT operations role) in a U.S. SME of 10 to 200 personnel (Ekinci et al., 2025); direct operational responsibility for, or participation in, IT disaster-recovery coordination that uses an external platform or managed recovery service; and at least one disruption, failover, recovery test, or operational recovery in the preceding 36 months. Vendor-only employees and managers who cannot name a qualifying event are excluded. After eligibility is verified, the researcher emails the informed consent form; once signed electronic consent is returned, a virtual, recorded English interview is scheduled.</w:t>
+        <w:t>Operational procedures begin with purposive and criterion sampling to identify qualified participants (Percy et al., 2015). The locked sample is 12. Inclusion requires service as an IT or network manager (or equivalent systems, infrastructure, or IT operations role) in a U.S. SME of 10 to 200 personnel (U.S. Small Business Administration, 2026); direct operational responsibility for, or participation in, IT disaster-recovery coordination that uses an external platform or managed recovery service; and at least one disruption, failover, recovery test, or operational recovery in the preceding 36 months. Vendor-only employees and managers who cannot name a qualifying event are excluded. After eligibility is verified, the researcher emails the informed consent form; once signed electronic consent is returned, a virtual, recorded English interview is scheduled.</w:t>
       </w:r>
       <w:r>
         <w:rPr>
@@ -5228,10 +5231,11 @@
         <w:rPr>
           <w:rStyle w:val="ng-star-inserted"/>
           <w:rFonts w:ascii="Times New Roman" w:hAnsi="Times New Roman" w:eastAsia="Times New Roman"/>
-          <w:color w:val="000000" w:themeColor="text1"/>
-          <w:sz w:val="24"/>
-        </w:rPr>
-        <w:t>The second phase is the semi-structured interview. The session opens with a standardized ethics script, then uses the critical-incident technique (Flanagan, 1954; Chell, 2004; Butterfield et al., 2005). The participant is asked to walk through one specific recovery or testing incident. The researcher guides the dialogue with open-ended questions and flexible probes anchored in stakeholder-salience theory (Mitchell et al., 1997). Probes address whose request or pressure moved restore order, whose claim was treated as rightful, what made one service time-critical, who was supposed to decide versus who did, what if anything was escalated, and what counted as enough proof that the service was recovered. Guest et al. (2006) is not the interview method.</w:t>
+          <w:b w:val="0"/>
+          <w:color w:val="000000" w:themeColor="text1"/>
+          <w:sz w:val="24"/>
+        </w:rPr>
+        <w:t>The second phase is the semi-structured interview. The session opens with a standardized ethics script, then uses the critical-incident technique (Flanagan, 1954; Gremler, 2004). The participant is asked to walk through one specific recovery or testing incident. The researcher guides the dialogue with open-ended questions and flexible probes anchored in stakeholder-salience theory (Mitchell et al., 1997). Probes address whose request or pressure moved restore order, whose claim was treated as rightful, what made one service time-critical, who was supposed to decide versus who did, what if anything was escalated, and what counted as enough proof that the service was recovered. Guest et al. (2006) is not the interview method.</w:t>
       </w:r>
       <w:r>
         <w:rPr>
@@ -5669,7 +5673,7 @@
           <w:sz w:val="24"/>
           <w:szCs w:val="24"/>
         </w:rPr>
-        <w:t>This project uses the qualitative trustworthiness criteria of credibility, dependability, confirmability, and transferability (Lincoln &amp; Guba, 1985). Credibility will be supported by critical-incident interviews, a seven-day factual member check, SME-panel review of the interview guide, and two to three mock or pilot interviews before the n = 12 corpus is collected (Korstjens &amp; Moser, 2018). Dependability will be supported by a dated audit trail of protocol versions, codebook changes, and analytic memos (Carcary, 2020). Confirmability will be supported by reflexive memos that separate participant accounts from researcher interpretation. Transferability will be supported by rich, de-identified descriptions of incident context without naming employers, vendors, or products. Expert review and pilot testing belong to instrument development; they are not a second data-collection stream and they are not used as findings.</w:t>
+        <w:t>This project uses the qualitative trustworthiness criteria of credibility, dependability, confirmability, and transferability (Lincoln &amp; Guba, 1985). Credibility will be supported by critical-incident interviews, a seven-day factual member check, SME-panel review of the interview guide, and two to three mock or pilot interviews before the n = 12 corpus is collected (Morse, 2015). Dependability will be supported by a dated audit trail of protocol versions, codebook changes, and analytic memos (Paulus, 2023). Confirmability will be supported by reflexive memos that separate participant accounts from researcher interpretation. Transferability will be supported by rich, de-identified descriptions of incident context without naming employers, vendors, or products. Expert review and pilot testing belong to instrument development; they are not a second data-collection stream and they are not used as findings.</w:t>
       </w:r>
       <w:r>
         <w:rPr>
@@ -6106,10 +6110,12 @@
       </w:pPr>
       <w:r>
         <w:rPr>
+          <w:rFonts w:ascii="Times New Roman" w:hAnsi="Times New Roman" w:eastAsia="Times New Roman"/>
+          <w:b w:val="0"/>
           <w:sz w:val="24"/>
           <w:szCs w:val="24"/>
         </w:rPr>
-        <w:t>Recruitment and preliminary analysis will proceed through the locked sample of 12. Stopping will be documented as an analytic decision: the researcher will record whether interviews in that corpus continue to contribute new meaning units, categories, or thematic variation relevant to the research questions (</w:t>
+        <w:t xml:space="preserve">Recruitment and preliminary analysis will proceed through the locked sample of 12. Stopping will be documented as an analytic decision: the researcher will record whether interviews in that corpus continue to contribute new meaning units, categories, or thematic variation relevant to the research questions (Guest et al., 2020). Guest et al. (2006) only as background that some homogeneous interview studies have observed early code stability; that source will not be used to claim in advance that 12 interviews serve. The final participant count and the rationale for ending recruitment will be recorded in the study audit trail (Paulus, 2023).     </w:t>
       </w:r>
       <w:r>
         <w:rPr>
@@ -6117,28 +6123,21 @@
           <w:szCs w:val="24"/>
           <w:highlight w:val="cyan"/>
         </w:rPr>
-        <w:t>Naeem et al., 2024</w:t>
       </w:r>
       <w:r>
         <w:rPr>
           <w:sz w:val="24"/>
           <w:szCs w:val="24"/>
         </w:rPr>
-        <w:t xml:space="preserve">). Guest et al. (2006) only as background that some homogeneous interview studies have observed early code stability; that source will not be used to claim in advance that 12 interviews </w:t>
-      </w:r>
-      <w:r>
-        <w:t>serve</w:t>
-      </w:r>
+      </w:r>
+      <w:r/>
       <w:r>
         <w:rPr>
           <w:sz w:val="24"/>
           <w:szCs w:val="24"/>
         </w:rPr>
-        <w:t>. The final participant count and the rationale for ending recruitment will be recorded in the study audit trail (Carcary, 2020).</w:t>
-      </w:r>
-      <w:r>
-        <w:t xml:space="preserve">     </w:t>
-      </w:r>
+      </w:r>
+      <w:r/>
     </w:p>
     <w:p>
       <w:pPr>
@@ -6317,18 +6316,20 @@
         <w:ind w:firstLine="720"/>
       </w:pPr>
       <w:r>
-        <w:t>Membership in the population further requires recent, firsthand, platform-mediated recovery experience. A qualifying member must be able to name at least one disruption, failover, recovery test, or operational recovery in the preceding 36 months in which the external capability was used. That named event is the unit of talk for the critical-incident interview (</w:t>
+        <w:rPr>
+          <w:rFonts w:ascii="Times New Roman" w:hAnsi="Times New Roman" w:eastAsia="Times New Roman"/>
+          <w:b w:val="0"/>
+          <w:sz w:val="24"/>
+        </w:rPr>
+        <w:t>Membership in the population further requires recent, firsthand, platform-mediated recovery experience. A qualifying member must be able to name at least one disruption, failover, recovery test, or operational recovery in the preceding 36 months in which the external capability was used. That named event is the unit of talk for the critical-incident interview (Flanagan, 1954; Gremler, 2004). A manager who cannot name such an event is not in the population and will not enter the sample. This recency and platform bound distinguishes the population from the broader set of IT managers who only know a written plan or a vendor demonstration.</w:t>
       </w:r>
       <w:r>
         <w:rPr>
           <w:b w:val="0"/>
           <w:bCs/>
         </w:rPr>
-        <w:t>Flanagan, 1954; Chell, 2004</w:t>
-      </w:r>
-      <w:r>
-        <w:t>). A manager who cannot name such an event is not in the population and will not enter the sample. This recency and platform bound distinguishes the population from the broader set of IT managers who only know a written plan or a vendor demonstration.</w:t>
-      </w:r>
+      </w:r>
+      <w:r/>
     </w:p>
     <w:p>
       <w:pPr>
@@ -6468,9 +6469,10 @@
       <w:r>
         <w:rPr>
           <w:rFonts w:ascii="Times New Roman" w:hAnsi="Times New Roman" w:eastAsia="Times New Roman"/>
-          <w:sz w:val="24"/>
-        </w:rPr>
-        <w:t>Critical-incident prompts will ask participants to describe one specific disruption, failover, recovery test, or restoration event. Follow-up probes will examine what occurred, who made or influenced decisions, how competing demands were prioritized, when escalation occurred, and what was treated as proof of recovery (Flanagan, 1954; Chell, 2004). No artifacts will be requested or collected. If a manager names a matrix, ticket, or test record, that naming is part of the interview account.</w:t>
+          <w:b w:val="0"/>
+          <w:sz w:val="24"/>
+        </w:rPr>
+        <w:t>Critical-incident prompts will ask participants to describe one specific disruption, failover, recovery test, or restoration event. Follow-up probes will examine what occurred, who made or influenced decisions, how competing demands were prioritized, when escalation occurred, and what was treated as proof of recovery (Flanagan, 1954; Gremler, 2004). No artifacts will be requested or collected. If a manager names a matrix, ticket, or test record, that naming is part of the interview account.</w:t>
       </w:r>
     </w:p>
     <w:p>
@@ -6481,9 +6483,10 @@
       <w:r>
         <w:rPr>
           <w:rFonts w:ascii="Times New Roman" w:hAnsi="Times New Roman" w:eastAsia="Times New Roman"/>
-          <w:sz w:val="24"/>
-        </w:rPr>
-        <w:t>After each interview, the recording will be transcribed, checked against the audio, de-identified, and assigned a participant code. The researcher will prepare field notes and reflexive memos. Participants may be contacted to clarify materially ambiguous statements without being asked to approve the researcher’s final interpretation. Verified transcripts and audit-trail documentation will be imported into Delve for organization and retrieval during hybrid deductive–inductive codebook thematic analysis. Delve will support data management and coding; the analytic method remains thematic analysis (Fereday &amp; Muir-Cochrane, 2006; Carcary, 2020).</w:t>
+          <w:b w:val="0"/>
+          <w:sz w:val="24"/>
+        </w:rPr>
+        <w:t>After each interview, the recording will be transcribed, checked against the audio, de-identified, and assigned a participant code. The researcher will prepare field notes and reflexive memos. Participants may be contacted to clarify materially ambiguous statements without being asked to approve the researcher’s final interpretation. Verified transcripts and audit-trail documentation will be imported into Delve for organization and retrieval during hybrid deductive–inductive codebook thematic analysis. Delve will support data management and coding; the analytic method remains thematic analysis (Fereday &amp; Muir-Cochrane, 2006; Paulus, 2023).</w:t>
       </w:r>
       <w:r/>
       <w:r/>
@@ -6565,7 +6568,7 @@
           <w:sz w:val="24"/>
           <w:highlight w:val="yellow"/>
         </w:rPr>
-        <w:t>Ethics is a guiding principle in qualitative research. It shapes study design, the process of discovery, and the significance of the findings, and it requires the researcher to weigh the human cost of inquiry (Miteu, 2024). This generic qualitative inquiry will utilize U.S. small and medium-sized enterprise (SME) IT, network, systems, infrastructure, or operations managers in firms of 10 to 200 personnel. In that setting, ethical risk is concentrated: a named recovery event, a role title, and a platform type can re-identify a person or firm more easily than in a large enterprise. The study will therefore treat data management, respect for persons, honesty and integrity, and responsible dissemination as operational requirements, not as a checklist (Miteu, 2024). The researcher will not begin identification, screening, or scheduling until the Capella University Institutional Review Board has granted written approval. The design follows the Belmont Report’s principles of respect for persons, beneficence, and justice (National Commission for the Protection of Human Subjects of Biomedical and Behavioral Research, 1979). Respect for persons will be enacted through voluntary participation, signed electronic consent, a recorded permission-to-record check, and the right to skip any question or stop at any time without penalty. Beneficence will be enacted by treating SME organizational disclosure as both a compliance issue and a Gap-data threat: the researcher will not recruit through a supervisor, owner, employer command chain, or vendor account manager; collection remains interviews only; identifiers will be stripped to P##, role only, SME-X, and Platform-X; and member checking will be a seven-day factual review of sequence, roles, and named proof so contested recovery decisions are not edited out. Justice will be enacted by placing the research burden on operational U.S. SME managers who can name a qualifying event, and by excluding vendor-only staff and command-visible recruitment paths.</w:t>
+        <w:t>Ethics is a guiding principle in qualitative research. It shapes study design, the process of discovery, and the significance of the findings, and it requires the researcher to weigh the human cost of inquiry (Resnik, 2018). This generic qualitative inquiry will utilize U.S. small and medium-sized enterprise (SME) IT, network, systems, infrastructure, or operations managers in firms of 10 to 200 personnel. In that setting, ethical risk is concentrated: a named recovery event, a role title, and a platform type can re-identify a person or firm more easily than in a large enterprise. The study will therefore treat data management, respect for persons, honesty and integrity, and responsible dissemination as operational requirements, not as a checklist (Resnik, 2018). The researcher will not begin identification, screening, or scheduling until the Capella University Institutional Review Board has granted written approval. The design follows the Belmont Report’s principles of respect for persons, beneficence, and justice (National Commission for the Protection of Human Subjects of Biomedical and Behavioral Research, 1979). Respect for persons will be enacted through voluntary participation, signed electronic consent, a recorded permission-to-record check, and the right to skip any question or stop at any time without penalty. Beneficence will be enacted by treating SME organizational disclosure as both a compliance issue and a Gap-data threat: the researcher will not recruit through a supervisor, owner, employer command chain, or vendor account manager; collection remains interviews only; identifiers will be stripped to P##, role only, SME-X, and Platform-X; and member checking will be a seven-day factual review of sequence, roles, and named proof so contested recovery decisions are not edited out. Justice will be enacted by placing the research burden on operational U.S. SME managers who can name a qualifying event, and by excluding vendor-only staff and command-visible recruitment paths.</w:t>
       </w:r>
       <w:r>
         <w:rPr>
@@ -6606,7 +6609,7 @@
           <w:sz w:val="24"/>
           <w:highlight w:val="yellow"/>
         </w:rPr>
-        <w:t>Honesty and integrity will govern collection, storage, analysis, reporting, and any later Q&amp;A about the study (Miteu, 2024). Recordings and RAW notes will be stored in an encrypted, password-protected directory separate from CLEAN transcripts and the Delve audit nest. The researcher will not continue a session from memory if recording fails, will not invent artifact contents a manager did not state, and will not claim that Delvetool performed the analysis. Findings and will be disseminated as de-identified patterned accounts of named U.S. SME recovery events, without employer, owner, vendor, or product names, so the study can report how managers enacted whose claim counted, who decided, and what counted as enough proof without exposing the participant or the firm.</w:t>
+        <w:t>Honesty and integrity will govern collection, storage, analysis, reporting, and any later Q&amp;A about the study (Resnik, 2018). Recordings and RAW notes will be stored in an encrypted, password-protected directory separate from CLEAN transcripts and the Delve audit nest. The researcher will not continue a session from memory if recording fails, will not invent artifact contents a manager did not state, and will not claim that Delvetool performed the analysis. Findings and will be disseminated as de-identified patterned accounts of named U.S. SME recovery events, without employer, owner, vendor, or product names, so the study can report how managers enacted whose claim counted, who decided, and what counted as enough proof without exposing the participant or the firm.</w:t>
       </w:r>
       <w:r>
         <w:rPr>
@@ -6759,7 +6762,7 @@
           <w:b w:val="0"/>
           <w:sz w:val="24"/>
         </w:rPr>
-        <w:t>Second, the researcher will import the nested start-list of STRUCTURAL, FRAMEWORK_DEDUCTIVE, and BOUNDARY codes and create one excerpt record for each bounded passage that requires analysis, attaching its source locator, speaker, incident context, and provisional code (Fereday &amp; Muir-Cochrane, 2006; Carcary, 2020). A passage may receive more than one code when it conveys distinct ideas. Power, legitimacy, and urgency will function as sensitizing probes, not predetermined theme titles (Mitchell et al., 1997). Decision rights, escalation, evidentiary standards, and recoverability assurance will be coded as enactment evidence, not as a fourth salience attribute. Each code definition will state its meaning, inclusion criteria, exclusion criteria, and a source-linked example; uncertain assignments will be flagged for review. EMERGENT child codes will remain empty until meaning units are locked (Braun &amp; Clarke, 2019; Taylor &amp; Bogdan, 1998). Coding changes will be recorded with the date, reason, and affected records. Spreadsheet lookup and Delve retrieval may support these records; interpretive approval will remain with the researcher (Fereday &amp; Muir-Cochrane, 2006).</w:t>
+        <w:t>Second, the researcher will import the nested start-list of STRUCTURAL, FRAMEWORK_DEDUCTIVE, and BOUNDARY codes and create one excerpt record for each bounded passage that requires analysis, attaching its source locator, speaker, incident context, and provisional code (Fereday &amp; Muir-Cochrane, 2006; Paulus, 2023). A passage may receive more than one code when it conveys distinct ideas. Power, legitimacy, and urgency will function as sensitizing probes, not predetermined theme titles (Mitchell et al., 1997). Decision rights, escalation, evidentiary standards, and recoverability assurance will be coded as enactment evidence, not as a fourth salience attribute. Each code definition will state its meaning, inclusion criteria, exclusion criteria, and a source-linked example; uncertain assignments will be flagged for review. EMERGENT child codes will remain empty until meaning units are locked (Saldaña, 2021; Taylor &amp; Bogdan, 1998). Coding changes will be recorded with the date, reason, and affected records. Spreadsheet lookup and Delve retrieval may support these records; interpretive approval will remain with the researcher (Fereday &amp; Muir-Cochrane, 2006).</w:t>
       </w:r>
       <w:r>
         <w:rPr>
@@ -6799,7 +6802,7 @@
           <w:b w:val="0"/>
           <w:sz w:val="24"/>
         </w:rPr>
-        <w:t>Third, the researcher will lock meaning units that state a practice claim before any theme name is written, confirm each unit with a named excerpt and a negative or boundary case, and group related units only when they describe the same salience-to-assurance bargain rather than the same recovery topic (Braun &amp; Clarke, 2019; Taylor &amp; Bogdan, 1998; Walker, 2026). For every proposed theme, the researcher will record its central claim, contributing categories, representative excerpts, exceptions, and research-question relevance, then return to the original passages to inspect context. Candidate categories may be retained, revised, split, combined, or rejected, with earlier versions preserved. This is iterative interpretive work, not an automatic promotion of frequently used labels into themes, and it is not reflexive thematic analysis as the analytic method (Braun &amp; Clarke, 2019; Fereday &amp; Muir-Cochrane, 2006). The locked n = 12 will be reported as the planned participant count, not as proof of saturation; adequacy will be assessed through richness, relevant variation, question coverage, and whether later interviews still change the meaning-unit inventory (Malterud et al., 2016; Naeem et al., 2024).</w:t>
+        <w:t>Third, the researcher will lock meaning units that state a practice claim before any theme name is written, confirm each unit with a named excerpt and a negative or boundary case, and group related units only when they describe the same salience-to-assurance bargain rather than the same recovery topic (Saldaña, 2021; Taylor &amp; Bogdan, 1998; Walker, 2026). For every proposed theme, the researcher will record its central claim, contributing categories, representative excerpts, exceptions, and research-question relevance, then return to the original passages to inspect context. Candidate categories may be retained, revised, split, combined, or rejected, with earlier versions preserved. This is iterative interpretive work, not an automatic promotion of frequently used labels into themes, and it is not reflexive thematic analysis as the analytic method (Saldaña, 2021; Fereday &amp; Muir-Cochrane, 2006). The locked n = 12 will be reported as the planned participant count, not as proof of saturation; adequacy will be assessed through richness, relevant variation, question coverage, and whether later interviews still change the meaning-unit inventory (Malterud et al., 2016; Guest et al., 2020).</w:t>
       </w:r>
       <w:r>
         <w:rPr>
@@ -6851,7 +6854,7 @@
           <w:b w:val="0"/>
           <w:sz w:val="24"/>
         </w:rPr>
-        <w:t>Fourth, the researcher will write two separate syntheses from the reviewed theme records: one for stakeholder-claim management and salience shifts, and one for decision rights, escalation, and recoverability assurance (</w:t>
+        <w:t>Fourth, the researcher will write two separate syntheses from the reviewed theme records: one for stakeholder-claim management and salience shifts, and one for decision rights, escalation, and recoverability assurance (Lester et al., 2020; Percy et al., 2015). Presentation will include a meaning-unit evidence table, a theme-to-question map, and a narrative that pairs each interpretive claim with source-verified excerpts and relevant boundary cases, including Every published quotation, participant label, source locator, and thematic claim will receive a source check; table titles and theme names will be compared with the narrative. Participant counts, excerpt counts, and source counts will remain separate. The researcher will close the revision log, record unresolved gaps, and release a dated version of the report, codebook, and CSV nest (Paulus, 2023). Clerical software and retrieval aids will not replace researcher interpretation; every quotation and thematic claim will remain grounded in the CLEAN transcript and the dated audit trail (Tracy, 2010). Findings will distinguish managers’ reported interpretations from independently documented actions and will not claim statistical generalization.</w:t>
       </w:r>
       <w:r/>
       <w:r>
@@ -6860,15 +6863,13 @@
           <w:b/>
           <w:sz w:val="24"/>
         </w:rPr>
-        <w:t>Lester et al., 2020</w:t>
-      </w:r>
-      <w:r>
-        <w:rPr>
-          <w:rFonts w:ascii="Times New Roman" w:hAnsi="Times New Roman" w:eastAsia="Times New Roman"/>
-          <w:b w:val="0"/>
-          <w:sz w:val="24"/>
-        </w:rPr>
-        <w:t>; Percy et al., 2015). Presentation will include a meaning-unit evidence table, a theme-to-question map, and a narrative that pairs each interpretive claim with source-verified excerpts and relevant boundary cases, including Every published quotation, participant label, source locator, and thematic claim will receive a source check; table titles and theme names will be compared with the narrative. Participant counts, excerpt counts, and source counts will remain separate. The researcher will close the revision log, record unresolved gaps, and release a dated version of the report, codebook, and CSV nest (Carcary, 2020). Clerical software and retrieval aids will not replace researcher interpretation; every quotation and thematic claim will remain grounded in the CLEAN transcript and the dated audit trail (Nowell et al., 2017). Findings will distinguish managers’ reported interpretations from independently documented actions and will not claim statistical generalization.</w:t>
+      </w:r>
+      <w:r>
+        <w:rPr>
+          <w:rFonts w:ascii="Times New Roman" w:hAnsi="Times New Roman" w:eastAsia="Times New Roman"/>
+          <w:b w:val="0"/>
+          <w:sz w:val="24"/>
+        </w:rPr>
       </w:r>
     </w:p>
     <w:p>
@@ -6989,6 +6990,22 @@
           <w:sz w:val="24"/>
         </w:rPr>
         <w:t xml:space="preserve">Agle, B. R., Mitchell, R. K., &amp; Sonnenfeld, J. A. (1999). Who matters to CEOs? An investigation of stakeholder attributes and salience, corporate performance, and CEO values. </w:t>
+      </w:r>
+      <w:r>
+        <w:rPr>
+          <w:rFonts w:ascii="Times New Roman" w:hAnsi="Times New Roman" w:eastAsia="Times New Roman"/>
+          <w:b w:val="0"/>
+          <w:i w:val="0"/>
+          <w:sz w:val="24"/>
+        </w:rPr>
+      </w:r>
+      <w:r>
+        <w:rPr>
+          <w:rFonts w:ascii="Times New Roman" w:hAnsi="Times New Roman" w:eastAsia="Times New Roman"/>
+          <w:b w:val="0"/>
+          <w:i w:val="0"/>
+          <w:sz w:val="24"/>
+        </w:rPr>
       </w:r>
       <w:r>
         <w:rPr>
@@ -7042,6 +7059,22 @@
         <w:rPr>
           <w:rFonts w:ascii="Times New Roman" w:hAnsi="Times New Roman" w:eastAsia="Times New Roman"/>
           <w:b w:val="0"/>
+          <w:i w:val="0"/>
+          <w:sz w:val="24"/>
+        </w:rPr>
+      </w:r>
+      <w:r>
+        <w:rPr>
+          <w:rFonts w:ascii="Times New Roman" w:hAnsi="Times New Roman" w:eastAsia="Times New Roman"/>
+          <w:b w:val="0"/>
+          <w:i w:val="0"/>
+          <w:sz w:val="24"/>
+        </w:rPr>
+      </w:r>
+      <w:r>
+        <w:rPr>
+          <w:rFonts w:ascii="Times New Roman" w:hAnsi="Times New Roman" w:eastAsia="Times New Roman"/>
+          <w:b w:val="0"/>
           <w:i/>
           <w:sz w:val="24"/>
         </w:rPr>
@@ -7087,6 +7120,22 @@
         <w:rPr>
           <w:rFonts w:ascii="Times New Roman" w:hAnsi="Times New Roman" w:eastAsia="Times New Roman"/>
           <w:b w:val="0"/>
+          <w:i w:val="0"/>
+          <w:sz w:val="24"/>
+        </w:rPr>
+      </w:r>
+      <w:r>
+        <w:rPr>
+          <w:rFonts w:ascii="Times New Roman" w:hAnsi="Times New Roman" w:eastAsia="Times New Roman"/>
+          <w:b w:val="0"/>
+          <w:i w:val="0"/>
+          <w:sz w:val="24"/>
+        </w:rPr>
+      </w:r>
+      <w:r>
+        <w:rPr>
+          <w:rFonts w:ascii="Times New Roman" w:hAnsi="Times New Roman" w:eastAsia="Times New Roman"/>
+          <w:b w:val="0"/>
           <w:i/>
           <w:sz w:val="24"/>
         </w:rPr>
@@ -7121,74 +7170,79 @@
       <w:r>
         <w:rPr>
           <w:rFonts w:ascii="Times New Roman" w:hAnsi="Times New Roman" w:eastAsia="Times New Roman"/>
-          <w:b w:val="0"/>
+          <w:b/>
           <w:i w:val="0"/>
           <w:sz w:val="24"/>
           <w:highlight w:val="yellow"/>
         </w:rPr>
-        <w:t xml:space="preserve">Braun, V., &amp; Clarke, V. (2019). Reflecting on reflexive thematic analysis. </w:t>
-      </w:r>
-      <w:r>
-        <w:rPr>
-          <w:b w:val="0"/>
-          <w:i w:val="0"/>
-        </w:rPr>
-      </w:r>
-      <w:r>
-        <w:rPr>
-          <w:b w:val="0"/>
-          <w:i w:val="0"/>
-          <w:iCs/>
-        </w:rPr>
-      </w:r>
-      <w:r>
-        <w:rPr>
-          <w:b w:val="0"/>
-          <w:i w:val="0"/>
-        </w:rPr>
-      </w:r>
-      <w:r>
-        <w:rPr>
-          <w:b w:val="0"/>
-          <w:i w:val="0"/>
-          <w:iCs/>
-        </w:rPr>
-      </w:r>
-      <w:r>
-        <w:rPr>
-          <w:b w:val="0"/>
-          <w:i w:val="0"/>
-        </w:rPr>
-      </w:r>
-      <w:r>
-        <w:rPr>
-          <w:rFonts w:ascii="Times New Roman" w:hAnsi="Times New Roman" w:eastAsia="Times New Roman"/>
-          <w:b w:val="0"/>
-          <w:i/>
-          <w:sz w:val="24"/>
-        </w:rPr>
-        <w:t>Qualitative Research in Sport, Exercise and Health, 11</w:t>
-      </w:r>
-      <w:r>
-        <w:rPr>
-          <w:rFonts w:ascii="Times New Roman" w:hAnsi="Times New Roman" w:eastAsia="Times New Roman"/>
-          <w:b w:val="0"/>
-          <w:i w:val="0"/>
-          <w:sz w:val="24"/>
-        </w:rPr>
-        <w:t xml:space="preserve">(4), 589–597. </w:t>
-      </w:r>
-      <w:hyperlink r:id="rId17">
-        <w:r>
-          <w:rPr>
-            <w:color w:val="0563C1"/>
-            <w:u w:val="single"/>
-            <w:rFonts w:ascii="Times New Roman" w:hAnsi="Times New Roman"/>
-            <w:sz w:val="24"/>
-          </w:rPr>
-          <w:t xml:space="preserve">https://doi.org/10.1080/2159676X.2019.1628806</w:t>
-        </w:r>
-      </w:hyperlink>
+        <w:t xml:space="preserve">Brinkmann, S., &amp; Kvale, S. (2017). Ethics in qualitative psychological research. In C. Willig &amp; W. Stainton Rogers (Eds.), </w:t>
+      </w:r>
+      <w:r>
+        <w:rPr>
+          <w:b w:val="0"/>
+          <w:i w:val="0"/>
+        </w:rPr>
+      </w:r>
+      <w:r>
+        <w:rPr>
+          <w:b w:val="0"/>
+          <w:i w:val="0"/>
+          <w:iCs/>
+        </w:rPr>
+      </w:r>
+      <w:r>
+        <w:rPr>
+          <w:b w:val="0"/>
+          <w:i w:val="0"/>
+        </w:rPr>
+      </w:r>
+      <w:r>
+        <w:rPr>
+          <w:b w:val="0"/>
+          <w:i w:val="0"/>
+          <w:iCs/>
+        </w:rPr>
+      </w:r>
+      <w:r>
+        <w:rPr>
+          <w:b w:val="0"/>
+          <w:i w:val="0"/>
+        </w:rPr>
+      </w:r>
+      <w:r>
+        <w:rPr>
+          <w:rFonts w:ascii="Times New Roman" w:hAnsi="Times New Roman" w:eastAsia="Times New Roman"/>
+          <w:b w:val="0"/>
+          <w:i w:val="0"/>
+          <w:sz w:val="24"/>
+        </w:rPr>
+      </w:r>
+      <w:r>
+        <w:rPr>
+          <w:rFonts w:ascii="Times New Roman" w:hAnsi="Times New Roman" w:eastAsia="Times New Roman"/>
+          <w:b w:val="0"/>
+          <w:i w:val="0"/>
+          <w:sz w:val="24"/>
+        </w:rPr>
+      </w:r>
+      <w:r>
+        <w:rPr>
+          <w:rFonts w:ascii="Times New Roman" w:hAnsi="Times New Roman" w:eastAsia="Times New Roman"/>
+          <w:b/>
+          <w:i/>
+          <w:sz w:val="24"/>
+        </w:rPr>
+        <w:t>The SAGE handbook of qualitative research in psychology</w:t>
+      </w:r>
+      <w:r>
+        <w:rPr>
+          <w:rFonts w:ascii="Times New Roman" w:hAnsi="Times New Roman" w:eastAsia="Times New Roman"/>
+          <w:b/>
+          <w:i w:val="0"/>
+          <w:sz w:val="24"/>
+        </w:rPr>
+        <w:t xml:space="preserve"> (2nd ed., pp. 259–273). SAGE. </w:t>
+      </w:r>
     </w:p>
     <w:p>
       <w:pPr>
@@ -7201,7 +7255,23 @@
           <w:i w:val="0"/>
           <w:sz w:val="24"/>
         </w:rPr>
-        <w:t xml:space="preserve">Brinkmann, S., &amp; Kvale, S. (2017). Ethics in qualitative psychological research. In C. Willig &amp; W. Stainton Rogers (Eds.), </w:t>
+        <w:t xml:space="preserve">Butterfield, L. D., Borgen, W. A., Amundson, N. E., &amp; Maglio, A.-S. T. (2005). Fifty years of the critical incident technique: 1954–2004 and beyond. </w:t>
+      </w:r>
+      <w:r>
+        <w:rPr>
+          <w:rFonts w:ascii="Times New Roman" w:hAnsi="Times New Roman" w:eastAsia="Times New Roman"/>
+          <w:b w:val="0"/>
+          <w:i w:val="0"/>
+          <w:sz w:val="24"/>
+        </w:rPr>
+      </w:r>
+      <w:r>
+        <w:rPr>
+          <w:rFonts w:ascii="Times New Roman" w:hAnsi="Times New Roman" w:eastAsia="Times New Roman"/>
+          <w:b w:val="0"/>
+          <w:i w:val="0"/>
+          <w:sz w:val="24"/>
+        </w:rPr>
       </w:r>
       <w:r>
         <w:rPr>
@@ -7210,57 +7280,12 @@
           <w:i/>
           <w:sz w:val="24"/>
         </w:rPr>
-        <w:t>The SAGE handbook of qualitative research in psychology</w:t>
+        <w:t>Qualitative Research, 5</w:t>
       </w:r>
       <w:r>
         <w:rPr>
           <w:rFonts w:ascii="Times New Roman" w:hAnsi="Times New Roman" w:eastAsia="Times New Roman"/>
           <w:b/>
-          <w:i w:val="0"/>
-          <w:sz w:val="24"/>
-        </w:rPr>
-        <w:t xml:space="preserve"> (2nd ed., pp. 259–273). SAGE. </w:t>
-      </w:r>
-    </w:p>
-    <w:p>
-      <w:pPr>
-        <w:spacing w:line="480" w:lineRule="auto"/>
-        <w:ind w:left="630" w:hanging="630"/>
-        <w:rPr>
-          <w:highlight w:val="cyan"/>
-        </w:rPr>
-      </w:pPr>
-      <w:r>
-        <w:rPr>
-          <w:rFonts w:ascii="Times New Roman" w:hAnsi="Times New Roman" w:eastAsia="Times New Roman"/>
-          <w:b w:val="0"/>
-          <w:i w:val="0"/>
-          <w:color w:val="000000" w:themeColor="text1"/>
-          <w:sz w:val="24"/>
-        </w:rPr>
-        <w:t xml:space="preserve">Butterfield, L. D., Borgen, W. A., Amundson, N. E., &amp; Maglio, A.-S. T. (2005). Fifty years of the critical incident technique: 1954–2004 and beyond. </w:t>
-      </w:r>
-      <w:r>
-        <w:rPr>
-          <w:b w:val="0"/>
-          <w:i w:val="0"/>
-          <w:color w:val="000000" w:themeColor="text1"/>
-          <w:highlight w:val="cyan"/>
-        </w:rPr>
-      </w:r>
-      <w:r>
-        <w:rPr>
-          <w:rFonts w:ascii="Times New Roman" w:hAnsi="Times New Roman" w:eastAsia="Times New Roman"/>
-          <w:b w:val="0"/>
-          <w:i/>
-          <w:sz w:val="24"/>
-        </w:rPr>
-        <w:t>Qualitative Research, 5</w:t>
-      </w:r>
-      <w:r>
-        <w:rPr>
-          <w:rFonts w:ascii="Times New Roman" w:hAnsi="Times New Roman" w:eastAsia="Times New Roman"/>
-          <w:b w:val="0"/>
           <w:i w:val="0"/>
           <w:sz w:val="24"/>
         </w:rPr>
@@ -7273,6 +7298,7 @@
             <w:u w:val="single"/>
             <w:rFonts w:ascii="Times New Roman" w:hAnsi="Times New Roman"/>
             <w:sz w:val="24"/>
+            <w:b/>
           </w:rPr>
           <w:t xml:space="preserve">https://doi.org/10.1177/1468794105056924</w:t>
         </w:r>
@@ -7282,16 +7308,18 @@
       <w:pPr>
         <w:spacing w:line="480" w:lineRule="auto"/>
         <w:ind w:left="630" w:hanging="630"/>
-      </w:pPr>
-      <w:r>
-        <w:rPr>
-          <w:rFonts w:ascii="Times New Roman" w:hAnsi="Times New Roman" w:eastAsia="Times New Roman"/>
-          <w:b w:val="0"/>
-          <w:i w:val="0"/>
-          <w:color w:val="000000" w:themeColor="text1"/>
-          <w:sz w:val="24"/>
+        <w:rPr>
           <w:highlight w:val="cyan"/>
         </w:rPr>
+      </w:pPr>
+      <w:r>
+        <w:rPr>
+          <w:rFonts w:ascii="Times New Roman" w:hAnsi="Times New Roman" w:eastAsia="Times New Roman"/>
+          <w:b w:val="0"/>
+          <w:i w:val="0"/>
+          <w:color w:val="000000" w:themeColor="text1"/>
+          <w:sz w:val="24"/>
+        </w:rPr>
         <w:t xml:space="preserve">Caelli, K., Ray, L., &amp; Mill, J. (2003). “Clear as mud”: Toward greater clarity in generic qualitative research. </w:t>
       </w:r>
       <w:r>
@@ -7299,12 +7327,23 @@
           <w:b w:val="0"/>
           <w:i w:val="0"/>
           <w:color w:val="000000" w:themeColor="text1"/>
-        </w:rPr>
-      </w:r>
-      <w:r>
-        <w:rPr>
-          <w:b w:val="0"/>
-          <w:i w:val="0"/>
+          <w:highlight w:val="cyan"/>
+        </w:rPr>
+      </w:r>
+      <w:r>
+        <w:rPr>
+          <w:rFonts w:ascii="Times New Roman" w:hAnsi="Times New Roman" w:eastAsia="Times New Roman"/>
+          <w:b w:val="0"/>
+          <w:i w:val="0"/>
+          <w:sz w:val="24"/>
+        </w:rPr>
+      </w:r>
+      <w:r>
+        <w:rPr>
+          <w:rFonts w:ascii="Times New Roman" w:hAnsi="Times New Roman" w:eastAsia="Times New Roman"/>
+          <w:b w:val="0"/>
+          <w:i w:val="0"/>
+          <w:sz w:val="24"/>
         </w:rPr>
       </w:r>
       <w:r>
@@ -7340,18 +7379,50 @@
     <w:p>
       <w:pPr>
         <w:spacing w:line="480" w:lineRule="auto"/>
-      </w:pPr>
-      <w:r>
-        <w:rPr>
-          <w:rFonts w:ascii="Times New Roman" w:hAnsi="Times New Roman" w:eastAsia="Times New Roman"/>
-          <w:b w:val="0"/>
-          <w:i w:val="0"/>
-          <w:sz w:val="24"/>
+        <w:ind w:left="630" w:hanging="630"/>
+      </w:pPr>
+      <w:r>
+        <w:rPr>
+          <w:rFonts w:ascii="Times New Roman" w:hAnsi="Times New Roman" w:eastAsia="Times New Roman"/>
+          <w:b w:val="0"/>
+          <w:i w:val="0"/>
+          <w:color w:val="000000" w:themeColor="text1"/>
+          <w:sz w:val="24"/>
+          <w:highlight w:val="cyan"/>
         </w:rPr>
         <w:t xml:space="preserve">Capella University. (2024). </w:t>
       </w:r>
       <w:r>
         <w:rPr>
+          <w:b w:val="0"/>
+          <w:i w:val="0"/>
+          <w:color w:val="000000" w:themeColor="text1"/>
+        </w:rPr>
+      </w:r>
+      <w:r>
+        <w:rPr>
+          <w:b w:val="0"/>
+          <w:i w:val="0"/>
+        </w:rPr>
+      </w:r>
+      <w:r>
+        <w:rPr>
+          <w:rFonts w:ascii="Times New Roman" w:hAnsi="Times New Roman" w:eastAsia="Times New Roman"/>
+          <w:b w:val="0"/>
+          <w:i w:val="0"/>
+          <w:sz w:val="24"/>
+        </w:rPr>
+      </w:r>
+      <w:r>
+        <w:rPr>
+          <w:rFonts w:ascii="Times New Roman" w:hAnsi="Times New Roman" w:eastAsia="Times New Roman"/>
+          <w:b w:val="0"/>
+          <w:i w:val="0"/>
+          <w:sz w:val="24"/>
+        </w:rPr>
+      </w:r>
+      <w:r>
+        <w:rPr>
           <w:rFonts w:ascii="Times New Roman" w:hAnsi="Times New Roman" w:eastAsia="Times New Roman"/>
           <w:b w:val="0"/>
           <w:i/>
@@ -7372,119 +7443,31 @@
     <w:p>
       <w:pPr>
         <w:spacing w:line="480" w:lineRule="auto"/>
-        <w:ind w:left="630" w:hanging="630"/>
-        <w:rPr>
-          <w:color w:val="000000" w:themeColor="text1"/>
-        </w:rPr>
-      </w:pPr>
-      <w:r>
-        <w:rPr>
-          <w:rFonts w:ascii="Times New Roman" w:hAnsi="Times New Roman" w:eastAsia="Times New Roman"/>
-          <w:b w:val="0"/>
-          <w:i w:val="0"/>
-          <w:sz w:val="24"/>
-          <w:highlight w:val="cyan"/>
-        </w:rPr>
-        <w:t xml:space="preserve">Carcary, M. (2020). The research audit trail: Methodological guidance for application in practice. </w:t>
-      </w:r>
-      <w:r>
-        <w:rPr>
-          <w:b w:val="0"/>
-          <w:i w:val="0"/>
-        </w:rPr>
-      </w:r>
-      <w:r>
-        <w:rPr>
-          <w:b w:val="0"/>
-          <w:i w:val="0"/>
-          <w:iCs/>
-        </w:rPr>
-      </w:r>
-      <w:r>
-        <w:rPr>
-          <w:b w:val="0"/>
-          <w:i w:val="0"/>
-        </w:rPr>
-      </w:r>
-      <w:r>
-        <w:rPr>
-          <w:rFonts w:ascii="Times New Roman" w:hAnsi="Times New Roman" w:eastAsia="Times New Roman"/>
-          <w:b w:val="0"/>
-          <w:i/>
-          <w:sz w:val="24"/>
-        </w:rPr>
-        <w:t>Electronic Journal of Business Research Methods, 18</w:t>
-      </w:r>
-      <w:r>
-        <w:rPr>
-          <w:rFonts w:ascii="Times New Roman" w:hAnsi="Times New Roman" w:eastAsia="Times New Roman"/>
-          <w:b w:val="0"/>
-          <w:i w:val="0"/>
-          <w:sz w:val="24"/>
-        </w:rPr>
-        <w:t xml:space="preserve">(2), 166–177. </w:t>
-      </w:r>
-      <w:hyperlink r:id="rId74">
-        <w:r>
-          <w:rPr>
-            <w:color w:val="0563C1"/>
-            <w:u w:val="single"/>
-            <w:rFonts w:ascii="Times New Roman" w:hAnsi="Times New Roman"/>
-            <w:sz w:val="24"/>
-          </w:rPr>
-          <w:t xml:space="preserve">https://doi.org/10.34190/jbrm.18.2.008</w:t>
-        </w:r>
-      </w:hyperlink>
-    </w:p>
-    <w:p>
-      <w:pPr>
-        <w:spacing w:line="480" w:lineRule="auto"/>
-      </w:pPr>
-      <w:r>
-        <w:rPr>
-          <w:rFonts w:ascii="Times New Roman" w:hAnsi="Times New Roman" w:eastAsia="Times New Roman"/>
-          <w:b w:val="0"/>
-          <w:i w:val="0"/>
-          <w:sz w:val="24"/>
-        </w:rPr>
-        <w:t xml:space="preserve">Chell, E. (2004). Critical incident technique. In C. Cassell &amp; G. Symon (Eds.), </w:t>
-      </w:r>
-      <w:r>
-        <w:rPr>
-          <w:rFonts w:ascii="Times New Roman" w:hAnsi="Times New Roman" w:eastAsia="Times New Roman"/>
-          <w:b w:val="0"/>
-          <w:i/>
-          <w:sz w:val="24"/>
-        </w:rPr>
-        <w:t>Essential guide to qualitative methods in organizational research</w:t>
-      </w:r>
-      <w:r>
-        <w:rPr>
-          <w:rFonts w:ascii="Times New Roman" w:hAnsi="Times New Roman" w:eastAsia="Times New Roman"/>
-          <w:b w:val="0"/>
-          <w:i w:val="0"/>
-          <w:sz w:val="24"/>
-        </w:rPr>
-        <w:t xml:space="preserve"> (pp. 45–60). SAGE.</w:t>
-      </w:r>
-    </w:p>
-    <w:p>
-      <w:pPr>
-        <w:spacing w:line="480" w:lineRule="auto"/>
-        <w:ind w:left="630" w:hanging="630"/>
-        <w:rPr>
-          <w:color w:val="000000" w:themeColor="text1"/>
-        </w:rPr>
       </w:pPr>
       <w:r>
         <w:rPr>
           <w:rFonts w:ascii="Times New Roman" w:hAnsi="Times New Roman" w:eastAsia="Times New Roman"/>
           <w:b/>
           <w:i w:val="0"/>
-          <w:color w:val="000000" w:themeColor="text1"/>
           <w:sz w:val="24"/>
         </w:rPr>
         <w:t xml:space="preserve">Cooper, S., &amp; Endacott, R. (2007). Generic qualitative research: A design for qualitative research in emergency care? </w:t>
+      </w:r>
+      <w:r>
+        <w:rPr>
+          <w:rFonts w:ascii="Times New Roman" w:hAnsi="Times New Roman" w:eastAsia="Times New Roman"/>
+          <w:b w:val="0"/>
+          <w:i w:val="0"/>
+          <w:sz w:val="24"/>
+        </w:rPr>
+      </w:r>
+      <w:r>
+        <w:rPr>
+          <w:rFonts w:ascii="Times New Roman" w:hAnsi="Times New Roman" w:eastAsia="Times New Roman"/>
+          <w:b w:val="0"/>
+          <w:i w:val="0"/>
+          <w:sz w:val="24"/>
+        </w:rPr>
       </w:r>
       <w:r>
         <w:rPr>
@@ -7528,17 +7511,52 @@
       <w:r>
         <w:rPr>
           <w:rFonts w:ascii="Times New Roman" w:hAnsi="Times New Roman" w:eastAsia="Times New Roman"/>
-          <w:b/>
-          <w:i w:val="0"/>
-          <w:color w:val="000000" w:themeColor="text1"/>
-          <w:sz w:val="24"/>
+          <w:b w:val="0"/>
+          <w:i w:val="0"/>
+          <w:sz w:val="24"/>
+          <w:highlight w:val="cyan"/>
         </w:rPr>
         <w:t xml:space="preserve">Creswell, J. W., &amp; Miller, D. L. (2000). Determining validity in qualitative inquiry. </w:t>
       </w:r>
       <w:r>
         <w:rPr>
-          <w:rFonts w:ascii="Times New Roman" w:hAnsi="Times New Roman" w:eastAsia="Times New Roman"/>
-          <w:b/>
+          <w:b w:val="0"/>
+          <w:i w:val="0"/>
+        </w:rPr>
+      </w:r>
+      <w:r>
+        <w:rPr>
+          <w:b w:val="0"/>
+          <w:i w:val="0"/>
+          <w:iCs/>
+        </w:rPr>
+      </w:r>
+      <w:r>
+        <w:rPr>
+          <w:b w:val="0"/>
+          <w:i w:val="0"/>
+        </w:rPr>
+      </w:r>
+      <w:r>
+        <w:rPr>
+          <w:rFonts w:ascii="Times New Roman" w:hAnsi="Times New Roman" w:eastAsia="Times New Roman"/>
+          <w:b w:val="0"/>
+          <w:i w:val="0"/>
+          <w:sz w:val="24"/>
+        </w:rPr>
+      </w:r>
+      <w:r>
+        <w:rPr>
+          <w:rFonts w:ascii="Times New Roman" w:hAnsi="Times New Roman" w:eastAsia="Times New Roman"/>
+          <w:b w:val="0"/>
+          <w:i w:val="0"/>
+          <w:sz w:val="24"/>
+        </w:rPr>
+      </w:r>
+      <w:r>
+        <w:rPr>
+          <w:rFonts w:ascii="Times New Roman" w:hAnsi="Times New Roman" w:eastAsia="Times New Roman"/>
+          <w:b w:val="0"/>
           <w:i/>
           <w:sz w:val="24"/>
         </w:rPr>
@@ -7547,7 +7565,7 @@
       <w:r>
         <w:rPr>
           <w:rFonts w:ascii="Times New Roman" w:hAnsi="Times New Roman" w:eastAsia="Times New Roman"/>
-          <w:b/>
+          <w:b w:val="0"/>
           <w:i w:val="0"/>
           <w:sz w:val="24"/>
         </w:rPr>
@@ -7560,7 +7578,6 @@
             <w:u w:val="single"/>
             <w:rFonts w:ascii="Times New Roman" w:hAnsi="Times New Roman"/>
             <w:sz w:val="24"/>
-            <w:b/>
           </w:rPr>
           <w:t xml:space="preserve">https://doi.org/10.1207/s15430421tip3903_2</w:t>
         </w:r>
@@ -7569,51 +7586,30 @@
     <w:p>
       <w:pPr>
         <w:spacing w:line="480" w:lineRule="auto"/>
-        <w:ind w:left="630" w:hanging="630"/>
-        <w:rPr>
-          <w:color w:val="000000" w:themeColor="text1"/>
-        </w:rPr>
-      </w:pPr>
-      <w:r>
-        <w:rPr>
-          <w:rFonts w:ascii="Times New Roman" w:hAnsi="Times New Roman" w:eastAsia="Times New Roman"/>
-          <w:b w:val="0"/>
-          <w:i w:val="0"/>
-          <w:color w:val="000000" w:themeColor="text1"/>
-          <w:sz w:val="24"/>
-          <w:highlight w:val="cyan"/>
+      </w:pPr>
+      <w:r>
+        <w:rPr>
+          <w:rFonts w:ascii="Times New Roman" w:hAnsi="Times New Roman" w:eastAsia="Times New Roman"/>
+          <w:b w:val="0"/>
+          <w:i w:val="0"/>
+          <w:sz w:val="24"/>
         </w:rPr>
         <w:t xml:space="preserve">Creswell, J. W., &amp; Poth, C. N. (2024). </w:t>
       </w:r>
       <w:r>
         <w:rPr>
-          <w:b w:val="0"/>
-          <w:i w:val="0"/>
-          <w:color w:val="000000" w:themeColor="text1"/>
-          <w:highlight w:val="green"/>
-        </w:rPr>
-      </w:r>
-      <w:r>
-        <w:rPr>
-          <w:b w:val="0"/>
-          <w:i w:val="0"/>
-          <w:color w:val="000000" w:themeColor="text1"/>
-          <w:highlight w:val="green"/>
-        </w:rPr>
-      </w:r>
-      <w:r>
-        <w:rPr>
-          <w:b w:val="0"/>
-          <w:i w:val="0"/>
-          <w:color w:val="000000" w:themeColor="text1"/>
-          <w:highlight w:val="green"/>
-        </w:rPr>
-      </w:r>
-      <w:r>
-        <w:rPr>
-          <w:b w:val="0"/>
-          <w:i w:val="0"/>
-          <w:color w:val="000000" w:themeColor="text1"/>
+          <w:rFonts w:ascii="Times New Roman" w:hAnsi="Times New Roman" w:eastAsia="Times New Roman"/>
+          <w:b w:val="0"/>
+          <w:i w:val="0"/>
+          <w:sz w:val="24"/>
+        </w:rPr>
+      </w:r>
+      <w:r>
+        <w:rPr>
+          <w:rFonts w:ascii="Times New Roman" w:hAnsi="Times New Roman" w:eastAsia="Times New Roman"/>
+          <w:b w:val="0"/>
+          <w:i w:val="0"/>
+          <w:sz w:val="24"/>
         </w:rPr>
       </w:r>
       <w:r>
@@ -7655,16 +7651,18 @@
       </w:r>
       <w:r>
         <w:rPr>
-          <w:b w:val="0"/>
-          <w:i w:val="0"/>
-          <w:color w:val="000000" w:themeColor="text1"/>
-        </w:rPr>
-      </w:r>
-      <w:r>
-        <w:rPr>
-          <w:b w:val="0"/>
-          <w:i w:val="0"/>
-          <w:color w:val="000000" w:themeColor="text1"/>
+          <w:rFonts w:ascii="Times New Roman" w:hAnsi="Times New Roman" w:eastAsia="Times New Roman"/>
+          <w:b w:val="0"/>
+          <w:i w:val="0"/>
+          <w:sz w:val="24"/>
+        </w:rPr>
+      </w:r>
+      <w:r>
+        <w:rPr>
+          <w:rFonts w:ascii="Times New Roman" w:hAnsi="Times New Roman" w:eastAsia="Times New Roman"/>
+          <w:b w:val="0"/>
+          <w:i w:val="0"/>
+          <w:sz w:val="24"/>
         </w:rPr>
       </w:r>
       <w:r>
@@ -7719,6 +7717,22 @@
         <w:rPr>
           <w:rFonts w:ascii="Times New Roman" w:hAnsi="Times New Roman" w:eastAsia="Times New Roman"/>
           <w:b w:val="0"/>
+          <w:i w:val="0"/>
+          <w:sz w:val="24"/>
+        </w:rPr>
+      </w:r>
+      <w:r>
+        <w:rPr>
+          <w:rFonts w:ascii="Times New Roman" w:hAnsi="Times New Roman" w:eastAsia="Times New Roman"/>
+          <w:b w:val="0"/>
+          <w:i w:val="0"/>
+          <w:sz w:val="24"/>
+        </w:rPr>
+      </w:r>
+      <w:r>
+        <w:rPr>
+          <w:rFonts w:ascii="Times New Roman" w:hAnsi="Times New Roman" w:eastAsia="Times New Roman"/>
+          <w:b w:val="0"/>
           <w:i/>
           <w:sz w:val="24"/>
         </w:rPr>
@@ -7756,60 +7770,60 @@
       <w:r>
         <w:rPr>
           <w:rFonts w:ascii="Times New Roman" w:hAnsi="Times New Roman" w:eastAsia="Times New Roman"/>
-          <w:b w:val="0"/>
-          <w:i w:val="0"/>
-          <w:color w:val="000000" w:themeColor="text1"/>
-          <w:sz w:val="24"/>
-        </w:rPr>
-        <w:t xml:space="preserve">Ekinci, Y., Rodrigo, P., Japutra, A., Çifci, S., Tee, M., &amp; Jia, Y. (2025). Assessing small and medium-size enterprise CEOs’ attitude towards business growth: The impact of event risk. </w:t>
-      </w:r>
-      <w:r>
-        <w:rPr>
-          <w:rFonts w:ascii="Times New Roman" w:hAnsi="Times New Roman" w:eastAsia="Times New Roman"/>
-          <w:b w:val="0"/>
-          <w:i/>
-          <w:sz w:val="24"/>
-        </w:rPr>
-        <w:t>Journal of Business Economics and Management, 26</w:t>
-      </w:r>
-      <w:r>
-        <w:rPr>
-          <w:rFonts w:ascii="Times New Roman" w:hAnsi="Times New Roman" w:eastAsia="Times New Roman"/>
-          <w:b w:val="0"/>
-          <w:i w:val="0"/>
-          <w:sz w:val="24"/>
-        </w:rPr>
-        <w:t xml:space="preserve">(3), 533–554. </w:t>
-      </w:r>
-      <w:hyperlink r:id="rId78">
-        <w:r>
-          <w:rPr>
-            <w:color w:val="0563C1"/>
-            <w:u w:val="single"/>
-            <w:rFonts w:ascii="Times New Roman" w:hAnsi="Times New Roman"/>
-            <w:sz w:val="24"/>
-          </w:rPr>
-          <w:t xml:space="preserve">https://doi.org/10.3846/jbem.2025.23519</w:t>
-        </w:r>
-      </w:hyperlink>
-    </w:p>
-    <w:p>
-      <w:pPr>
-        <w:spacing w:line="480" w:lineRule="auto"/>
-        <w:ind w:left="630" w:hanging="630"/>
-        <w:rPr>
-          <w:color w:val="000000" w:themeColor="text1"/>
-        </w:rPr>
-      </w:pPr>
-      <w:r>
-        <w:rPr>
-          <w:rFonts w:ascii="Times New Roman" w:hAnsi="Times New Roman" w:eastAsia="Times New Roman"/>
           <w:b/>
           <w:i w:val="0"/>
           <w:color w:val="000000" w:themeColor="text1"/>
           <w:sz w:val="24"/>
+          <w:highlight w:val="cyan"/>
         </w:rPr>
         <w:t xml:space="preserve">Erdiaw-Kwasie, M. O., Alam, K., &amp; Shahiduzzaman, M. (2017). Towards understanding stakeholder salience transition and relational approach to ‘better’ corporate social responsibility: A case for a proposed model in practice. </w:t>
+      </w:r>
+      <w:r>
+        <w:rPr>
+          <w:b w:val="0"/>
+          <w:i w:val="0"/>
+          <w:color w:val="000000" w:themeColor="text1"/>
+          <w:highlight w:val="green"/>
+        </w:rPr>
+      </w:r>
+      <w:r>
+        <w:rPr>
+          <w:b w:val="0"/>
+          <w:i w:val="0"/>
+          <w:color w:val="000000" w:themeColor="text1"/>
+          <w:highlight w:val="green"/>
+        </w:rPr>
+      </w:r>
+      <w:r>
+        <w:rPr>
+          <w:b w:val="0"/>
+          <w:i w:val="0"/>
+          <w:color w:val="000000" w:themeColor="text1"/>
+          <w:highlight w:val="green"/>
+        </w:rPr>
+      </w:r>
+      <w:r>
+        <w:rPr>
+          <w:b w:val="0"/>
+          <w:i w:val="0"/>
+          <w:color w:val="000000" w:themeColor="text1"/>
+        </w:rPr>
+      </w:r>
+      <w:r>
+        <w:rPr>
+          <w:rFonts w:ascii="Times New Roman" w:hAnsi="Times New Roman" w:eastAsia="Times New Roman"/>
+          <w:b w:val="0"/>
+          <w:i w:val="0"/>
+          <w:sz w:val="24"/>
+        </w:rPr>
+      </w:r>
+      <w:r>
+        <w:rPr>
+          <w:rFonts w:ascii="Times New Roman" w:hAnsi="Times New Roman" w:eastAsia="Times New Roman"/>
+          <w:b w:val="0"/>
+          <w:i w:val="0"/>
+          <w:sz w:val="24"/>
+        </w:rPr>
       </w:r>
       <w:r>
         <w:rPr>
@@ -7857,7 +7871,6 @@
           <w:i w:val="0"/>
           <w:color w:val="000000" w:themeColor="text1"/>
           <w:sz w:val="24"/>
-          <w:highlight w:val="cyan"/>
         </w:rPr>
         <w:t xml:space="preserve">Farahbod, K., Shayo, C., &amp; Varzandeh, J. (2022). Six sigma and lean operations in cybersecurity management. </w:t>
       </w:r>
@@ -7866,6 +7879,29 @@
           <w:b w:val="0"/>
           <w:i w:val="0"/>
           <w:color w:val="000000" w:themeColor="text1"/>
+        </w:rPr>
+      </w:r>
+      <w:r>
+        <w:rPr>
+          <w:b w:val="0"/>
+          <w:i w:val="0"/>
+          <w:color w:val="000000" w:themeColor="text1"/>
+        </w:rPr>
+      </w:r>
+      <w:r>
+        <w:rPr>
+          <w:rFonts w:ascii="Times New Roman" w:hAnsi="Times New Roman" w:eastAsia="Times New Roman"/>
+          <w:b w:val="0"/>
+          <w:i w:val="0"/>
+          <w:sz w:val="24"/>
+        </w:rPr>
+      </w:r>
+      <w:r>
+        <w:rPr>
+          <w:rFonts w:ascii="Times New Roman" w:hAnsi="Times New Roman" w:eastAsia="Times New Roman"/>
+          <w:b w:val="0"/>
+          <w:i w:val="0"/>
+          <w:sz w:val="24"/>
         </w:rPr>
       </w:r>
       <w:r>
@@ -7904,6 +7940,22 @@
           <w:sz w:val="24"/>
         </w:rPr>
         <w:t xml:space="preserve">Federal Bureau of Investigation. (2024). </w:t>
+      </w:r>
+      <w:r>
+        <w:rPr>
+          <w:rFonts w:ascii="Times New Roman" w:hAnsi="Times New Roman" w:eastAsia="Times New Roman"/>
+          <w:b w:val="0"/>
+          <w:i w:val="0"/>
+          <w:sz w:val="24"/>
+        </w:rPr>
+      </w:r>
+      <w:r>
+        <w:rPr>
+          <w:rFonts w:ascii="Times New Roman" w:hAnsi="Times New Roman" w:eastAsia="Times New Roman"/>
+          <w:b w:val="0"/>
+          <w:i w:val="0"/>
+          <w:sz w:val="24"/>
+        </w:rPr>
       </w:r>
       <w:r>
         <w:rPr>
@@ -7936,14 +7988,38 @@
       </w:hyperlink>
     </w:p>
     <w:p>
-      <w:r>
-        <w:rPr>
-          <w:rFonts w:ascii="Times New Roman" w:hAnsi="Times New Roman" w:eastAsia="Times New Roman"/>
-          <w:b w:val="0"/>
-          <w:i w:val="0"/>
+      <w:pPr>
+        <w:spacing w:line="480" w:lineRule="auto"/>
+        <w:ind w:left="630" w:hanging="630"/>
+        <w:rPr>
+          <w:color w:val="000000" w:themeColor="text1"/>
+        </w:rPr>
+      </w:pPr>
+      <w:r>
+        <w:rPr>
+          <w:rFonts w:ascii="Times New Roman" w:hAnsi="Times New Roman" w:eastAsia="Times New Roman"/>
+          <w:b w:val="0"/>
+          <w:i w:val="0"/>
+          <w:color w:val="000000" w:themeColor="text1"/>
           <w:sz w:val="24"/>
         </w:rPr>
         <w:t xml:space="preserve">Fereday, J., &amp; Muir-Cochrane, E. (2006). Demonstrating rigor using thematic analysis: A hybrid approach of inductive and deductive coding and theme development. </w:t>
+      </w:r>
+      <w:r>
+        <w:rPr>
+          <w:rFonts w:ascii="Times New Roman" w:hAnsi="Times New Roman" w:eastAsia="Times New Roman"/>
+          <w:b w:val="0"/>
+          <w:i w:val="0"/>
+          <w:sz w:val="24"/>
+        </w:rPr>
+      </w:r>
+      <w:r>
+        <w:rPr>
+          <w:rFonts w:ascii="Times New Roman" w:hAnsi="Times New Roman" w:eastAsia="Times New Roman"/>
+          <w:b w:val="0"/>
+          <w:i w:val="0"/>
+          <w:sz w:val="24"/>
+        </w:rPr>
       </w:r>
       <w:r>
         <w:rPr>
@@ -7995,9 +8071,18 @@
       </w:r>
       <w:r>
         <w:rPr>
-          <w:b w:val="0"/>
-          <w:i w:val="0"/>
-          <w:color w:val="000000" w:themeColor="text1"/>
+          <w:rFonts w:ascii="Times New Roman" w:hAnsi="Times New Roman" w:eastAsia="Times New Roman"/>
+          <w:b w:val="0"/>
+          <w:i w:val="0"/>
+          <w:sz w:val="24"/>
+        </w:rPr>
+      </w:r>
+      <w:r>
+        <w:rPr>
+          <w:rFonts w:ascii="Times New Roman" w:hAnsi="Times New Roman" w:eastAsia="Times New Roman"/>
+          <w:b w:val="0"/>
+          <w:i w:val="0"/>
+          <w:sz w:val="24"/>
         </w:rPr>
       </w:r>
       <w:r>
@@ -8044,8 +8129,9 @@
           <w:rFonts w:ascii="Times New Roman" w:hAnsi="Times New Roman" w:eastAsia="Times New Roman"/>
           <w:b w:val="0"/>
           <w:i w:val="0"/>
-          <w:sz w:val="24"/>
-          <w:highlight w:val="yellow"/>
+          <w:color w:val="000000" w:themeColor="text1"/>
+          <w:sz w:val="24"/>
+          <w:highlight w:val="cyan"/>
         </w:rPr>
         <w:t xml:space="preserve">Flanagan, J. C. (1954). The critical incident technique. </w:t>
       </w:r>
@@ -8053,32 +8139,23 @@
         <w:rPr>
           <w:b w:val="0"/>
           <w:i w:val="0"/>
-        </w:rPr>
-      </w:r>
-      <w:r>
-        <w:rPr>
-          <w:b w:val="0"/>
-          <w:i w:val="0"/>
-          <w:iCs/>
-        </w:rPr>
-      </w:r>
-      <w:r>
-        <w:rPr>
-          <w:b w:val="0"/>
-          <w:i w:val="0"/>
-        </w:rPr>
-      </w:r>
-      <w:r>
-        <w:rPr>
-          <w:b w:val="0"/>
-          <w:i w:val="0"/>
-          <w:iCs/>
-        </w:rPr>
-      </w:r>
-      <w:r>
-        <w:rPr>
-          <w:b w:val="0"/>
-          <w:i w:val="0"/>
+          <w:color w:val="000000" w:themeColor="text1"/>
+        </w:rPr>
+      </w:r>
+      <w:r>
+        <w:rPr>
+          <w:rFonts w:ascii="Times New Roman" w:hAnsi="Times New Roman" w:eastAsia="Times New Roman"/>
+          <w:b w:val="0"/>
+          <w:i w:val="0"/>
+          <w:sz w:val="24"/>
+        </w:rPr>
+      </w:r>
+      <w:r>
+        <w:rPr>
+          <w:rFonts w:ascii="Times New Roman" w:hAnsi="Times New Roman" w:eastAsia="Times New Roman"/>
+          <w:b w:val="0"/>
+          <w:i w:val="0"/>
+          <w:sz w:val="24"/>
         </w:rPr>
       </w:r>
       <w:r>
@@ -8133,6 +8210,22 @@
         <w:rPr>
           <w:rFonts w:ascii="Times New Roman" w:hAnsi="Times New Roman" w:eastAsia="Times New Roman"/>
           <w:b w:val="0"/>
+          <w:i w:val="0"/>
+          <w:sz w:val="24"/>
+        </w:rPr>
+      </w:r>
+      <w:r>
+        <w:rPr>
+          <w:rFonts w:ascii="Times New Roman" w:hAnsi="Times New Roman" w:eastAsia="Times New Roman"/>
+          <w:b w:val="0"/>
+          <w:i w:val="0"/>
+          <w:sz w:val="24"/>
+        </w:rPr>
+      </w:r>
+      <w:r>
+        <w:rPr>
+          <w:rFonts w:ascii="Times New Roman" w:hAnsi="Times New Roman" w:eastAsia="Times New Roman"/>
+          <w:b w:val="0"/>
           <w:i/>
           <w:sz w:val="24"/>
         </w:rPr>
@@ -8149,9 +8242,6 @@
       </w:r>
     </w:p>
     <w:p>
-      <w:pPr>
-        <w:spacing w:line="480" w:lineRule="auto"/>
-      </w:pPr>
       <w:r>
         <w:rPr>
           <w:rFonts w:ascii="Times New Roman" w:hAnsi="Times New Roman" w:eastAsia="Times New Roman"/>
@@ -8160,6 +8250,22 @@
           <w:sz w:val="24"/>
         </w:rPr>
         <w:t xml:space="preserve">Freeman, R. E. (2008). </w:t>
+      </w:r>
+      <w:r>
+        <w:rPr>
+          <w:rFonts w:ascii="Times New Roman" w:hAnsi="Times New Roman" w:eastAsia="Times New Roman"/>
+          <w:b w:val="0"/>
+          <w:i w:val="0"/>
+          <w:sz w:val="24"/>
+        </w:rPr>
+      </w:r>
+      <w:r>
+        <w:rPr>
+          <w:rFonts w:ascii="Times New Roman" w:hAnsi="Times New Roman" w:eastAsia="Times New Roman"/>
+          <w:b w:val="0"/>
+          <w:i w:val="0"/>
+          <w:sz w:val="24"/>
+        </w:rPr>
       </w:r>
       <w:r>
         <w:rPr>
@@ -8185,22 +8291,33 @@
         <w:spacing w:line="480" w:lineRule="auto"/>
         <w:ind w:left="630" w:hanging="630"/>
         <w:rPr>
-          <w:b/>
-          <w:bCs/>
-          <w:color w:val="000000" w:themeColor="text1"/>
-        </w:rPr>
-      </w:pPr>
-      <w:r>
-        <w:rPr>
-          <w:rFonts w:ascii="Times New Roman" w:hAnsi="Times New Roman" w:eastAsia="Times New Roman"/>
-          <w:b w:val="0"/>
-          <w:bCs/>
-          <w:i w:val="0"/>
-          <w:color w:val="000000" w:themeColor="text1"/>
-          <w:sz w:val="24"/>
-          <w:highlight w:val="yellow"/>
+          <w:color w:val="000000" w:themeColor="text1"/>
+        </w:rPr>
+      </w:pPr>
+      <w:r>
+        <w:rPr>
+          <w:rFonts w:ascii="Times New Roman" w:hAnsi="Times New Roman" w:eastAsia="Times New Roman"/>
+          <w:b w:val="0"/>
+          <w:i w:val="0"/>
+          <w:color w:val="000000" w:themeColor="text1"/>
+          <w:sz w:val="24"/>
         </w:rPr>
         <w:t xml:space="preserve">Freeman, R. E. (2009). Stakeholder theory: 25 years later. </w:t>
+      </w:r>
+      <w:r>
+        <w:rPr>
+          <w:b w:val="0"/>
+          <w:i w:val="0"/>
+          <w:color w:val="000000" w:themeColor="text1"/>
+        </w:rPr>
+      </w:r>
+      <w:r>
+        <w:rPr>
+          <w:rFonts w:ascii="Times New Roman" w:hAnsi="Times New Roman" w:eastAsia="Times New Roman"/>
+          <w:b w:val="0"/>
+          <w:i w:val="0"/>
+          <w:sz w:val="24"/>
+        </w:rPr>
       </w:r>
       <w:r>
         <w:rPr>
@@ -8253,10 +8370,58 @@
           <w:rFonts w:ascii="Times New Roman" w:hAnsi="Times New Roman" w:eastAsia="Times New Roman"/>
           <w:b w:val="0"/>
           <w:i w:val="0"/>
-          <w:color w:val="000000" w:themeColor="text1"/>
-          <w:sz w:val="24"/>
+          <w:sz w:val="24"/>
+          <w:highlight w:val="yellow"/>
         </w:rPr>
         <w:t xml:space="preserve">Freeman, R. E., Gilbert, D. R., Jr., &amp; Hartman, E. (1988). Values and the foundations of strategic management. </w:t>
+      </w:r>
+      <w:r>
+        <w:rPr>
+          <w:b w:val="0"/>
+          <w:i w:val="0"/>
+        </w:rPr>
+      </w:r>
+      <w:r>
+        <w:rPr>
+          <w:b w:val="0"/>
+          <w:i w:val="0"/>
+          <w:iCs/>
+        </w:rPr>
+      </w:r>
+      <w:r>
+        <w:rPr>
+          <w:b w:val="0"/>
+          <w:i w:val="0"/>
+        </w:rPr>
+      </w:r>
+      <w:r>
+        <w:rPr>
+          <w:b w:val="0"/>
+          <w:i w:val="0"/>
+          <w:iCs/>
+        </w:rPr>
+      </w:r>
+      <w:r>
+        <w:rPr>
+          <w:b w:val="0"/>
+          <w:i w:val="0"/>
+        </w:rPr>
+      </w:r>
+      <w:r>
+        <w:rPr>
+          <w:rFonts w:ascii="Times New Roman" w:hAnsi="Times New Roman" w:eastAsia="Times New Roman"/>
+          <w:b w:val="0"/>
+          <w:i w:val="0"/>
+          <w:sz w:val="24"/>
+        </w:rPr>
+      </w:r>
+      <w:r>
+        <w:rPr>
+          <w:rFonts w:ascii="Times New Roman" w:hAnsi="Times New Roman" w:eastAsia="Times New Roman"/>
+          <w:b w:val="0"/>
+          <w:i w:val="0"/>
+          <w:sz w:val="24"/>
+        </w:rPr>
       </w:r>
       <w:r>
         <w:rPr>
@@ -8310,6 +8475,22 @@
         <w:rPr>
           <w:rFonts w:ascii="Times New Roman" w:hAnsi="Times New Roman" w:eastAsia="Times New Roman"/>
           <w:b w:val="0"/>
+          <w:i w:val="0"/>
+          <w:sz w:val="24"/>
+        </w:rPr>
+      </w:r>
+      <w:r>
+        <w:rPr>
+          <w:rFonts w:ascii="Times New Roman" w:hAnsi="Times New Roman" w:eastAsia="Times New Roman"/>
+          <w:b w:val="0"/>
+          <w:i w:val="0"/>
+          <w:sz w:val="24"/>
+        </w:rPr>
+      </w:r>
+      <w:r>
+        <w:rPr>
+          <w:rFonts w:ascii="Times New Roman" w:hAnsi="Times New Roman" w:eastAsia="Times New Roman"/>
+          <w:b w:val="0"/>
           <w:i/>
           <w:sz w:val="24"/>
         </w:rPr>
@@ -8339,20 +8520,31 @@
     <w:p>
       <w:pPr>
         <w:spacing w:line="480" w:lineRule="auto"/>
-        <w:ind w:left="630" w:hanging="630"/>
-        <w:rPr>
-          <w:color w:val="000000" w:themeColor="text1"/>
-        </w:rPr>
-      </w:pPr>
-      <w:r>
-        <w:rPr>
-          <w:rFonts w:ascii="Times New Roman" w:hAnsi="Times New Roman" w:eastAsia="Times New Roman"/>
-          <w:b w:val="0"/>
-          <w:i w:val="0"/>
-          <w:color w:val="000000" w:themeColor="text1"/>
+      </w:pPr>
+      <w:r>
+        <w:rPr>
+          <w:rFonts w:ascii="Times New Roman" w:hAnsi="Times New Roman" w:eastAsia="Times New Roman"/>
+          <w:b w:val="0"/>
+          <w:i w:val="0"/>
           <w:sz w:val="24"/>
         </w:rPr>
         <w:t xml:space="preserve">Freeman, R. E., Phillips, R., &amp; Sisodia, R. (2020). Tensions in stakeholder theory. </w:t>
+      </w:r>
+      <w:r>
+        <w:rPr>
+          <w:rFonts w:ascii="Times New Roman" w:hAnsi="Times New Roman" w:eastAsia="Times New Roman"/>
+          <w:b w:val="0"/>
+          <w:i w:val="0"/>
+          <w:sz w:val="24"/>
+        </w:rPr>
+      </w:r>
+      <w:r>
+        <w:rPr>
+          <w:rFonts w:ascii="Times New Roman" w:hAnsi="Times New Roman" w:eastAsia="Times New Roman"/>
+          <w:b w:val="0"/>
+          <w:i w:val="0"/>
+          <w:sz w:val="24"/>
+        </w:rPr>
       </w:r>
       <w:r>
         <w:rPr>
@@ -8389,18 +8581,46 @@
         <w:spacing w:line="480" w:lineRule="auto"/>
         <w:ind w:left="630" w:hanging="630"/>
         <w:rPr>
-          <w:color w:val="000000" w:themeColor="text1"/>
-        </w:rPr>
-      </w:pPr>
-      <w:r>
-        <w:rPr>
-          <w:rFonts w:ascii="Times New Roman" w:hAnsi="Times New Roman" w:eastAsia="Times New Roman"/>
-          <w:b w:val="0"/>
-          <w:i w:val="0"/>
-          <w:color w:val="000000" w:themeColor="text1"/>
-          <w:sz w:val="24"/>
+          <w:b/>
+          <w:bCs/>
+          <w:color w:val="000000" w:themeColor="text1"/>
+        </w:rPr>
+      </w:pPr>
+      <w:r>
+        <w:rPr>
+          <w:rFonts w:ascii="Times New Roman" w:hAnsi="Times New Roman" w:eastAsia="Times New Roman"/>
+          <w:b w:val="0"/>
+          <w:bCs/>
+          <w:i w:val="0"/>
+          <w:color w:val="000000" w:themeColor="text1"/>
+          <w:sz w:val="24"/>
+          <w:highlight w:val="yellow"/>
         </w:rPr>
         <w:t xml:space="preserve">Freeman, R. E., Wicks, A. C., &amp; Parmar, B. (2004). Stakeholder theory and the corporate objective revisited. </w:t>
+      </w:r>
+      <w:r>
+        <w:rPr>
+          <w:rFonts w:ascii="Times New Roman" w:hAnsi="Times New Roman" w:eastAsia="Times New Roman"/>
+          <w:b w:val="0"/>
+          <w:i w:val="0"/>
+          <w:sz w:val="24"/>
+        </w:rPr>
+      </w:r>
+      <w:r>
+        <w:rPr>
+          <w:rFonts w:ascii="Times New Roman" w:hAnsi="Times New Roman" w:eastAsia="Times New Roman"/>
+          <w:b w:val="0"/>
+          <w:i w:val="0"/>
+          <w:sz w:val="24"/>
+        </w:rPr>
+      </w:r>
+      <w:r>
+        <w:rPr>
+          <w:rFonts w:ascii="Times New Roman" w:hAnsi="Times New Roman" w:eastAsia="Times New Roman"/>
+          <w:b w:val="0"/>
+          <w:i w:val="0"/>
+          <w:sz w:val="24"/>
+        </w:rPr>
       </w:r>
       <w:r>
         <w:rPr>
@@ -8443,18 +8663,91 @@
       <w:r>
         <w:rPr>
           <w:rFonts w:ascii="Times New Roman" w:hAnsi="Times New Roman" w:eastAsia="Times New Roman"/>
+          <w:b w:val="0"/>
+          <w:i w:val="0"/>
+          <w:color w:val="000000" w:themeColor="text1"/>
+          <w:sz w:val="24"/>
+        </w:rPr>
+        <w:t xml:space="preserve">Fusch, P., Fusch, G. E., &amp; Ness, L. R. (2018). Denzin’s paradigm shift: Revisiting triangulation in qualitative research. </w:t>
+      </w:r>
+      <w:r>
+        <w:rPr>
+          <w:rFonts w:ascii="Times New Roman" w:hAnsi="Times New Roman" w:eastAsia="Times New Roman"/>
+          <w:b w:val="0"/>
+          <w:i w:val="0"/>
+          <w:sz w:val="24"/>
+        </w:rPr>
+      </w:r>
+      <w:r>
+        <w:rPr>
+          <w:rFonts w:ascii="Times New Roman" w:hAnsi="Times New Roman" w:eastAsia="Times New Roman"/>
+          <w:b w:val="0"/>
+          <w:i w:val="0"/>
+          <w:sz w:val="24"/>
+        </w:rPr>
+      </w:r>
+      <w:r>
+        <w:rPr>
+          <w:rFonts w:ascii="Times New Roman" w:hAnsi="Times New Roman" w:eastAsia="Times New Roman"/>
+          <w:b w:val="0"/>
+          <w:i/>
+          <w:sz w:val="24"/>
+        </w:rPr>
+        <w:t>Journal of Social Change, 10</w:t>
+      </w:r>
+      <w:r>
+        <w:rPr>
+          <w:rFonts w:ascii="Times New Roman" w:hAnsi="Times New Roman" w:eastAsia="Times New Roman"/>
+          <w:b w:val="0"/>
+          <w:i w:val="0"/>
+          <w:sz w:val="24"/>
+        </w:rPr>
+        <w:t xml:space="preserve">(1), 19–32. </w:t>
+      </w:r>
+      <w:hyperlink r:id="rId32">
+        <w:r>
+          <w:rPr>
+            <w:color w:val="0563C1"/>
+            <w:u w:val="single"/>
+            <w:rFonts w:ascii="Times New Roman" w:hAnsi="Times New Roman"/>
+            <w:sz w:val="24"/>
+          </w:rPr>
+          <w:t xml:space="preserve">https://doi.org/10.5590/JOSC.2018.10.1.02</w:t>
+        </w:r>
+      </w:hyperlink>
+    </w:p>
+    <w:p>
+      <w:pPr>
+        <w:spacing w:line="480" w:lineRule="auto"/>
+        <w:ind w:left="630" w:hanging="630"/>
+        <w:rPr>
+          <w:color w:val="000000" w:themeColor="text1"/>
+        </w:rPr>
+      </w:pPr>
+      <w:r>
+        <w:rPr>
+          <w:rFonts w:ascii="Times New Roman" w:hAnsi="Times New Roman" w:eastAsia="Times New Roman"/>
           <w:b/>
           <w:i w:val="0"/>
           <w:color w:val="000000" w:themeColor="text1"/>
           <w:sz w:val="24"/>
         </w:rPr>
-        <w:t xml:space="preserve">Fusch, P., Fusch, G. E., &amp; Ness, L. R. (2018). Denzin’s paradigm shift: Revisiting triangulation in qualitative research. </w:t>
-      </w:r>
-      <w:r>
-        <w:rPr>
-          <w:b w:val="0"/>
-          <w:i w:val="0"/>
-          <w:color w:val="000000" w:themeColor="text1"/>
+        <w:t xml:space="preserve">Gabriel, C., &amp; Shafique, K. (2024). An ethical salience framework to achieve sustainable development goals. </w:t>
+      </w:r>
+      <w:r>
+        <w:rPr>
+          <w:rFonts w:ascii="Times New Roman" w:hAnsi="Times New Roman" w:eastAsia="Times New Roman"/>
+          <w:b w:val="0"/>
+          <w:i w:val="0"/>
+          <w:sz w:val="24"/>
+        </w:rPr>
+      </w:r>
+      <w:r>
+        <w:rPr>
+          <w:rFonts w:ascii="Times New Roman" w:hAnsi="Times New Roman" w:eastAsia="Times New Roman"/>
+          <w:b w:val="0"/>
+          <w:i w:val="0"/>
+          <w:sz w:val="24"/>
         </w:rPr>
       </w:r>
       <w:r>
@@ -8464,7 +8757,7 @@
           <w:i/>
           <w:sz w:val="24"/>
         </w:rPr>
-        <w:t>Journal of Social Change, 10</w:t>
+        <w:t>Sustainable Development, 32</w:t>
       </w:r>
       <w:r>
         <w:rPr>
@@ -8473,9 +8766,9 @@
           <w:i w:val="0"/>
           <w:sz w:val="24"/>
         </w:rPr>
-        <w:t xml:space="preserve">(1), 19–32. </w:t>
-      </w:r>
-      <w:hyperlink r:id="rId32">
+        <w:t xml:space="preserve">(4), 3213–3225. </w:t>
+      </w:r>
+      <w:hyperlink r:id="rId85">
         <w:r>
           <w:rPr>
             <w:color w:val="0563C1"/>
@@ -8484,7 +8777,7 @@
             <w:sz w:val="24"/>
             <w:b/>
           </w:rPr>
-          <w:t xml:space="preserve">https://doi.org/10.5590/JOSC.2018.10.1.02</w:t>
+          <w:t xml:space="preserve">https://doi.org/10.1002/sd.2840</w:t>
         </w:r>
       </w:hyperlink>
     </w:p>
@@ -8504,27 +8797,43 @@
           <w:color w:val="000000" w:themeColor="text1"/>
           <w:sz w:val="24"/>
         </w:rPr>
-        <w:t xml:space="preserve">Gabriel, C., &amp; Shafique, K. (2024). An ethical salience framework to achieve sustainable development goals. </w:t>
-      </w:r>
-      <w:r>
-        <w:rPr>
-          <w:rFonts w:ascii="Times New Roman" w:hAnsi="Times New Roman" w:eastAsia="Times New Roman"/>
-          <w:b w:val="0"/>
-          <w:i/>
-          <w:sz w:val="24"/>
-        </w:rPr>
-        <w:t>Sustainable Development, 32</w:t>
-      </w:r>
-      <w:r>
-        <w:rPr>
-          <w:rFonts w:ascii="Times New Roman" w:hAnsi="Times New Roman" w:eastAsia="Times New Roman"/>
-          <w:b w:val="0"/>
-          <w:i w:val="0"/>
-          <w:sz w:val="24"/>
-        </w:rPr>
-        <w:t xml:space="preserve">(4), 3213–3225. </w:t>
-      </w:r>
-      <w:hyperlink r:id="rId85">
+        <w:t xml:space="preserve">Gremler, D. D. (2004). The critical incident technique in service research. </w:t>
+      </w:r>
+      <w:r>
+        <w:rPr>
+          <w:rFonts w:ascii="Times New Roman" w:hAnsi="Times New Roman" w:eastAsia="Times New Roman"/>
+          <w:b w:val="0"/>
+          <w:i w:val="0"/>
+          <w:sz w:val="24"/>
+        </w:rPr>
+      </w:r>
+      <w:r>
+        <w:rPr>
+          <w:rFonts w:ascii="Times New Roman" w:hAnsi="Times New Roman" w:eastAsia="Times New Roman"/>
+          <w:b w:val="0"/>
+          <w:i w:val="0"/>
+          <w:sz w:val="24"/>
+        </w:rPr>
+      </w:r>
+      <w:r>
+        <w:rPr>
+          <w:rFonts w:ascii="Times New Roman" w:hAnsi="Times New Roman" w:eastAsia="Times New Roman"/>
+          <w:b w:val="0"/>
+          <w:i/>
+          <w:sz w:val="24"/>
+        </w:rPr>
+        <w:t>Journal of Service Research, 7</w:t>
+      </w:r>
+      <w:r>
+        <w:rPr>
+          <w:rFonts w:ascii="Times New Roman" w:hAnsi="Times New Roman" w:eastAsia="Times New Roman"/>
+          <w:b w:val="0"/>
+          <w:i w:val="0"/>
+          <w:sz w:val="24"/>
+        </w:rPr>
+        <w:t xml:space="preserve">(1), 65–89. </w:t>
+      </w:r>
+      <w:hyperlink r:id="rId15">
         <w:r>
           <w:rPr>
             <w:color w:val="0563C1"/>
@@ -8532,7 +8841,7 @@
             <w:rFonts w:ascii="Times New Roman" w:hAnsi="Times New Roman"/>
             <w:sz w:val="24"/>
           </w:rPr>
-          <w:t xml:space="preserve">https://doi.org/10.1002/sd.2840</w:t>
+          <w:t xml:space="preserve">https://doi.org/10.1177/1094670504266138</w:t>
         </w:r>
       </w:hyperlink>
     </w:p>
@@ -8558,6 +8867,22 @@
         <w:rPr>
           <w:rFonts w:ascii="Times New Roman" w:hAnsi="Times New Roman" w:eastAsia="Times New Roman"/>
           <w:b w:val="0"/>
+          <w:i w:val="0"/>
+          <w:sz w:val="24"/>
+        </w:rPr>
+      </w:r>
+      <w:r>
+        <w:rPr>
+          <w:rFonts w:ascii="Times New Roman" w:hAnsi="Times New Roman" w:eastAsia="Times New Roman"/>
+          <w:b w:val="0"/>
+          <w:i w:val="0"/>
+          <w:sz w:val="24"/>
+        </w:rPr>
+      </w:r>
+      <w:r>
+        <w:rPr>
+          <w:rFonts w:ascii="Times New Roman" w:hAnsi="Times New Roman" w:eastAsia="Times New Roman"/>
+          <w:b w:val="0"/>
           <w:i/>
           <w:sz w:val="24"/>
         </w:rPr>
@@ -8590,6 +8915,29 @@
           <w:sz w:val="24"/>
         </w:rPr>
         <w:t xml:space="preserve">Guest, G., Bunce, A., &amp; Johnson, L. (2006). How many interviews are enough? An experiment with data saturation and variability. </w:t>
+      </w:r>
+      <w:r>
+        <w:rPr>
+          <w:b w:val="0"/>
+          <w:i w:val="0"/>
+          <w:color w:val="000000" w:themeColor="text1"/>
+        </w:rPr>
+      </w:r>
+      <w:r>
+        <w:rPr>
+          <w:rFonts w:ascii="Times New Roman" w:hAnsi="Times New Roman" w:eastAsia="Times New Roman"/>
+          <w:b w:val="0"/>
+          <w:i w:val="0"/>
+          <w:sz w:val="24"/>
+        </w:rPr>
+      </w:r>
+      <w:r>
+        <w:rPr>
+          <w:rFonts w:ascii="Times New Roman" w:hAnsi="Times New Roman" w:eastAsia="Times New Roman"/>
+          <w:b w:val="0"/>
+          <w:i w:val="0"/>
+          <w:sz w:val="24"/>
+        </w:rPr>
       </w:r>
       <w:r>
         <w:rPr>
@@ -8625,6 +8973,73 @@
       <w:pPr>
         <w:spacing w:line="480" w:lineRule="auto"/>
         <w:ind w:left="630" w:hanging="630"/>
+        <w:rPr>
+          <w:color w:val="000000" w:themeColor="text1"/>
+        </w:rPr>
+      </w:pPr>
+      <w:r>
+        <w:rPr>
+          <w:rFonts w:ascii="Times New Roman" w:hAnsi="Times New Roman" w:eastAsia="Times New Roman"/>
+          <w:b w:val="0"/>
+          <w:i w:val="0"/>
+          <w:color w:val="000000" w:themeColor="text1"/>
+          <w:sz w:val="24"/>
+        </w:rPr>
+        <w:t xml:space="preserve">Guest, G., Namey, E., &amp; Chen, M. (2020). A simple method to assess and report thematic saturation in qualitative research. </w:t>
+      </w:r>
+      <w:r>
+        <w:rPr>
+          <w:rFonts w:ascii="Times New Roman" w:hAnsi="Times New Roman" w:eastAsia="Times New Roman"/>
+          <w:b w:val="0"/>
+          <w:i w:val="0"/>
+          <w:sz w:val="24"/>
+        </w:rPr>
+      </w:r>
+      <w:r>
+        <w:rPr>
+          <w:rFonts w:ascii="Times New Roman" w:hAnsi="Times New Roman" w:eastAsia="Times New Roman"/>
+          <w:b w:val="0"/>
+          <w:i w:val="0"/>
+          <w:sz w:val="24"/>
+        </w:rPr>
+      </w:r>
+      <w:r>
+        <w:rPr>
+          <w:rFonts w:ascii="Times New Roman" w:hAnsi="Times New Roman" w:eastAsia="Times New Roman"/>
+          <w:b w:val="0"/>
+          <w:i/>
+          <w:sz w:val="24"/>
+        </w:rPr>
+        <w:t>PLOS ONE, 15</w:t>
+      </w:r>
+      <w:r>
+        <w:rPr>
+          <w:rFonts w:ascii="Times New Roman" w:hAnsi="Times New Roman" w:eastAsia="Times New Roman"/>
+          <w:b w:val="0"/>
+          <w:i w:val="0"/>
+          <w:sz w:val="24"/>
+        </w:rPr>
+        <w:t xml:space="preserve">(5), Article e0232076. </w:t>
+      </w:r>
+      <w:hyperlink r:id="rId20">
+        <w:r>
+          <w:rPr>
+            <w:color w:val="0563C1"/>
+            <w:u w:val="single"/>
+            <w:rFonts w:ascii="Times New Roman" w:hAnsi="Times New Roman"/>
+            <w:sz w:val="24"/>
+          </w:rPr>
+          <w:t xml:space="preserve">https://doi.org/10.1371/journal.pone.0232076</w:t>
+        </w:r>
+      </w:hyperlink>
+    </w:p>
+    <w:p>
+      <w:pPr>
+        <w:spacing w:line="480" w:lineRule="auto"/>
+        <w:ind w:left="630" w:hanging="630"/>
+        <w:rPr>
+          <w:color w:val="000000" w:themeColor="text1"/>
+        </w:rPr>
       </w:pPr>
       <w:r>
         <w:rPr>
@@ -8635,6 +9050,22 @@
           <w:sz w:val="24"/>
         </w:rPr>
         <w:t xml:space="preserve">Kahlke, R. M. (2014). Generic qualitative approaches: Pitfalls and benefits of methodological mixology. </w:t>
+      </w:r>
+      <w:r>
+        <w:rPr>
+          <w:rFonts w:ascii="Times New Roman" w:hAnsi="Times New Roman" w:eastAsia="Times New Roman"/>
+          <w:b w:val="0"/>
+          <w:i w:val="0"/>
+          <w:sz w:val="24"/>
+        </w:rPr>
+      </w:r>
+      <w:r>
+        <w:rPr>
+          <w:rFonts w:ascii="Times New Roman" w:hAnsi="Times New Roman" w:eastAsia="Times New Roman"/>
+          <w:b w:val="0"/>
+          <w:i w:val="0"/>
+          <w:sz w:val="24"/>
+        </w:rPr>
       </w:r>
       <w:r>
         <w:rPr>
@@ -8670,40 +9101,40 @@
       <w:pPr>
         <w:spacing w:line="480" w:lineRule="auto"/>
         <w:ind w:left="630" w:hanging="630"/>
-      </w:pPr>
-      <w:r>
-        <w:rPr>
-          <w:rFonts w:ascii="Times New Roman" w:hAnsi="Times New Roman" w:eastAsia="Times New Roman"/>
-          <w:b/>
-          <w:i w:val="0"/>
-          <w:sz w:val="24"/>
-          <w:highlight w:val="cyan"/>
+        <w:rPr>
+          <w:color w:val="000000" w:themeColor="text1"/>
+        </w:rPr>
+      </w:pPr>
+      <w:r>
+        <w:rPr>
+          <w:rFonts w:ascii="Times New Roman" w:hAnsi="Times New Roman" w:eastAsia="Times New Roman"/>
+          <w:b w:val="0"/>
+          <w:i w:val="0"/>
+          <w:color w:val="000000" w:themeColor="text1"/>
+          <w:sz w:val="24"/>
         </w:rPr>
         <w:t xml:space="preserve">Kenny, C., Weber, C., &amp; Bratton, K. (2017). The characteristics of interpersonal networks in disaster response. </w:t>
       </w:r>
       <w:r>
         <w:rPr>
-          <w:b w:val="0"/>
-          <w:i w:val="0"/>
-        </w:rPr>
-      </w:r>
-      <w:r>
-        <w:rPr>
-          <w:rStyle w:val="Emphasis"/>
-          <w:b w:val="0"/>
-          <w:i w:val="0"/>
-        </w:rPr>
-      </w:r>
-      <w:r>
-        <w:rPr>
-          <w:b w:val="0"/>
-          <w:i w:val="0"/>
-        </w:rPr>
-      </w:r>
-      <w:r>
-        <w:rPr>
-          <w:rFonts w:ascii="Times New Roman" w:hAnsi="Times New Roman" w:eastAsia="Times New Roman"/>
-          <w:b/>
+          <w:rFonts w:ascii="Times New Roman" w:hAnsi="Times New Roman" w:eastAsia="Times New Roman"/>
+          <w:b w:val="0"/>
+          <w:i w:val="0"/>
+          <w:sz w:val="24"/>
+        </w:rPr>
+      </w:r>
+      <w:r>
+        <w:rPr>
+          <w:rFonts w:ascii="Times New Roman" w:hAnsi="Times New Roman" w:eastAsia="Times New Roman"/>
+          <w:b w:val="0"/>
+          <w:i w:val="0"/>
+          <w:sz w:val="24"/>
+        </w:rPr>
+      </w:r>
+      <w:r>
+        <w:rPr>
+          <w:rFonts w:ascii="Times New Roman" w:hAnsi="Times New Roman" w:eastAsia="Times New Roman"/>
+          <w:b w:val="0"/>
           <w:i/>
           <w:sz w:val="24"/>
         </w:rPr>
@@ -8712,7 +9143,7 @@
       <w:r>
         <w:rPr>
           <w:rFonts w:ascii="Times New Roman" w:hAnsi="Times New Roman" w:eastAsia="Times New Roman"/>
-          <w:b/>
+          <w:b w:val="0"/>
           <w:i w:val="0"/>
           <w:sz w:val="24"/>
         </w:rPr>
@@ -8725,7 +9156,6 @@
             <w:u w:val="single"/>
             <w:rFonts w:ascii="Times New Roman" w:hAnsi="Times New Roman"/>
             <w:sz w:val="24"/>
-            <w:b/>
           </w:rPr>
           <w:t xml:space="preserve">https://doi.org/10.1111/ssqu.12328</w:t>
         </w:r>
@@ -8739,49 +9169,33 @@
       <w:r>
         <w:rPr>
           <w:rFonts w:ascii="Times New Roman" w:hAnsi="Times New Roman" w:eastAsia="Times New Roman"/>
-          <w:b/>
-          <w:i w:val="0"/>
-          <w:sz w:val="24"/>
-          <w:highlight w:val="yellow"/>
+          <w:b w:val="0"/>
+          <w:i w:val="0"/>
+          <w:color w:val="000000" w:themeColor="text1"/>
+          <w:sz w:val="24"/>
         </w:rPr>
         <w:t xml:space="preserve">Koerber, A., &amp; McMichael, L. (2008). Qualitative sampling methods: A primer for technical communicators. </w:t>
       </w:r>
       <w:r>
         <w:rPr>
-          <w:b w:val="0"/>
-          <w:i w:val="0"/>
-        </w:rPr>
-      </w:r>
-      <w:r>
-        <w:rPr>
-          <w:b w:val="0"/>
-          <w:i w:val="0"/>
-          <w:iCs/>
-        </w:rPr>
-      </w:r>
-      <w:r>
-        <w:rPr>
-          <w:b w:val="0"/>
-          <w:i w:val="0"/>
-        </w:rPr>
-      </w:r>
-      <w:r>
-        <w:rPr>
-          <w:b w:val="0"/>
-          <w:i w:val="0"/>
-          <w:iCs/>
-        </w:rPr>
-      </w:r>
-      <w:r>
-        <w:rPr>
-          <w:b w:val="0"/>
-          <w:i w:val="0"/>
-        </w:rPr>
-      </w:r>
-      <w:r>
-        <w:rPr>
-          <w:rFonts w:ascii="Times New Roman" w:hAnsi="Times New Roman" w:eastAsia="Times New Roman"/>
-          <w:b/>
+          <w:rFonts w:ascii="Times New Roman" w:hAnsi="Times New Roman" w:eastAsia="Times New Roman"/>
+          <w:b w:val="0"/>
+          <w:i w:val="0"/>
+          <w:sz w:val="24"/>
+        </w:rPr>
+      </w:r>
+      <w:r>
+        <w:rPr>
+          <w:rFonts w:ascii="Times New Roman" w:hAnsi="Times New Roman" w:eastAsia="Times New Roman"/>
+          <w:b w:val="0"/>
+          <w:i w:val="0"/>
+          <w:sz w:val="24"/>
+        </w:rPr>
+      </w:r>
+      <w:r>
+        <w:rPr>
+          <w:rFonts w:ascii="Times New Roman" w:hAnsi="Times New Roman" w:eastAsia="Times New Roman"/>
+          <w:b w:val="0"/>
           <w:i/>
           <w:sz w:val="24"/>
         </w:rPr>
@@ -8790,7 +9204,7 @@
       <w:r>
         <w:rPr>
           <w:rFonts w:ascii="Times New Roman" w:hAnsi="Times New Roman" w:eastAsia="Times New Roman"/>
-          <w:b/>
+          <w:b w:val="0"/>
           <w:i w:val="0"/>
           <w:sz w:val="24"/>
         </w:rPr>
@@ -8803,7 +9217,6 @@
             <w:u w:val="single"/>
             <w:rFonts w:ascii="Times New Roman" w:hAnsi="Times New Roman"/>
             <w:sz w:val="24"/>
-            <w:b/>
           </w:rPr>
           <w:t xml:space="preserve">https://doi.org/10.1177/1050651908320362</w:t>
         </w:r>
@@ -8813,46 +9226,153 @@
       <w:pPr>
         <w:spacing w:line="480" w:lineRule="auto"/>
         <w:ind w:left="630" w:hanging="630"/>
-        <w:rPr>
-          <w:color w:val="000000" w:themeColor="text1"/>
-        </w:rPr>
-      </w:pPr>
-      <w:r>
-        <w:rPr>
-          <w:rFonts w:ascii="Times New Roman" w:hAnsi="Times New Roman" w:eastAsia="Times New Roman"/>
-          <w:b w:val="0"/>
-          <w:i w:val="0"/>
-          <w:color w:val="000000" w:themeColor="text1"/>
-          <w:sz w:val="24"/>
-        </w:rPr>
-        <w:t xml:space="preserve">Korstjens, I., &amp; Moser, A. (2018). Series: Practical guidance to qualitative research. Part 4: Trustworthiness and publishing. </w:t>
-      </w:r>
-      <w:r>
-        <w:rPr>
-          <w:b w:val="0"/>
-          <w:i w:val="0"/>
-          <w:color w:val="000000" w:themeColor="text1"/>
-        </w:rPr>
-      </w:r>
-      <w:r>
-        <w:rPr>
-          <w:rFonts w:ascii="Times New Roman" w:hAnsi="Times New Roman" w:eastAsia="Times New Roman"/>
-          <w:b w:val="0"/>
-          <w:i/>
-          <w:sz w:val="24"/>
-        </w:rPr>
-        <w:t>European Journal of General Practice, 24</w:t>
-      </w:r>
-      <w:r>
-        <w:rPr>
-          <w:rFonts w:ascii="Times New Roman" w:hAnsi="Times New Roman" w:eastAsia="Times New Roman"/>
-          <w:b w:val="0"/>
-          <w:i w:val="0"/>
-          <w:sz w:val="24"/>
-        </w:rPr>
-        <w:t xml:space="preserve">(1), 120–124. </w:t>
-      </w:r>
-      <w:hyperlink r:id="rId89">
+      </w:pPr>
+      <w:r>
+        <w:rPr>
+          <w:rFonts w:ascii="Times New Roman" w:hAnsi="Times New Roman" w:eastAsia="Times New Roman"/>
+          <w:b/>
+          <w:i w:val="0"/>
+          <w:sz w:val="24"/>
+          <w:highlight w:val="cyan"/>
+        </w:rPr>
+        <w:t xml:space="preserve">Kvale, S., &amp; Brinkmann, S. (2015). </w:t>
+      </w:r>
+      <w:r>
+        <w:rPr>
+          <w:b w:val="0"/>
+          <w:i w:val="0"/>
+        </w:rPr>
+      </w:r>
+      <w:r>
+        <w:rPr>
+          <w:rStyle w:val="Emphasis"/>
+          <w:b w:val="0"/>
+          <w:i w:val="0"/>
+        </w:rPr>
+      </w:r>
+      <w:r>
+        <w:rPr>
+          <w:b w:val="0"/>
+          <w:i w:val="0"/>
+        </w:rPr>
+      </w:r>
+      <w:r>
+        <w:rPr>
+          <w:rFonts w:ascii="Times New Roman" w:hAnsi="Times New Roman" w:eastAsia="Times New Roman"/>
+          <w:b w:val="0"/>
+          <w:i w:val="0"/>
+          <w:sz w:val="24"/>
+        </w:rPr>
+      </w:r>
+      <w:r>
+        <w:rPr>
+          <w:rFonts w:ascii="Times New Roman" w:hAnsi="Times New Roman" w:eastAsia="Times New Roman"/>
+          <w:b w:val="0"/>
+          <w:i w:val="0"/>
+          <w:sz w:val="24"/>
+        </w:rPr>
+      </w:r>
+      <w:r>
+        <w:rPr>
+          <w:rFonts w:ascii="Times New Roman" w:hAnsi="Times New Roman" w:eastAsia="Times New Roman"/>
+          <w:b/>
+          <w:i/>
+          <w:sz w:val="24"/>
+        </w:rPr>
+        <w:t>InterViews: Learning the craft of qualitative research interviewing</w:t>
+      </w:r>
+      <w:r>
+        <w:rPr>
+          <w:rFonts w:ascii="Times New Roman" w:hAnsi="Times New Roman" w:eastAsia="Times New Roman"/>
+          <w:b/>
+          <w:i w:val="0"/>
+          <w:sz w:val="24"/>
+        </w:rPr>
+        <w:t xml:space="preserve"> (3rd ed.). SAGE.</w:t>
+      </w:r>
+    </w:p>
+    <w:p>
+      <w:pPr>
+        <w:spacing w:line="480" w:lineRule="auto"/>
+        <w:ind w:left="630" w:hanging="630"/>
+      </w:pPr>
+      <w:r>
+        <w:rPr>
+          <w:rFonts w:ascii="Times New Roman" w:hAnsi="Times New Roman" w:eastAsia="Times New Roman"/>
+          <w:b w:val="0"/>
+          <w:i w:val="0"/>
+          <w:sz w:val="24"/>
+          <w:highlight w:val="yellow"/>
+        </w:rPr>
+        <w:t xml:space="preserve">Lester, J. N., Cho, Y., &amp; Lochmiller, C. R. (2020). Learning to do qualitative data analysis: A starting point. </w:t>
+      </w:r>
+      <w:r>
+        <w:rPr>
+          <w:b w:val="0"/>
+          <w:i w:val="0"/>
+        </w:rPr>
+      </w:r>
+      <w:r>
+        <w:rPr>
+          <w:b w:val="0"/>
+          <w:i w:val="0"/>
+          <w:iCs/>
+        </w:rPr>
+      </w:r>
+      <w:r>
+        <w:rPr>
+          <w:b w:val="0"/>
+          <w:i w:val="0"/>
+        </w:rPr>
+      </w:r>
+      <w:r>
+        <w:rPr>
+          <w:b w:val="0"/>
+          <w:i w:val="0"/>
+          <w:iCs/>
+        </w:rPr>
+      </w:r>
+      <w:r>
+        <w:rPr>
+          <w:b w:val="0"/>
+          <w:i w:val="0"/>
+        </w:rPr>
+      </w:r>
+      <w:r>
+        <w:rPr>
+          <w:rFonts w:ascii="Times New Roman" w:hAnsi="Times New Roman" w:eastAsia="Times New Roman"/>
+          <w:b w:val="0"/>
+          <w:i w:val="0"/>
+          <w:sz w:val="24"/>
+        </w:rPr>
+      </w:r>
+      <w:r>
+        <w:rPr>
+          <w:rFonts w:ascii="Times New Roman" w:hAnsi="Times New Roman" w:eastAsia="Times New Roman"/>
+          <w:b w:val="0"/>
+          <w:i w:val="0"/>
+          <w:sz w:val="24"/>
+        </w:rPr>
+      </w:r>
+      <w:r>
+        <w:rPr>
+          <w:rFonts w:ascii="Times New Roman" w:hAnsi="Times New Roman" w:eastAsia="Times New Roman"/>
+          <w:b w:val="0"/>
+          <w:i/>
+          <w:sz w:val="24"/>
+        </w:rPr>
+        <w:t>Human Resource Development Review, 19</w:t>
+      </w:r>
+      <w:r>
+        <w:rPr>
+          <w:rFonts w:ascii="Times New Roman" w:hAnsi="Times New Roman" w:eastAsia="Times New Roman"/>
+          <w:b w:val="0"/>
+          <w:i w:val="0"/>
+          <w:sz w:val="24"/>
+        </w:rPr>
+        <w:t xml:space="preserve">(1), 94–106. </w:t>
+      </w:r>
+      <w:hyperlink r:id="rId90">
         <w:r>
           <w:rPr>
             <w:color w:val="0563C1"/>
@@ -8860,112 +9380,6 @@
             <w:rFonts w:ascii="Times New Roman" w:hAnsi="Times New Roman"/>
             <w:sz w:val="24"/>
           </w:rPr>
-          <w:t xml:space="preserve">https://doi.org/10.1080/13814788.2017.1375092</w:t>
-        </w:r>
-      </w:hyperlink>
-    </w:p>
-    <w:p>
-      <w:pPr>
-        <w:spacing w:line="480" w:lineRule="auto"/>
-        <w:ind w:left="630" w:hanging="630"/>
-      </w:pPr>
-      <w:r>
-        <w:rPr>
-          <w:rFonts w:ascii="Times New Roman" w:hAnsi="Times New Roman" w:eastAsia="Times New Roman"/>
-          <w:b w:val="0"/>
-          <w:i w:val="0"/>
-          <w:sz w:val="24"/>
-          <w:highlight w:val="yellow"/>
-        </w:rPr>
-        <w:t xml:space="preserve">Kvale, S., &amp; Brinkmann, S. (2015). </w:t>
-      </w:r>
-      <w:r>
-        <w:rPr>
-          <w:b w:val="0"/>
-          <w:i w:val="0"/>
-        </w:rPr>
-      </w:r>
-      <w:r>
-        <w:rPr>
-          <w:b w:val="0"/>
-          <w:i w:val="0"/>
-        </w:rPr>
-      </w:r>
-      <w:r>
-        <w:rPr>
-          <w:b w:val="0"/>
-          <w:i w:val="0"/>
-        </w:rPr>
-      </w:r>
-      <w:r>
-        <w:rPr>
-          <w:rFonts w:ascii="Times New Roman" w:hAnsi="Times New Roman" w:eastAsia="Times New Roman"/>
-          <w:b w:val="0"/>
-          <w:i/>
-          <w:sz w:val="24"/>
-        </w:rPr>
-        <w:t>InterViews: Learning the craft of qualitative research interviewing</w:t>
-      </w:r>
-      <w:r>
-        <w:rPr>
-          <w:rFonts w:ascii="Times New Roman" w:hAnsi="Times New Roman" w:eastAsia="Times New Roman"/>
-          <w:b w:val="0"/>
-          <w:i w:val="0"/>
-          <w:sz w:val="24"/>
-        </w:rPr>
-        <w:t xml:space="preserve"> (3rd ed.). SAGE.</w:t>
-      </w:r>
-    </w:p>
-    <w:p>
-      <w:pPr>
-        <w:spacing w:line="480" w:lineRule="auto"/>
-        <w:ind w:left="630" w:hanging="630"/>
-      </w:pPr>
-      <w:r>
-        <w:rPr>
-          <w:rFonts w:ascii="Times New Roman" w:hAnsi="Times New Roman" w:eastAsia="Times New Roman"/>
-          <w:b/>
-          <w:i w:val="0"/>
-          <w:color w:val="000000" w:themeColor="text1"/>
-          <w:sz w:val="24"/>
-          <w:highlight w:val="cyan"/>
-        </w:rPr>
-        <w:t xml:space="preserve">Lester, J. N., Cho, Y., &amp; Lochmiller, C. R. (2020). Learning to do qualitative data analysis: A starting point. </w:t>
-      </w:r>
-      <w:r>
-        <w:rPr>
-          <w:b w:val="0"/>
-          <w:i w:val="0"/>
-          <w:color w:val="000000" w:themeColor="text1"/>
-        </w:rPr>
-      </w:r>
-      <w:r>
-        <w:rPr>
-          <w:rFonts w:ascii="Times New Roman" w:hAnsi="Times New Roman" w:eastAsia="Times New Roman"/>
-          <w:b/>
-          <w:i/>
-          <w:sz w:val="24"/>
-        </w:rPr>
-        <w:t>Human Resource Development Review, 19</w:t>
-      </w:r>
-      <w:r>
-        <w:rPr>
-          <w:rFonts w:ascii="Times New Roman" w:hAnsi="Times New Roman" w:eastAsia="Times New Roman"/>
-          <w:b/>
-          <w:i w:val="0"/>
-          <w:sz w:val="24"/>
-        </w:rPr>
-        <w:t xml:space="preserve">(1), 94–106. </w:t>
-      </w:r>
-      <w:hyperlink r:id="rId90">
-        <w:r>
-          <w:rPr>
-            <w:color w:val="0563C1"/>
-            <w:u w:val="single"/>
-            <w:rFonts w:ascii="Times New Roman" w:hAnsi="Times New Roman"/>
-            <w:sz w:val="24"/>
-            <w:b/>
-          </w:rPr>
           <w:t xml:space="preserve">https://doi.org/10.1177/1534484320903890</w:t>
         </w:r>
       </w:hyperlink>
@@ -8975,21 +9389,41 @@
         <w:spacing w:line="480" w:lineRule="auto"/>
         <w:ind w:left="630" w:hanging="630"/>
         <w:rPr>
-          <w:b/>
-          <w:bCs/>
-          <w:color w:val="000000" w:themeColor="text1"/>
-        </w:rPr>
-      </w:pPr>
-      <w:r>
-        <w:rPr>
-          <w:rFonts w:ascii="Times New Roman" w:hAnsi="Times New Roman" w:eastAsia="Times New Roman"/>
-          <w:b w:val="0"/>
-          <w:bCs/>
-          <w:i w:val="0"/>
-          <w:sz w:val="24"/>
-          <w:highlight w:val="yellow"/>
+          <w:color w:val="000000" w:themeColor="text1"/>
+        </w:rPr>
+      </w:pPr>
+      <w:r>
+        <w:rPr>
+          <w:rFonts w:ascii="Times New Roman" w:hAnsi="Times New Roman" w:eastAsia="Times New Roman"/>
+          <w:b w:val="0"/>
+          <w:i w:val="0"/>
+          <w:color w:val="000000" w:themeColor="text1"/>
+          <w:sz w:val="24"/>
         </w:rPr>
         <w:t xml:space="preserve">Lincoln, Y. S., &amp; Guba, E. G. (1985). </w:t>
+      </w:r>
+      <w:r>
+        <w:rPr>
+          <w:b w:val="0"/>
+          <w:i w:val="0"/>
+          <w:color w:val="000000" w:themeColor="text1"/>
+        </w:rPr>
+      </w:r>
+      <w:r>
+        <w:rPr>
+          <w:rFonts w:ascii="Times New Roman" w:hAnsi="Times New Roman" w:eastAsia="Times New Roman"/>
+          <w:b w:val="0"/>
+          <w:i w:val="0"/>
+          <w:sz w:val="24"/>
+        </w:rPr>
+      </w:r>
+      <w:r>
+        <w:rPr>
+          <w:rFonts w:ascii="Times New Roman" w:hAnsi="Times New Roman" w:eastAsia="Times New Roman"/>
+          <w:b w:val="0"/>
+          <w:i w:val="0"/>
+          <w:sz w:val="24"/>
+        </w:rPr>
       </w:r>
       <w:r>
         <w:rPr>
@@ -9014,19 +9448,50 @@
       <w:pPr>
         <w:spacing w:line="480" w:lineRule="auto"/>
         <w:ind w:left="630" w:hanging="630"/>
-        <w:rPr>
-          <w:color w:val="000000" w:themeColor="text1"/>
-        </w:rPr>
       </w:pPr>
       <w:r>
         <w:rPr>
           <w:rFonts w:ascii="Times New Roman" w:hAnsi="Times New Roman" w:eastAsia="Times New Roman"/>
           <w:b/>
           <w:i w:val="0"/>
-          <w:color w:val="000000" w:themeColor="text1"/>
-          <w:sz w:val="24"/>
+          <w:sz w:val="24"/>
+          <w:highlight w:val="yellow"/>
         </w:rPr>
         <w:t xml:space="preserve">Liu, W., Liu, R., Chen, H., &amp; Mboga, J. (2020). Perspectives on disruptive technology and innovation. </w:t>
+      </w:r>
+      <w:r>
+        <w:rPr>
+          <w:b w:val="0"/>
+          <w:i w:val="0"/>
+        </w:rPr>
+      </w:r>
+      <w:r>
+        <w:rPr>
+          <w:b w:val="0"/>
+          <w:i w:val="0"/>
+        </w:rPr>
+      </w:r>
+      <w:r>
+        <w:rPr>
+          <w:b w:val="0"/>
+          <w:i w:val="0"/>
+        </w:rPr>
+      </w:r>
+      <w:r>
+        <w:rPr>
+          <w:rFonts w:ascii="Times New Roman" w:hAnsi="Times New Roman" w:eastAsia="Times New Roman"/>
+          <w:b w:val="0"/>
+          <w:i w:val="0"/>
+          <w:sz w:val="24"/>
+        </w:rPr>
+      </w:r>
+      <w:r>
+        <w:rPr>
+          <w:rFonts w:ascii="Times New Roman" w:hAnsi="Times New Roman" w:eastAsia="Times New Roman"/>
+          <w:b w:val="0"/>
+          <w:i w:val="0"/>
+          <w:sz w:val="24"/>
+        </w:rPr>
       </w:r>
       <w:r>
         <w:rPr>
@@ -9063,19 +9528,40 @@
       <w:pPr>
         <w:spacing w:line="480" w:lineRule="auto"/>
         <w:ind w:left="630" w:hanging="630"/>
-        <w:rPr>
-          <w:color w:val="000000" w:themeColor="text1"/>
-        </w:rPr>
-      </w:pPr>
-      <w:r>
-        <w:rPr>
-          <w:rFonts w:ascii="Times New Roman" w:hAnsi="Times New Roman" w:eastAsia="Times New Roman"/>
-          <w:b w:val="0"/>
-          <w:i w:val="0"/>
-          <w:color w:val="000000" w:themeColor="text1"/>
-          <w:sz w:val="24"/>
+      </w:pPr>
+      <w:r>
+        <w:rPr>
+          <w:rFonts w:ascii="Times New Roman" w:hAnsi="Times New Roman" w:eastAsia="Times New Roman"/>
+          <w:b w:val="0"/>
+          <w:i w:val="0"/>
+          <w:color w:val="000000" w:themeColor="text1"/>
+          <w:sz w:val="24"/>
+          <w:highlight w:val="cyan"/>
         </w:rPr>
         <w:t xml:space="preserve">Lowry, M. R., Vance, A., &amp; Vance, M. D. (2025). Inexpert supervision: Field evidence on boards’ oversight of cybersecurity. </w:t>
+      </w:r>
+      <w:r>
+        <w:rPr>
+          <w:b w:val="0"/>
+          <w:i w:val="0"/>
+          <w:color w:val="000000" w:themeColor="text1"/>
+        </w:rPr>
+      </w:r>
+      <w:r>
+        <w:rPr>
+          <w:rFonts w:ascii="Times New Roman" w:hAnsi="Times New Roman" w:eastAsia="Times New Roman"/>
+          <w:b w:val="0"/>
+          <w:i w:val="0"/>
+          <w:sz w:val="24"/>
+        </w:rPr>
+      </w:r>
+      <w:r>
+        <w:rPr>
+          <w:rFonts w:ascii="Times New Roman" w:hAnsi="Times New Roman" w:eastAsia="Times New Roman"/>
+          <w:b w:val="0"/>
+          <w:i w:val="0"/>
+          <w:sz w:val="24"/>
+        </w:rPr>
       </w:r>
       <w:r>
         <w:rPr>
@@ -9112,15 +9598,17 @@
         <w:spacing w:line="480" w:lineRule="auto"/>
         <w:ind w:left="630" w:hanging="630"/>
         <w:rPr>
-          <w:color w:val="000000" w:themeColor="text1"/>
-        </w:rPr>
-      </w:pPr>
-      <w:r>
-        <w:rPr>
-          <w:rFonts w:ascii="Times New Roman" w:hAnsi="Times New Roman" w:eastAsia="Times New Roman"/>
-          <w:b w:val="0"/>
-          <w:i w:val="0"/>
-          <w:color w:val="000000" w:themeColor="text1"/>
+          <w:b/>
+          <w:bCs/>
+          <w:color w:val="000000" w:themeColor="text1"/>
+        </w:rPr>
+      </w:pPr>
+      <w:r>
+        <w:rPr>
+          <w:rFonts w:ascii="Times New Roman" w:hAnsi="Times New Roman" w:eastAsia="Times New Roman"/>
+          <w:b w:val="0"/>
+          <w:bCs/>
+          <w:i w:val="0"/>
           <w:sz w:val="24"/>
           <w:highlight w:val="yellow"/>
         </w:rPr>
@@ -9128,9 +9616,18 @@
       </w:r>
       <w:r>
         <w:rPr>
-          <w:b w:val="0"/>
-          <w:i w:val="0"/>
-          <w:color w:val="000000" w:themeColor="text1"/>
+          <w:rFonts w:ascii="Times New Roman" w:hAnsi="Times New Roman" w:eastAsia="Times New Roman"/>
+          <w:b w:val="0"/>
+          <w:i w:val="0"/>
+          <w:sz w:val="24"/>
+        </w:rPr>
+      </w:r>
+      <w:r>
+        <w:rPr>
+          <w:rFonts w:ascii="Times New Roman" w:hAnsi="Times New Roman" w:eastAsia="Times New Roman"/>
+          <w:b w:val="0"/>
+          <w:i w:val="0"/>
+          <w:sz w:val="24"/>
         </w:rPr>
       </w:r>
       <w:r>
@@ -9185,6 +9682,22 @@
         <w:rPr>
           <w:rFonts w:ascii="Times New Roman" w:hAnsi="Times New Roman" w:eastAsia="Times New Roman"/>
           <w:b w:val="0"/>
+          <w:i w:val="0"/>
+          <w:sz w:val="24"/>
+        </w:rPr>
+      </w:r>
+      <w:r>
+        <w:rPr>
+          <w:rFonts w:ascii="Times New Roman" w:hAnsi="Times New Roman" w:eastAsia="Times New Roman"/>
+          <w:b w:val="0"/>
+          <w:i w:val="0"/>
+          <w:sz w:val="24"/>
+        </w:rPr>
+      </w:r>
+      <w:r>
+        <w:rPr>
+          <w:rFonts w:ascii="Times New Roman" w:hAnsi="Times New Roman" w:eastAsia="Times New Roman"/>
+          <w:b w:val="0"/>
           <w:i/>
           <w:sz w:val="24"/>
         </w:rPr>
@@ -9222,74 +9735,27 @@
       <w:r>
         <w:rPr>
           <w:rFonts w:ascii="Times New Roman" w:hAnsi="Times New Roman" w:eastAsia="Times New Roman"/>
-          <w:b w:val="0"/>
-          <w:i w:val="0"/>
-          <w:color w:val="000000" w:themeColor="text1"/>
-          <w:sz w:val="24"/>
-        </w:rPr>
-        <w:t xml:space="preserve">Miteu, G. D. (2024). Ethics in scientific research: A lens into its importance, history, and future. </w:t>
-      </w:r>
-      <w:r>
-        <w:rPr>
-          <w:b w:val="0"/>
-          <w:i w:val="0"/>
-          <w:color w:val="000000" w:themeColor="text1"/>
-        </w:rPr>
-      </w:r>
-      <w:r>
-        <w:rPr>
-          <w:rFonts w:ascii="Times New Roman" w:hAnsi="Times New Roman" w:eastAsia="Times New Roman"/>
-          <w:b w:val="0"/>
-          <w:i/>
-          <w:sz w:val="24"/>
-        </w:rPr>
-        <w:t>Annals of Medicine and Surgery, 86</w:t>
-      </w:r>
-      <w:r>
-        <w:rPr>
-          <w:rFonts w:ascii="Times New Roman" w:hAnsi="Times New Roman" w:eastAsia="Times New Roman"/>
-          <w:b w:val="0"/>
-          <w:i w:val="0"/>
-          <w:sz w:val="24"/>
-        </w:rPr>
-        <w:t xml:space="preserve">(5), 2395–2398. </w:t>
-      </w:r>
-      <w:hyperlink r:id="rId43">
-        <w:r>
-          <w:rPr>
-            <w:color w:val="0563C1"/>
-            <w:u w:val="single"/>
-            <w:rFonts w:ascii="Times New Roman" w:hAnsi="Times New Roman"/>
-            <w:sz w:val="24"/>
-          </w:rPr>
-          <w:t xml:space="preserve">https://doi.org/10.1097/MS9.0000000000001959</w:t>
-        </w:r>
-      </w:hyperlink>
-    </w:p>
-    <w:p>
-      <w:pPr>
-        <w:spacing w:line="480" w:lineRule="auto"/>
-        <w:ind w:left="630" w:hanging="630"/>
-        <w:rPr>
-          <w:color w:val="000000" w:themeColor="text1"/>
-        </w:rPr>
-      </w:pPr>
-      <w:r>
-        <w:rPr>
-          <w:rFonts w:ascii="Times New Roman" w:hAnsi="Times New Roman" w:eastAsia="Times New Roman"/>
           <w:b/>
           <w:i w:val="0"/>
           <w:color w:val="000000" w:themeColor="text1"/>
           <w:sz w:val="24"/>
-          <w:highlight w:val="yellow"/>
         </w:rPr>
         <w:t xml:space="preserve">Mojtahedi, M., &amp; Oo, B. L. (2017). Critical attributes for proactive engagement of stakeholders in disaster risk management. </w:t>
       </w:r>
       <w:r>
         <w:rPr>
-          <w:b w:val="0"/>
-          <w:i w:val="0"/>
-          <w:color w:val="000000" w:themeColor="text1"/>
+          <w:rFonts w:ascii="Times New Roman" w:hAnsi="Times New Roman" w:eastAsia="Times New Roman"/>
+          <w:b w:val="0"/>
+          <w:i w:val="0"/>
+          <w:sz w:val="24"/>
+        </w:rPr>
+      </w:r>
+      <w:r>
+        <w:rPr>
+          <w:rFonts w:ascii="Times New Roman" w:hAnsi="Times New Roman" w:eastAsia="Times New Roman"/>
+          <w:b w:val="0"/>
+          <w:i w:val="0"/>
+          <w:sz w:val="24"/>
         </w:rPr>
       </w:r>
       <w:r>
@@ -9327,15 +9793,18 @@
       <w:pPr>
         <w:spacing w:line="480" w:lineRule="auto"/>
         <w:ind w:left="630" w:hanging="630"/>
-      </w:pPr>
-      <w:r>
-        <w:rPr>
-          <w:rFonts w:ascii="Times New Roman" w:hAnsi="Times New Roman" w:eastAsia="Times New Roman"/>
-          <w:b w:val="0"/>
-          <w:i w:val="0"/>
-          <w:color w:val="000000" w:themeColor="text1"/>
-          <w:sz w:val="24"/>
-          <w:highlight w:val="cyan"/>
+        <w:rPr>
+          <w:color w:val="000000" w:themeColor="text1"/>
+        </w:rPr>
+      </w:pPr>
+      <w:r>
+        <w:rPr>
+          <w:rFonts w:ascii="Times New Roman" w:hAnsi="Times New Roman" w:eastAsia="Times New Roman"/>
+          <w:b/>
+          <w:i w:val="0"/>
+          <w:color w:val="000000" w:themeColor="text1"/>
+          <w:sz w:val="24"/>
+          <w:highlight w:val="yellow"/>
         </w:rPr>
         <w:t xml:space="preserve">Molete, O. B., Mokhele, S. E., Ntombela, S. D., &amp; Thango, B. A. (2025). The impact of IT strategic planning process on SME performance: A systematic review. </w:t>
       </w:r>
@@ -9350,6 +9819,22 @@
         <w:rPr>
           <w:rFonts w:ascii="Times New Roman" w:hAnsi="Times New Roman" w:eastAsia="Times New Roman"/>
           <w:b w:val="0"/>
+          <w:i w:val="0"/>
+          <w:sz w:val="24"/>
+        </w:rPr>
+      </w:r>
+      <w:r>
+        <w:rPr>
+          <w:rFonts w:ascii="Times New Roman" w:hAnsi="Times New Roman" w:eastAsia="Times New Roman"/>
+          <w:b w:val="0"/>
+          <w:i w:val="0"/>
+          <w:sz w:val="24"/>
+        </w:rPr>
+      </w:r>
+      <w:r>
+        <w:rPr>
+          <w:rFonts w:ascii="Times New Roman" w:hAnsi="Times New Roman" w:eastAsia="Times New Roman"/>
+          <w:b/>
           <w:i/>
           <w:sz w:val="24"/>
         </w:rPr>
@@ -9358,131 +9843,13 @@
       <w:r>
         <w:rPr>
           <w:rFonts w:ascii="Times New Roman" w:hAnsi="Times New Roman" w:eastAsia="Times New Roman"/>
-          <w:b w:val="0"/>
+          <w:b/>
           <w:i w:val="0"/>
           <w:sz w:val="24"/>
         </w:rPr>
         <w:t xml:space="preserve">(1), Article 2. </w:t>
       </w:r>
       <w:hyperlink r:id="rId44">
-        <w:r>
-          <w:rPr>
-            <w:color w:val="0563C1"/>
-            <w:u w:val="single"/>
-            <w:rFonts w:ascii="Times New Roman" w:hAnsi="Times New Roman"/>
-            <w:sz w:val="24"/>
-          </w:rPr>
-          <w:t xml:space="preserve">https://doi.org/10.3390/businesses5010002</w:t>
-        </w:r>
-      </w:hyperlink>
-    </w:p>
-    <w:p>
-      <w:pPr>
-        <w:spacing w:line="480" w:lineRule="auto"/>
-        <w:ind w:left="630" w:hanging="630"/>
-      </w:pPr>
-      <w:r>
-        <w:rPr>
-          <w:rFonts w:ascii="Times New Roman" w:hAnsi="Times New Roman" w:eastAsia="Times New Roman"/>
-          <w:b w:val="0"/>
-          <w:i w:val="0"/>
-          <w:sz w:val="24"/>
-          <w:highlight w:val="yellow"/>
-        </w:rPr>
-        <w:t xml:space="preserve">Naeem, M., Ozuem, W., Howell, K., &amp; Ranfagni, S. (2024). Demystification and actualisation of data saturation in qualitative research through thematic analysis. </w:t>
-      </w:r>
-      <w:r>
-        <w:rPr>
-          <w:b w:val="0"/>
-          <w:i w:val="0"/>
-        </w:rPr>
-      </w:r>
-      <w:r>
-        <w:rPr>
-          <w:b w:val="0"/>
-          <w:i w:val="0"/>
-          <w:iCs/>
-        </w:rPr>
-      </w:r>
-      <w:r>
-        <w:rPr>
-          <w:b w:val="0"/>
-          <w:i w:val="0"/>
-        </w:rPr>
-      </w:r>
-      <w:r>
-        <w:rPr>
-          <w:b w:val="0"/>
-          <w:i w:val="0"/>
-        </w:rPr>
-      </w:r>
-      <w:r>
-        <w:rPr>
-          <w:rFonts w:ascii="Times New Roman" w:hAnsi="Times New Roman" w:eastAsia="Times New Roman"/>
-          <w:b w:val="0"/>
-          <w:i/>
-          <w:sz w:val="24"/>
-        </w:rPr>
-        <w:t>International Journal of Qualitative Methods, 23</w:t>
-      </w:r>
-      <w:r>
-        <w:rPr>
-          <w:rFonts w:ascii="Times New Roman" w:hAnsi="Times New Roman" w:eastAsia="Times New Roman"/>
-          <w:b w:val="0"/>
-          <w:i w:val="0"/>
-          <w:sz w:val="24"/>
-        </w:rPr>
-        <w:t xml:space="preserve">, 1–17. </w:t>
-      </w:r>
-      <w:hyperlink r:id="rId94">
-        <w:r>
-          <w:rPr>
-            <w:color w:val="0563C1"/>
-            <w:u w:val="single"/>
-            <w:rFonts w:ascii="Times New Roman" w:hAnsi="Times New Roman"/>
-            <w:sz w:val="24"/>
-          </w:rPr>
-          <w:t xml:space="preserve">https://doi.org/10.1177/16094069241229777</w:t>
-        </w:r>
-      </w:hyperlink>
-    </w:p>
-    <w:p>
-      <w:pPr>
-        <w:spacing w:line="480" w:lineRule="auto"/>
-        <w:ind w:left="630" w:hanging="630"/>
-        <w:rPr>
-          <w:color w:val="000000" w:themeColor="text1"/>
-        </w:rPr>
-      </w:pPr>
-      <w:r>
-        <w:rPr>
-          <w:rFonts w:ascii="Times New Roman" w:hAnsi="Times New Roman" w:eastAsia="Times New Roman"/>
-          <w:b/>
-          <w:i w:val="0"/>
-          <w:color w:val="000000" w:themeColor="text1"/>
-          <w:sz w:val="24"/>
-        </w:rPr>
-        <w:t xml:space="preserve">Narayanan, A., Finucane, M., Acosta, J., &amp; Wicker, A. (2020). From awareness to action: Accounting for infrastructure interdependencies in disaster response and recovery planning. </w:t>
-      </w:r>
-      <w:r>
-        <w:rPr>
-          <w:rFonts w:ascii="Times New Roman" w:hAnsi="Times New Roman" w:eastAsia="Times New Roman"/>
-          <w:b/>
-          <w:i/>
-          <w:sz w:val="24"/>
-        </w:rPr>
-        <w:t>GeoHealth, 4</w:t>
-      </w:r>
-      <w:r>
-        <w:rPr>
-          <w:rFonts w:ascii="Times New Roman" w:hAnsi="Times New Roman" w:eastAsia="Times New Roman"/>
-          <w:b/>
-          <w:i w:val="0"/>
-          <w:sz w:val="24"/>
-        </w:rPr>
-        <w:t xml:space="preserve">(7), Article e2020GH000251. </w:t>
-      </w:r>
-      <w:hyperlink r:id="rId47">
         <w:r>
           <w:rPr>
             <w:color w:val="0563C1"/>
@@ -9491,6 +9858,141 @@
             <w:sz w:val="24"/>
             <w:b/>
           </w:rPr>
+          <w:t xml:space="preserve">https://doi.org/10.3390/businesses5010002</w:t>
+        </w:r>
+      </w:hyperlink>
+    </w:p>
+    <w:p>
+      <w:pPr>
+        <w:spacing w:line="480" w:lineRule="auto"/>
+        <w:ind w:left="630" w:hanging="630"/>
+        <w:rPr>
+          <w:color w:val="000000" w:themeColor="text1"/>
+        </w:rPr>
+      </w:pPr>
+      <w:r>
+        <w:rPr>
+          <w:rFonts w:ascii="Times New Roman" w:hAnsi="Times New Roman" w:eastAsia="Times New Roman"/>
+          <w:b w:val="0"/>
+          <w:i w:val="0"/>
+          <w:color w:val="000000" w:themeColor="text1"/>
+          <w:sz w:val="24"/>
+        </w:rPr>
+        <w:t xml:space="preserve">Morse, J. M. (2015). Critical analysis of strategies for determining rigor in qualitative inquiry. </w:t>
+      </w:r>
+      <w:r>
+        <w:rPr>
+          <w:rFonts w:ascii="Times New Roman" w:hAnsi="Times New Roman" w:eastAsia="Times New Roman"/>
+          <w:b w:val="0"/>
+          <w:i w:val="0"/>
+          <w:sz w:val="24"/>
+        </w:rPr>
+      </w:r>
+      <w:r>
+        <w:rPr>
+          <w:rFonts w:ascii="Times New Roman" w:hAnsi="Times New Roman" w:eastAsia="Times New Roman"/>
+          <w:b w:val="0"/>
+          <w:i w:val="0"/>
+          <w:sz w:val="24"/>
+        </w:rPr>
+      </w:r>
+      <w:r>
+        <w:rPr>
+          <w:rFonts w:ascii="Times New Roman" w:hAnsi="Times New Roman" w:eastAsia="Times New Roman"/>
+          <w:b w:val="0"/>
+          <w:i/>
+          <w:sz w:val="24"/>
+        </w:rPr>
+        <w:t>Qualitative Health Research, 25</w:t>
+      </w:r>
+      <w:r>
+        <w:rPr>
+          <w:rFonts w:ascii="Times New Roman" w:hAnsi="Times New Roman" w:eastAsia="Times New Roman"/>
+          <w:b w:val="0"/>
+          <w:i w:val="0"/>
+          <w:sz w:val="24"/>
+        </w:rPr>
+        <w:t xml:space="preserve">(9), 1212–1222. </w:t>
+      </w:r>
+      <w:hyperlink r:id="rId22">
+        <w:r>
+          <w:rPr>
+            <w:color w:val="0563C1"/>
+            <w:u w:val="single"/>
+            <w:rFonts w:ascii="Times New Roman" w:hAnsi="Times New Roman"/>
+            <w:sz w:val="24"/>
+          </w:rPr>
+          <w:t xml:space="preserve">https://doi.org/10.1177/1049732315588501</w:t>
+        </w:r>
+      </w:hyperlink>
+    </w:p>
+    <w:p>
+      <w:pPr>
+        <w:spacing w:line="480" w:lineRule="auto"/>
+        <w:ind w:left="630" w:hanging="630"/>
+        <w:rPr>
+          <w:color w:val="000000" w:themeColor="text1"/>
+        </w:rPr>
+      </w:pPr>
+      <w:r>
+        <w:rPr>
+          <w:rFonts w:ascii="Times New Roman" w:hAnsi="Times New Roman" w:eastAsia="Times New Roman"/>
+          <w:b w:val="0"/>
+          <w:i w:val="0"/>
+          <w:color w:val="000000" w:themeColor="text1"/>
+          <w:sz w:val="24"/>
+        </w:rPr>
+        <w:t xml:space="preserve">Narayanan, A., Finucane, M., Acosta, J., &amp; Wicker, A. (2020). From awareness to action: Accounting for infrastructure interdependencies in disaster response and recovery planning. </w:t>
+      </w:r>
+      <w:r>
+        <w:rPr>
+          <w:b w:val="0"/>
+          <w:i w:val="0"/>
+          <w:color w:val="000000" w:themeColor="text1"/>
+        </w:rPr>
+      </w:r>
+      <w:r>
+        <w:rPr>
+          <w:rFonts w:ascii="Times New Roman" w:hAnsi="Times New Roman" w:eastAsia="Times New Roman"/>
+          <w:b w:val="0"/>
+          <w:i w:val="0"/>
+          <w:sz w:val="24"/>
+        </w:rPr>
+      </w:r>
+      <w:r>
+        <w:rPr>
+          <w:rFonts w:ascii="Times New Roman" w:hAnsi="Times New Roman" w:eastAsia="Times New Roman"/>
+          <w:b w:val="0"/>
+          <w:i w:val="0"/>
+          <w:sz w:val="24"/>
+        </w:rPr>
+      </w:r>
+      <w:r>
+        <w:rPr>
+          <w:rFonts w:ascii="Times New Roman" w:hAnsi="Times New Roman" w:eastAsia="Times New Roman"/>
+          <w:b w:val="0"/>
+          <w:i/>
+          <w:sz w:val="24"/>
+        </w:rPr>
+        <w:t>GeoHealth, 4</w:t>
+      </w:r>
+      <w:r>
+        <w:rPr>
+          <w:rFonts w:ascii="Times New Roman" w:hAnsi="Times New Roman" w:eastAsia="Times New Roman"/>
+          <w:b w:val="0"/>
+          <w:i w:val="0"/>
+          <w:sz w:val="24"/>
+        </w:rPr>
+        <w:t xml:space="preserve">(7), Article e2020GH000251. </w:t>
+      </w:r>
+      <w:hyperlink r:id="rId47">
+        <w:r>
+          <w:rPr>
+            <w:color w:val="0563C1"/>
+            <w:u w:val="single"/>
+            <w:rFonts w:ascii="Times New Roman" w:hAnsi="Times New Roman"/>
+            <w:sz w:val="24"/>
+          </w:rPr>
           <w:t xml:space="preserve">https://doi.org/10.1029/2020GH000251</w:t>
         </w:r>
       </w:hyperlink>
@@ -9510,6 +10012,7 @@
           <w:i w:val="0"/>
           <w:color w:val="000000" w:themeColor="text1"/>
           <w:sz w:val="24"/>
+          <w:highlight w:val="yellow"/>
         </w:rPr>
         <w:t xml:space="preserve">National Commission for the Protection of Human Subjects of Biomedical and Behavioral Research. (1979). </w:t>
       </w:r>
@@ -9518,6 +10021,22 @@
           <w:b w:val="0"/>
           <w:i w:val="0"/>
           <w:color w:val="000000" w:themeColor="text1"/>
+        </w:rPr>
+      </w:r>
+      <w:r>
+        <w:rPr>
+          <w:rFonts w:ascii="Times New Roman" w:hAnsi="Times New Roman" w:eastAsia="Times New Roman"/>
+          <w:b w:val="0"/>
+          <w:i w:val="0"/>
+          <w:sz w:val="24"/>
+        </w:rPr>
+      </w:r>
+      <w:r>
+        <w:rPr>
+          <w:rFonts w:ascii="Times New Roman" w:hAnsi="Times New Roman" w:eastAsia="Times New Roman"/>
+          <w:b w:val="0"/>
+          <w:i w:val="0"/>
+          <w:sz w:val="24"/>
         </w:rPr>
       </w:r>
       <w:r>
@@ -9558,10 +10077,11 @@
       <w:r>
         <w:rPr>
           <w:rFonts w:ascii="Times New Roman" w:hAnsi="Times New Roman" w:eastAsia="Times New Roman"/>
-          <w:b w:val="0"/>
-          <w:i w:val="0"/>
-          <w:sz w:val="24"/>
-          <w:highlight w:val="yellow"/>
+          <w:b/>
+          <w:i w:val="0"/>
+          <w:color w:val="000000" w:themeColor="text1"/>
+          <w:sz w:val="24"/>
+          <w:highlight w:val="cyan"/>
         </w:rPr>
         <w:t xml:space="preserve">Nowell, L. S., Norris, J. M., White, D. E., &amp; Moules, N. J. (2017). Thematic analysis: Striving to meet the trustworthiness criteria. </w:t>
       </w:r>
@@ -9569,44 +10089,29 @@
         <w:rPr>
           <w:b w:val="0"/>
           <w:i w:val="0"/>
-        </w:rPr>
-      </w:r>
-      <w:r>
-        <w:rPr>
-          <w:b w:val="0"/>
-          <w:i w:val="0"/>
-        </w:rPr>
-      </w:r>
-      <w:r>
-        <w:rPr>
-          <w:b w:val="0"/>
-          <w:i w:val="0"/>
-          <w:iCs/>
-        </w:rPr>
-      </w:r>
-      <w:r>
-        <w:rPr>
-          <w:b w:val="0"/>
-          <w:i w:val="0"/>
-        </w:rPr>
-      </w:r>
-      <w:r>
-        <w:rPr>
-          <w:b w:val="0"/>
-          <w:i w:val="0"/>
-          <w:iCs/>
-        </w:rPr>
-      </w:r>
-      <w:r>
-        <w:rPr>
-          <w:b w:val="0"/>
-          <w:i w:val="0"/>
-        </w:rPr>
-      </w:r>
-      <w:r>
-        <w:rPr>
-          <w:rFonts w:ascii="Times New Roman" w:hAnsi="Times New Roman" w:eastAsia="Times New Roman"/>
-          <w:b w:val="0"/>
+          <w:color w:val="000000" w:themeColor="text1"/>
+        </w:rPr>
+      </w:r>
+      <w:r>
+        <w:rPr>
+          <w:rFonts w:ascii="Times New Roman" w:hAnsi="Times New Roman" w:eastAsia="Times New Roman"/>
+          <w:b w:val="0"/>
+          <w:i w:val="0"/>
+          <w:sz w:val="24"/>
+        </w:rPr>
+      </w:r>
+      <w:r>
+        <w:rPr>
+          <w:rFonts w:ascii="Times New Roman" w:hAnsi="Times New Roman" w:eastAsia="Times New Roman"/>
+          <w:b w:val="0"/>
+          <w:i w:val="0"/>
+          <w:sz w:val="24"/>
+        </w:rPr>
+      </w:r>
+      <w:r>
+        <w:rPr>
+          <w:rFonts w:ascii="Times New Roman" w:hAnsi="Times New Roman" w:eastAsia="Times New Roman"/>
+          <w:b/>
           <w:i/>
           <w:sz w:val="24"/>
         </w:rPr>
@@ -9615,93 +10120,13 @@
       <w:r>
         <w:rPr>
           <w:rFonts w:ascii="Times New Roman" w:hAnsi="Times New Roman" w:eastAsia="Times New Roman"/>
-          <w:b w:val="0"/>
+          <w:b/>
           <w:i w:val="0"/>
           <w:sz w:val="24"/>
         </w:rPr>
         <w:t xml:space="preserve">(1), 1–13. </w:t>
       </w:r>
       <w:hyperlink r:id="rId96">
-        <w:r>
-          <w:rPr>
-            <w:color w:val="0563C1"/>
-            <w:u w:val="single"/>
-            <w:rFonts w:ascii="Times New Roman" w:hAnsi="Times New Roman"/>
-            <w:sz w:val="24"/>
-          </w:rPr>
-          <w:t xml:space="preserve">https://doi.org/10.1177/1609406917733847</w:t>
-        </w:r>
-      </w:hyperlink>
-    </w:p>
-    <w:p>
-      <w:pPr>
-        <w:spacing w:line="480" w:lineRule="auto"/>
-        <w:ind w:left="630" w:hanging="630"/>
-        <w:rPr>
-          <w:color w:val="000000" w:themeColor="text1"/>
-        </w:rPr>
-      </w:pPr>
-      <w:r>
-        <w:rPr>
-          <w:rFonts w:ascii="Times New Roman" w:hAnsi="Times New Roman" w:eastAsia="Times New Roman"/>
-          <w:b/>
-          <w:i w:val="0"/>
-          <w:sz w:val="24"/>
-          <w:highlight w:val="yellow"/>
-        </w:rPr>
-        <w:t xml:space="preserve">Nowell, B., &amp; Albrecht, K. (2019). A reviewer’s guide to qualitative rigor. </w:t>
-      </w:r>
-      <w:r>
-        <w:rPr>
-          <w:b w:val="0"/>
-          <w:i w:val="0"/>
-        </w:rPr>
-      </w:r>
-      <w:r>
-        <w:rPr>
-          <w:b w:val="0"/>
-          <w:i w:val="0"/>
-          <w:iCs/>
-        </w:rPr>
-      </w:r>
-      <w:r>
-        <w:rPr>
-          <w:b w:val="0"/>
-          <w:i w:val="0"/>
-        </w:rPr>
-      </w:r>
-      <w:r>
-        <w:rPr>
-          <w:b w:val="0"/>
-          <w:i w:val="0"/>
-          <w:iCs/>
-        </w:rPr>
-      </w:r>
-      <w:r>
-        <w:rPr>
-          <w:b w:val="0"/>
-          <w:i w:val="0"/>
-        </w:rPr>
-      </w:r>
-      <w:r>
-        <w:rPr>
-          <w:rFonts w:ascii="Times New Roman" w:hAnsi="Times New Roman" w:eastAsia="Times New Roman"/>
-          <w:b/>
-          <w:i/>
-          <w:sz w:val="24"/>
-        </w:rPr>
-        <w:t>Journal of Public Administration Research and Theory, 29</w:t>
-      </w:r>
-      <w:r>
-        <w:rPr>
-          <w:rFonts w:ascii="Times New Roman" w:hAnsi="Times New Roman" w:eastAsia="Times New Roman"/>
-          <w:b/>
-          <w:i w:val="0"/>
-          <w:sz w:val="24"/>
-        </w:rPr>
-        <w:t xml:space="preserve">(2), 348–363. </w:t>
-      </w:r>
-      <w:hyperlink r:id="rId97">
         <w:r>
           <w:rPr>
             <w:color w:val="0563C1"/>
@@ -9710,6 +10135,92 @@
             <w:sz w:val="24"/>
             <w:b/>
           </w:rPr>
+          <w:t xml:space="preserve">https://doi.org/10.1177/1609406917733847</w:t>
+        </w:r>
+      </w:hyperlink>
+    </w:p>
+    <w:p>
+      <w:pPr>
+        <w:spacing w:line="480" w:lineRule="auto"/>
+        <w:ind w:left="630" w:hanging="630"/>
+      </w:pPr>
+      <w:r>
+        <w:rPr>
+          <w:rFonts w:ascii="Times New Roman" w:hAnsi="Times New Roman" w:eastAsia="Times New Roman"/>
+          <w:b w:val="0"/>
+          <w:i w:val="0"/>
+          <w:sz w:val="24"/>
+          <w:highlight w:val="yellow"/>
+        </w:rPr>
+        <w:t xml:space="preserve">Nowell, B., &amp; Albrecht, K. (2019). A reviewer’s guide to qualitative rigor. </w:t>
+      </w:r>
+      <w:r>
+        <w:rPr>
+          <w:b w:val="0"/>
+          <w:i w:val="0"/>
+        </w:rPr>
+      </w:r>
+      <w:r>
+        <w:rPr>
+          <w:b w:val="0"/>
+          <w:i w:val="0"/>
+          <w:iCs/>
+        </w:rPr>
+      </w:r>
+      <w:r>
+        <w:rPr>
+          <w:b w:val="0"/>
+          <w:i w:val="0"/>
+        </w:rPr>
+      </w:r>
+      <w:r>
+        <w:rPr>
+          <w:b w:val="0"/>
+          <w:i w:val="0"/>
+        </w:rPr>
+      </w:r>
+      <w:r>
+        <w:rPr>
+          <w:rFonts w:ascii="Times New Roman" w:hAnsi="Times New Roman" w:eastAsia="Times New Roman"/>
+          <w:b w:val="0"/>
+          <w:i w:val="0"/>
+          <w:sz w:val="24"/>
+        </w:rPr>
+      </w:r>
+      <w:r>
+        <w:rPr>
+          <w:rFonts w:ascii="Times New Roman" w:hAnsi="Times New Roman" w:eastAsia="Times New Roman"/>
+          <w:b w:val="0"/>
+          <w:i w:val="0"/>
+          <w:sz w:val="24"/>
+        </w:rPr>
+      </w:r>
+      <w:r>
+        <w:rPr>
+          <w:rFonts w:ascii="Times New Roman" w:hAnsi="Times New Roman" w:eastAsia="Times New Roman"/>
+          <w:b w:val="0"/>
+          <w:i/>
+          <w:sz w:val="24"/>
+        </w:rPr>
+        <w:t>Journal of Public Administration Research and Theory, 29</w:t>
+      </w:r>
+      <w:r>
+        <w:rPr>
+          <w:rFonts w:ascii="Times New Roman" w:hAnsi="Times New Roman" w:eastAsia="Times New Roman"/>
+          <w:b w:val="0"/>
+          <w:i w:val="0"/>
+          <w:sz w:val="24"/>
+        </w:rPr>
+        <w:t xml:space="preserve">(2), 348–363. </w:t>
+      </w:r>
+      <w:hyperlink r:id="rId97">
+        <w:r>
+          <w:rPr>
+            <w:color w:val="0563C1"/>
+            <w:u w:val="single"/>
+            <w:rFonts w:ascii="Times New Roman" w:hAnsi="Times New Roman"/>
+            <w:sz w:val="24"/>
+          </w:rPr>
           <w:t xml:space="preserve">https://doi.org/10.1093/jopart/muy052</w:t>
         </w:r>
       </w:hyperlink>
@@ -9734,17 +10245,18 @@
       </w:r>
       <w:r>
         <w:rPr>
-          <w:b w:val="0"/>
-          <w:i w:val="0"/>
-          <w:color w:val="000000" w:themeColor="text1"/>
-          <w:highlight w:val="cyan"/>
-        </w:rPr>
-      </w:r>
-      <w:r>
-        <w:rPr>
-          <w:b w:val="0"/>
-          <w:i w:val="0"/>
-          <w:color w:val="000000" w:themeColor="text1"/>
+          <w:rFonts w:ascii="Times New Roman" w:hAnsi="Times New Roman" w:eastAsia="Times New Roman"/>
+          <w:b w:val="0"/>
+          <w:i w:val="0"/>
+          <w:sz w:val="24"/>
+        </w:rPr>
+      </w:r>
+      <w:r>
+        <w:rPr>
+          <w:rFonts w:ascii="Times New Roman" w:hAnsi="Times New Roman" w:eastAsia="Times New Roman"/>
+          <w:b w:val="0"/>
+          <w:i w:val="0"/>
+          <w:sz w:val="24"/>
         </w:rPr>
       </w:r>
       <w:r>
@@ -9807,6 +10319,22 @@
         <w:rPr>
           <w:rFonts w:ascii="Times New Roman" w:hAnsi="Times New Roman" w:eastAsia="Times New Roman"/>
           <w:b w:val="0"/>
+          <w:i w:val="0"/>
+          <w:sz w:val="24"/>
+        </w:rPr>
+      </w:r>
+      <w:r>
+        <w:rPr>
+          <w:rFonts w:ascii="Times New Roman" w:hAnsi="Times New Roman" w:eastAsia="Times New Roman"/>
+          <w:b w:val="0"/>
+          <w:i w:val="0"/>
+          <w:sz w:val="24"/>
+        </w:rPr>
+      </w:r>
+      <w:r>
+        <w:rPr>
+          <w:rFonts w:ascii="Times New Roman" w:hAnsi="Times New Roman" w:eastAsia="Times New Roman"/>
+          <w:b w:val="0"/>
           <w:i/>
           <w:sz w:val="24"/>
         </w:rPr>
@@ -9837,26 +10365,165 @@
       <w:pPr>
         <w:spacing w:line="480" w:lineRule="auto"/>
         <w:ind w:left="630" w:hanging="630"/>
-        <w:rPr>
-          <w:color w:val="000000" w:themeColor="text1"/>
-        </w:rPr>
-      </w:pPr>
-      <w:r>
-        <w:rPr>
-          <w:rFonts w:ascii="Times New Roman" w:hAnsi="Times New Roman" w:eastAsia="Times New Roman"/>
-          <w:b w:val="0"/>
-          <w:i w:val="0"/>
-          <w:color w:val="000000" w:themeColor="text1"/>
+      </w:pPr>
+      <w:r>
+        <w:rPr>
+          <w:rFonts w:ascii="Times New Roman" w:hAnsi="Times New Roman" w:eastAsia="Times New Roman"/>
+          <w:b w:val="0"/>
+          <w:i w:val="0"/>
           <w:sz w:val="24"/>
           <w:highlight w:val="yellow"/>
         </w:rPr>
+        <w:t xml:space="preserve">Paulus, T. M. (2023). Using qualitative data analysis software to support digital research workflows. </w:t>
+      </w:r>
+      <w:r>
+        <w:rPr>
+          <w:b w:val="0"/>
+          <w:i w:val="0"/>
+        </w:rPr>
+      </w:r>
+      <w:r>
+        <w:rPr>
+          <w:b w:val="0"/>
+          <w:i w:val="0"/>
+        </w:rPr>
+      </w:r>
+      <w:r>
+        <w:rPr>
+          <w:b w:val="0"/>
+          <w:i w:val="0"/>
+          <w:iCs/>
+        </w:rPr>
+      </w:r>
+      <w:r>
+        <w:rPr>
+          <w:b w:val="0"/>
+          <w:i w:val="0"/>
+        </w:rPr>
+      </w:r>
+      <w:r>
+        <w:rPr>
+          <w:b w:val="0"/>
+          <w:i w:val="0"/>
+          <w:iCs/>
+        </w:rPr>
+      </w:r>
+      <w:r>
+        <w:rPr>
+          <w:b w:val="0"/>
+          <w:i w:val="0"/>
+        </w:rPr>
+      </w:r>
+      <w:r>
+        <w:rPr>
+          <w:rFonts w:ascii="Times New Roman" w:hAnsi="Times New Roman" w:eastAsia="Times New Roman"/>
+          <w:b w:val="0"/>
+          <w:i w:val="0"/>
+          <w:sz w:val="24"/>
+        </w:rPr>
+      </w:r>
+      <w:r>
+        <w:rPr>
+          <w:rFonts w:ascii="Times New Roman" w:hAnsi="Times New Roman" w:eastAsia="Times New Roman"/>
+          <w:b w:val="0"/>
+          <w:i w:val="0"/>
+          <w:sz w:val="24"/>
+        </w:rPr>
+      </w:r>
+      <w:r>
+        <w:rPr>
+          <w:rFonts w:ascii="Times New Roman" w:hAnsi="Times New Roman" w:eastAsia="Times New Roman"/>
+          <w:b w:val="0"/>
+          <w:i/>
+          <w:sz w:val="24"/>
+        </w:rPr>
+        <w:t>Human Resource Development Review, 22</w:t>
+      </w:r>
+      <w:r>
+        <w:rPr>
+          <w:rFonts w:ascii="Times New Roman" w:hAnsi="Times New Roman" w:eastAsia="Times New Roman"/>
+          <w:b w:val="0"/>
+          <w:i w:val="0"/>
+          <w:sz w:val="24"/>
+        </w:rPr>
+        <w:t xml:space="preserve">(1), 139–148. </w:t>
+      </w:r>
+      <w:hyperlink r:id="rId24">
+        <w:r>
+          <w:rPr>
+            <w:color w:val="0563C1"/>
+            <w:u w:val="single"/>
+            <w:rFonts w:ascii="Times New Roman" w:hAnsi="Times New Roman"/>
+            <w:sz w:val="24"/>
+          </w:rPr>
+          <w:t xml:space="preserve">https://doi.org/10.1177/15344843221138381</w:t>
+        </w:r>
+      </w:hyperlink>
+    </w:p>
+    <w:p>
+      <w:pPr>
+        <w:spacing w:line="480" w:lineRule="auto"/>
+        <w:ind w:left="630" w:hanging="630"/>
+        <w:rPr>
+          <w:color w:val="000000" w:themeColor="text1"/>
+        </w:rPr>
+      </w:pPr>
+      <w:r>
+        <w:rPr>
+          <w:rFonts w:ascii="Times New Roman" w:hAnsi="Times New Roman" w:eastAsia="Times New Roman"/>
+          <w:b w:val="0"/>
+          <w:i w:val="0"/>
+          <w:sz w:val="24"/>
+          <w:highlight w:val="yellow"/>
+        </w:rPr>
         <w:t xml:space="preserve">Percy, W. H., Kostere, K., &amp; Kostere, S. (2015). Generic qualitative research in psychology. </w:t>
       </w:r>
       <w:r>
         <w:rPr>
           <w:b w:val="0"/>
           <w:i w:val="0"/>
-          <w:color w:val="000000" w:themeColor="text1"/>
+        </w:rPr>
+      </w:r>
+      <w:r>
+        <w:rPr>
+          <w:b w:val="0"/>
+          <w:i w:val="0"/>
+          <w:iCs/>
+        </w:rPr>
+      </w:r>
+      <w:r>
+        <w:rPr>
+          <w:b w:val="0"/>
+          <w:i w:val="0"/>
+        </w:rPr>
+      </w:r>
+      <w:r>
+        <w:rPr>
+          <w:b w:val="0"/>
+          <w:i w:val="0"/>
+          <w:iCs/>
+        </w:rPr>
+      </w:r>
+      <w:r>
+        <w:rPr>
+          <w:b w:val="0"/>
+          <w:i w:val="0"/>
+        </w:rPr>
+      </w:r>
+      <w:r>
+        <w:rPr>
+          <w:rFonts w:ascii="Times New Roman" w:hAnsi="Times New Roman" w:eastAsia="Times New Roman"/>
+          <w:b w:val="0"/>
+          <w:i w:val="0"/>
+          <w:sz w:val="24"/>
+        </w:rPr>
+      </w:r>
+      <w:r>
+        <w:rPr>
+          <w:rFonts w:ascii="Times New Roman" w:hAnsi="Times New Roman" w:eastAsia="Times New Roman"/>
+          <w:b w:val="0"/>
+          <w:i w:val="0"/>
+          <w:sz w:val="24"/>
         </w:rPr>
       </w:r>
       <w:r>
@@ -9900,36 +10567,180 @@
       <w:r>
         <w:rPr>
           <w:rFonts w:ascii="Times New Roman" w:hAnsi="Times New Roman" w:eastAsia="Times New Roman"/>
-          <w:b/>
-          <w:i w:val="0"/>
-          <w:sz w:val="24"/>
+          <w:b w:val="0"/>
+          <w:i w:val="0"/>
+          <w:color w:val="000000" w:themeColor="text1"/>
+          <w:sz w:val="24"/>
+        </w:rPr>
+        <w:t xml:space="preserve">Resnik, D. B. (2018). </w:t>
+      </w:r>
+      <w:r>
+        <w:rPr>
+          <w:b w:val="0"/>
+          <w:i w:val="0"/>
+          <w:color w:val="000000" w:themeColor="text1"/>
           <w:highlight w:val="cyan"/>
         </w:rPr>
+      </w:r>
+      <w:r>
+        <w:rPr>
+          <w:b w:val="0"/>
+          <w:i w:val="0"/>
+          <w:color w:val="000000" w:themeColor="text1"/>
+        </w:rPr>
+      </w:r>
+      <w:r>
+        <w:rPr>
+          <w:rFonts w:ascii="Times New Roman" w:hAnsi="Times New Roman" w:eastAsia="Times New Roman"/>
+          <w:b w:val="0"/>
+          <w:i w:val="0"/>
+          <w:sz w:val="24"/>
+        </w:rPr>
+      </w:r>
+      <w:r>
+        <w:rPr>
+          <w:rFonts w:ascii="Times New Roman" w:hAnsi="Times New Roman" w:eastAsia="Times New Roman"/>
+          <w:b w:val="0"/>
+          <w:i w:val="0"/>
+          <w:sz w:val="24"/>
+        </w:rPr>
+      </w:r>
+      <w:r>
+        <w:rPr>
+          <w:rFonts w:ascii="Times New Roman" w:hAnsi="Times New Roman" w:eastAsia="Times New Roman"/>
+          <w:b w:val="0"/>
+          <w:i/>
+          <w:sz w:val="24"/>
+        </w:rPr>
+        <w:t>The ethics of research with human subjects: Protecting people, advancing science, promoting trust</w:t>
+      </w:r>
+      <w:r>
+        <w:rPr>
+          <w:rFonts w:ascii="Times New Roman" w:hAnsi="Times New Roman" w:eastAsia="Times New Roman"/>
+          <w:b w:val="0"/>
+          <w:i w:val="0"/>
+          <w:sz w:val="24"/>
+        </w:rPr>
+        <w:t xml:space="preserve">. Springer. </w:t>
+      </w:r>
+      <w:hyperlink r:id="rId25">
+        <w:r>
+          <w:rPr>
+            <w:color w:val="0563C1"/>
+            <w:u w:val="single"/>
+            <w:rFonts w:ascii="Times New Roman" w:hAnsi="Times New Roman"/>
+            <w:sz w:val="24"/>
+          </w:rPr>
+          <w:t xml:space="preserve">https://doi.org/10.1007/978-3-319-68756-8</w:t>
+        </w:r>
+      </w:hyperlink>
+    </w:p>
+    <w:p>
+      <w:pPr>
+        <w:spacing w:line="480" w:lineRule="auto"/>
+        <w:ind w:left="630" w:hanging="630"/>
+        <w:rPr>
+          <w:color w:val="000000" w:themeColor="text1"/>
+        </w:rPr>
+      </w:pPr>
+      <w:r>
+        <w:rPr>
+          <w:rFonts w:ascii="Times New Roman" w:hAnsi="Times New Roman" w:eastAsia="Times New Roman"/>
+          <w:b w:val="0"/>
+          <w:i w:val="0"/>
+          <w:color w:val="000000" w:themeColor="text1"/>
+          <w:sz w:val="24"/>
+        </w:rPr>
+        <w:t xml:space="preserve">Saldaña, J. (2021). </w:t>
+      </w:r>
+      <w:r>
+        <w:rPr>
+          <w:b w:val="0"/>
+          <w:i w:val="0"/>
+          <w:color w:val="000000" w:themeColor="text1"/>
+        </w:rPr>
+      </w:r>
+      <w:r>
+        <w:rPr>
+          <w:rFonts w:ascii="Times New Roman" w:hAnsi="Times New Roman" w:eastAsia="Times New Roman"/>
+          <w:b w:val="0"/>
+          <w:i w:val="0"/>
+          <w:sz w:val="24"/>
+        </w:rPr>
+      </w:r>
+      <w:r>
+        <w:rPr>
+          <w:rFonts w:ascii="Times New Roman" w:hAnsi="Times New Roman" w:eastAsia="Times New Roman"/>
+          <w:b w:val="0"/>
+          <w:i w:val="0"/>
+          <w:sz w:val="24"/>
+        </w:rPr>
+      </w:r>
+      <w:r>
+        <w:rPr>
+          <w:rFonts w:ascii="Times New Roman" w:hAnsi="Times New Roman" w:eastAsia="Times New Roman"/>
+          <w:b w:val="0"/>
+          <w:i/>
+          <w:sz w:val="24"/>
+        </w:rPr>
+        <w:t>The coding manual for qualitative researchers</w:t>
+      </w:r>
+      <w:r>
+        <w:rPr>
+          <w:rFonts w:ascii="Times New Roman" w:hAnsi="Times New Roman" w:eastAsia="Times New Roman"/>
+          <w:b w:val="0"/>
+          <w:i w:val="0"/>
+          <w:sz w:val="24"/>
+        </w:rPr>
+        <w:t xml:space="preserve"> (4th ed.). SAGE.</w:t>
+      </w:r>
+    </w:p>
+    <w:p>
+      <w:pPr>
+        <w:spacing w:line="480" w:lineRule="auto"/>
+        <w:ind w:left="630" w:hanging="630"/>
+        <w:rPr>
+          <w:color w:val="000000" w:themeColor="text1"/>
+        </w:rPr>
+      </w:pPr>
+      <w:r>
+        <w:rPr>
+          <w:rFonts w:ascii="Times New Roman" w:hAnsi="Times New Roman" w:eastAsia="Times New Roman"/>
+          <w:b w:val="0"/>
+          <w:i w:val="0"/>
+          <w:color w:val="000000" w:themeColor="text1"/>
+          <w:sz w:val="24"/>
+          <w:highlight w:val="yellow"/>
+        </w:rPr>
         <w:t xml:space="preserve">Stieb, J. A. (2009). Assessing Freeman’s stakeholder theory. </w:t>
       </w:r>
       <w:r>
         <w:rPr>
           <w:b w:val="0"/>
           <w:i w:val="0"/>
-        </w:rPr>
-      </w:r>
-      <w:r>
-        <w:rPr>
-          <w:b w:val="0"/>
-          <w:i w:val="0"/>
-          <w:iCs/>
-        </w:rPr>
-      </w:r>
-      <w:r>
-        <w:rPr>
-          <w:b w:val="0"/>
-          <w:i w:val="0"/>
-        </w:rPr>
-      </w:r>
-      <w:r>
-        <w:rPr>
-          <w:rFonts w:ascii="Times New Roman" w:hAnsi="Times New Roman" w:eastAsia="Times New Roman"/>
-          <w:b/>
+          <w:color w:val="000000" w:themeColor="text1"/>
+        </w:rPr>
+      </w:r>
+      <w:r>
+        <w:rPr>
+          <w:rFonts w:ascii="Times New Roman" w:hAnsi="Times New Roman" w:eastAsia="Times New Roman"/>
+          <w:b w:val="0"/>
+          <w:i w:val="0"/>
+          <w:sz w:val="24"/>
+        </w:rPr>
+      </w:r>
+      <w:r>
+        <w:rPr>
+          <w:rFonts w:ascii="Times New Roman" w:hAnsi="Times New Roman" w:eastAsia="Times New Roman"/>
+          <w:b w:val="0"/>
+          <w:i w:val="0"/>
+          <w:sz w:val="24"/>
+        </w:rPr>
+      </w:r>
+      <w:r>
+        <w:rPr>
+          <w:rFonts w:ascii="Times New Roman" w:hAnsi="Times New Roman" w:eastAsia="Times New Roman"/>
+          <w:b w:val="0"/>
           <w:i/>
           <w:sz w:val="24"/>
         </w:rPr>
@@ -9938,7 +10749,7 @@
       <w:r>
         <w:rPr>
           <w:rFonts w:ascii="Times New Roman" w:hAnsi="Times New Roman" w:eastAsia="Times New Roman"/>
-          <w:b/>
+          <w:b w:val="0"/>
           <w:i w:val="0"/>
           <w:sz w:val="24"/>
         </w:rPr>
@@ -9951,7 +10762,6 @@
             <w:u w:val="single"/>
             <w:rFonts w:ascii="Times New Roman" w:hAnsi="Times New Roman"/>
             <w:sz w:val="24"/>
-            <w:b/>
           </w:rPr>
           <w:t xml:space="preserve">https://doi.org/10.1007/s10551-008-9928-4</w:t>
         </w:r>
@@ -9970,10 +10780,45 @@
           <w:rFonts w:ascii="Times New Roman" w:hAnsi="Times New Roman" w:eastAsia="Times New Roman"/>
           <w:b w:val="0"/>
           <w:i w:val="0"/>
-          <w:color w:val="000000" w:themeColor="text1"/>
-          <w:sz w:val="24"/>
+          <w:sz w:val="24"/>
+          <w:highlight w:val="cyan"/>
         </w:rPr>
         <w:t xml:space="preserve">Taylor, S. J., &amp; Bogdan, R. (1998). </w:t>
+      </w:r>
+      <w:r>
+        <w:rPr>
+          <w:b w:val="0"/>
+          <w:i w:val="0"/>
+        </w:rPr>
+      </w:r>
+      <w:r>
+        <w:rPr>
+          <w:b w:val="0"/>
+          <w:i w:val="0"/>
+          <w:iCs/>
+        </w:rPr>
+      </w:r>
+      <w:r>
+        <w:rPr>
+          <w:b w:val="0"/>
+          <w:i w:val="0"/>
+        </w:rPr>
+      </w:r>
+      <w:r>
+        <w:rPr>
+          <w:rFonts w:ascii="Times New Roman" w:hAnsi="Times New Roman" w:eastAsia="Times New Roman"/>
+          <w:b w:val="0"/>
+          <w:i w:val="0"/>
+          <w:sz w:val="24"/>
+        </w:rPr>
+      </w:r>
+      <w:r>
+        <w:rPr>
+          <w:rFonts w:ascii="Times New Roman" w:hAnsi="Times New Roman" w:eastAsia="Times New Roman"/>
+          <w:b w:val="0"/>
+          <w:i w:val="0"/>
+          <w:sz w:val="24"/>
+        </w:rPr>
       </w:r>
       <w:r>
         <w:rPr>
@@ -10016,6 +10861,22 @@
         <w:rPr>
           <w:rFonts w:ascii="Times New Roman" w:hAnsi="Times New Roman" w:eastAsia="Times New Roman"/>
           <w:b w:val="0"/>
+          <w:i w:val="0"/>
+          <w:sz w:val="24"/>
+        </w:rPr>
+      </w:r>
+      <w:r>
+        <w:rPr>
+          <w:rFonts w:ascii="Times New Roman" w:hAnsi="Times New Roman" w:eastAsia="Times New Roman"/>
+          <w:b w:val="0"/>
+          <w:i w:val="0"/>
+          <w:sz w:val="24"/>
+        </w:rPr>
+      </w:r>
+      <w:r>
+        <w:rPr>
+          <w:rFonts w:ascii="Times New Roman" w:hAnsi="Times New Roman" w:eastAsia="Times New Roman"/>
+          <w:b w:val="0"/>
           <w:i/>
           <w:sz w:val="24"/>
         </w:rPr>
@@ -10051,9 +10912,18 @@
       </w:r>
       <w:r>
         <w:rPr>
-          <w:b w:val="0"/>
-          <w:i w:val="0"/>
-          <w:color w:val="000000" w:themeColor="text1"/>
+          <w:rFonts w:ascii="Times New Roman" w:hAnsi="Times New Roman" w:eastAsia="Times New Roman"/>
+          <w:b w:val="0"/>
+          <w:i w:val="0"/>
+          <w:sz w:val="24"/>
+        </w:rPr>
+      </w:r>
+      <w:r>
+        <w:rPr>
+          <w:rFonts w:ascii="Times New Roman" w:hAnsi="Times New Roman" w:eastAsia="Times New Roman"/>
+          <w:b w:val="0"/>
+          <w:i w:val="0"/>
+          <w:sz w:val="24"/>
         </w:rPr>
       </w:r>
       <w:r>
@@ -10089,11 +10959,82 @@
     <w:p>
       <w:pPr>
         <w:spacing w:line="480" w:lineRule="auto"/>
-      </w:pPr>
-      <w:r>
-        <w:rPr>
-          <w:rFonts w:ascii="Times New Roman" w:hAnsi="Times New Roman" w:eastAsia="Times New Roman"/>
-          <w:b w:val="0"/>
+        <w:ind w:left="630" w:hanging="630"/>
+        <w:rPr>
+          <w:color w:val="000000" w:themeColor="text1"/>
+        </w:rPr>
+      </w:pPr>
+      <w:r>
+        <w:rPr>
+          <w:rFonts w:ascii="Times New Roman" w:hAnsi="Times New Roman" w:eastAsia="Times New Roman"/>
+          <w:b w:val="0"/>
+          <w:i w:val="0"/>
+          <w:color w:val="000000" w:themeColor="text1"/>
+          <w:sz w:val="24"/>
+        </w:rPr>
+        <w:t xml:space="preserve">U.S. Small Business Administration. (2026). </w:t>
+      </w:r>
+      <w:r>
+        <w:rPr>
+          <w:b w:val="0"/>
+          <w:i w:val="0"/>
+          <w:color w:val="000000" w:themeColor="text1"/>
+        </w:rPr>
+      </w:r>
+      <w:r>
+        <w:rPr>
+          <w:rFonts w:ascii="Times New Roman" w:hAnsi="Times New Roman" w:eastAsia="Times New Roman"/>
+          <w:b w:val="0"/>
+          <w:i w:val="0"/>
+          <w:sz w:val="24"/>
+        </w:rPr>
+      </w:r>
+      <w:r>
+        <w:rPr>
+          <w:rFonts w:ascii="Times New Roman" w:hAnsi="Times New Roman" w:eastAsia="Times New Roman"/>
+          <w:b w:val="0"/>
+          <w:i w:val="0"/>
+          <w:sz w:val="24"/>
+        </w:rPr>
+      </w:r>
+      <w:r>
+        <w:rPr>
+          <w:rFonts w:ascii="Times New Roman" w:hAnsi="Times New Roman" w:eastAsia="Times New Roman"/>
+          <w:b w:val="0"/>
+          <w:i/>
+          <w:sz w:val="24"/>
+        </w:rPr>
+        <w:t>Frequently asked questions about small business</w:t>
+      </w:r>
+      <w:r>
+        <w:rPr>
+          <w:rFonts w:ascii="Times New Roman" w:hAnsi="Times New Roman" w:eastAsia="Times New Roman"/>
+          <w:b w:val="0"/>
+          <w:i w:val="0"/>
+          <w:sz w:val="24"/>
+        </w:rPr>
+        <w:t xml:space="preserve">. Office of Advocacy. </w:t>
+      </w:r>
+      <w:hyperlink r:id="rId26">
+        <w:r>
+          <w:rPr>
+            <w:color w:val="0563C1"/>
+            <w:u w:val="single"/>
+            <w:rFonts w:ascii="Times New Roman" w:hAnsi="Times New Roman"/>
+            <w:sz w:val="24"/>
+          </w:rPr>
+          <w:t xml:space="preserve">https://advocacy.sba.gov/wp-content/uploads/2026/02/FINAL_FAQsAboutSmallBusiness_2026_012826.pdf</w:t>
+        </w:r>
+      </w:hyperlink>
+    </w:p>
+    <w:p>
+      <w:pPr>
+        <w:spacing w:line="480" w:lineRule="auto"/>
+      </w:pPr>
+      <w:r>
+        <w:rPr>
+          <w:rFonts w:ascii="Times New Roman" w:hAnsi="Times New Roman" w:eastAsia="Times New Roman"/>
+          <w:b/>
           <w:i w:val="0"/>
           <w:sz w:val="24"/>
         </w:rPr>
@@ -10103,6 +11044,22 @@
         <w:rPr>
           <w:rFonts w:ascii="Times New Roman" w:hAnsi="Times New Roman" w:eastAsia="Times New Roman"/>
           <w:b w:val="0"/>
+          <w:i w:val="0"/>
+          <w:sz w:val="24"/>
+        </w:rPr>
+      </w:r>
+      <w:r>
+        <w:rPr>
+          <w:rFonts w:ascii="Times New Roman" w:hAnsi="Times New Roman" w:eastAsia="Times New Roman"/>
+          <w:b w:val="0"/>
+          <w:i w:val="0"/>
+          <w:sz w:val="24"/>
+        </w:rPr>
+      </w:r>
+      <w:r>
+        <w:rPr>
+          <w:rFonts w:ascii="Times New Roman" w:hAnsi="Times New Roman" w:eastAsia="Times New Roman"/>
+          <w:b/>
           <w:i/>
           <w:sz w:val="24"/>
         </w:rPr>
@@ -10111,7 +11068,7 @@
       <w:r>
         <w:rPr>
           <w:rFonts w:ascii="Times New Roman" w:hAnsi="Times New Roman" w:eastAsia="Times New Roman"/>
-          <w:b w:val="0"/>
+          <w:b/>
           <w:i w:val="0"/>
           <w:sz w:val="24"/>
         </w:rPr>
@@ -10124,6 +11081,7 @@
             <w:u w:val="single"/>
             <w:rFonts w:ascii="Times New Roman" w:hAnsi="Times New Roman"/>
             <w:sz w:val="24"/>
+            <w:b/>
           </w:rPr>
           <w:t xml:space="preserve">https://doi.org/10.1177/00187267221104985</w:t>
         </w:r>
@@ -10140,7 +11098,7 @@
       <w:r>
         <w:rPr>
           <w:rFonts w:ascii="Times New Roman" w:hAnsi="Times New Roman" w:eastAsia="Times New Roman"/>
-          <w:b w:val="0"/>
+          <w:b/>
           <w:i w:val="0"/>
           <w:color w:val="000000" w:themeColor="text1"/>
           <w:sz w:val="24"/>
@@ -10151,6 +11109,22 @@
         <w:rPr>
           <w:rFonts w:ascii="Times New Roman" w:hAnsi="Times New Roman" w:eastAsia="Times New Roman"/>
           <w:b w:val="0"/>
+          <w:i w:val="0"/>
+          <w:sz w:val="24"/>
+        </w:rPr>
+      </w:r>
+      <w:r>
+        <w:rPr>
+          <w:rFonts w:ascii="Times New Roman" w:hAnsi="Times New Roman" w:eastAsia="Times New Roman"/>
+          <w:b w:val="0"/>
+          <w:i w:val="0"/>
+          <w:sz w:val="24"/>
+        </w:rPr>
+      </w:r>
+      <w:r>
+        <w:rPr>
+          <w:rFonts w:ascii="Times New Roman" w:hAnsi="Times New Roman" w:eastAsia="Times New Roman"/>
+          <w:b/>
           <w:i/>
           <w:sz w:val="24"/>
         </w:rPr>
@@ -10159,7 +11133,7 @@
       <w:r>
         <w:rPr>
           <w:rFonts w:ascii="Times New Roman" w:hAnsi="Times New Roman" w:eastAsia="Times New Roman"/>
-          <w:b w:val="0"/>
+          <w:b/>
           <w:i w:val="0"/>
           <w:sz w:val="24"/>
         </w:rPr>
@@ -10183,6 +11157,22 @@
           <w:sz w:val="24"/>
         </w:rPr>
         <w:t xml:space="preserve">Verizon. (2025). </w:t>
+      </w:r>
+      <w:r>
+        <w:rPr>
+          <w:rFonts w:ascii="Times New Roman" w:hAnsi="Times New Roman" w:eastAsia="Times New Roman"/>
+          <w:b w:val="0"/>
+          <w:i w:val="0"/>
+          <w:sz w:val="24"/>
+        </w:rPr>
+      </w:r>
+      <w:r>
+        <w:rPr>
+          <w:rFonts w:ascii="Times New Roman" w:hAnsi="Times New Roman" w:eastAsia="Times New Roman"/>
+          <w:b w:val="0"/>
+          <w:i w:val="0"/>
+          <w:sz w:val="24"/>
+        </w:rPr>
       </w:r>
       <w:r>
         <w:rPr>
@@ -10225,7 +11215,7 @@
       <w:r>
         <w:rPr>
           <w:rFonts w:ascii="Times New Roman" w:hAnsi="Times New Roman" w:eastAsia="Times New Roman"/>
-          <w:b w:val="0"/>
+          <w:b/>
           <w:i w:val="0"/>
           <w:color w:val="000000" w:themeColor="text1"/>
           <w:sz w:val="24"/>
@@ -10236,6 +11226,22 @@
         <w:rPr>
           <w:rFonts w:ascii="Times New Roman" w:hAnsi="Times New Roman" w:eastAsia="Times New Roman"/>
           <w:b w:val="0"/>
+          <w:i w:val="0"/>
+          <w:sz w:val="24"/>
+        </w:rPr>
+      </w:r>
+      <w:r>
+        <w:rPr>
+          <w:rFonts w:ascii="Times New Roman" w:hAnsi="Times New Roman" w:eastAsia="Times New Roman"/>
+          <w:b w:val="0"/>
+          <w:i w:val="0"/>
+          <w:sz w:val="24"/>
+        </w:rPr>
+      </w:r>
+      <w:r>
+        <w:rPr>
+          <w:rFonts w:ascii="Times New Roman" w:hAnsi="Times New Roman" w:eastAsia="Times New Roman"/>
+          <w:b/>
           <w:i/>
           <w:sz w:val="24"/>
         </w:rPr>
@@ -10244,7 +11250,7 @@
       <w:r>
         <w:rPr>
           <w:rFonts w:ascii="Times New Roman" w:hAnsi="Times New Roman" w:eastAsia="Times New Roman"/>
-          <w:b w:val="0"/>
+          <w:b/>
           <w:i w:val="0"/>
           <w:sz w:val="24"/>
         </w:rPr>
@@ -10280,6 +11286,22 @@
         <w:rPr>
           <w:rFonts w:ascii="Times New Roman" w:hAnsi="Times New Roman" w:eastAsia="Times New Roman"/>
           <w:b w:val="0"/>
+          <w:i w:val="0"/>
+          <w:sz w:val="24"/>
+        </w:rPr>
+      </w:r>
+      <w:r>
+        <w:rPr>
+          <w:rFonts w:ascii="Times New Roman" w:hAnsi="Times New Roman" w:eastAsia="Times New Roman"/>
+          <w:b w:val="0"/>
+          <w:i w:val="0"/>
+          <w:sz w:val="24"/>
+        </w:rPr>
+      </w:r>
+      <w:r>
+        <w:rPr>
+          <w:rFonts w:ascii="Times New Roman" w:hAnsi="Times New Roman" w:eastAsia="Times New Roman"/>
+          <w:b w:val="0"/>
           <w:i/>
           <w:sz w:val="24"/>
         </w:rPr>
@@ -10312,6 +11334,22 @@
           <w:sz w:val="24"/>
         </w:rPr>
         <w:t xml:space="preserve">Weick, K. E. (1989). Theory construction as disciplined imagination. </w:t>
+      </w:r>
+      <w:r>
+        <w:rPr>
+          <w:rFonts w:ascii="Times New Roman" w:hAnsi="Times New Roman" w:eastAsia="Times New Roman"/>
+          <w:b w:val="0"/>
+          <w:i w:val="0"/>
+          <w:sz w:val="24"/>
+        </w:rPr>
+      </w:r>
+      <w:r>
+        <w:rPr>
+          <w:rFonts w:ascii="Times New Roman" w:hAnsi="Times New Roman" w:eastAsia="Times New Roman"/>
+          <w:b w:val="0"/>
+          <w:i w:val="0"/>
+          <w:sz w:val="24"/>
+        </w:rPr>
       </w:r>
       <w:r>
         <w:rPr>
@@ -10364,6 +11402,22 @@
         <w:rPr>
           <w:rFonts w:ascii="Times New Roman" w:hAnsi="Times New Roman" w:eastAsia="Times New Roman"/>
           <w:b w:val="0"/>
+          <w:i w:val="0"/>
+          <w:sz w:val="24"/>
+        </w:rPr>
+      </w:r>
+      <w:r>
+        <w:rPr>
+          <w:rFonts w:ascii="Times New Roman" w:hAnsi="Times New Roman" w:eastAsia="Times New Roman"/>
+          <w:b w:val="0"/>
+          <w:i w:val="0"/>
+          <w:sz w:val="24"/>
+        </w:rPr>
+      </w:r>
+      <w:r>
+        <w:rPr>
+          <w:rFonts w:ascii="Times New Roman" w:hAnsi="Times New Roman" w:eastAsia="Times New Roman"/>
+          <w:b w:val="0"/>
           <w:i/>
           <w:sz w:val="24"/>
         </w:rPr>
@@ -10390,7 +11444,7 @@
       <w:r>
         <w:rPr>
           <w:rFonts w:ascii="Times New Roman" w:hAnsi="Times New Roman" w:eastAsia="Times New Roman"/>
-          <w:b/>
+          <w:b w:val="0"/>
           <w:i w:val="0"/>
           <w:color w:val="000000" w:themeColor="text1"/>
           <w:sz w:val="24"/>
@@ -10400,7 +11454,23 @@
       <w:r>
         <w:rPr>
           <w:rFonts w:ascii="Times New Roman" w:hAnsi="Times New Roman" w:eastAsia="Times New Roman"/>
-          <w:b/>
+          <w:b w:val="0"/>
+          <w:i w:val="0"/>
+          <w:sz w:val="24"/>
+        </w:rPr>
+      </w:r>
+      <w:r>
+        <w:rPr>
+          <w:rFonts w:ascii="Times New Roman" w:hAnsi="Times New Roman" w:eastAsia="Times New Roman"/>
+          <w:b w:val="0"/>
+          <w:i w:val="0"/>
+          <w:sz w:val="24"/>
+        </w:rPr>
+      </w:r>
+      <w:r>
+        <w:rPr>
+          <w:rFonts w:ascii="Times New Roman" w:hAnsi="Times New Roman" w:eastAsia="Times New Roman"/>
+          <w:b w:val="0"/>
           <w:i/>
           <w:sz w:val="24"/>
         </w:rPr>
@@ -10409,7 +11479,7 @@
       <w:r>
         <w:rPr>
           <w:rFonts w:ascii="Times New Roman" w:hAnsi="Times New Roman" w:eastAsia="Times New Roman"/>
-          <w:b/>
+          <w:b w:val="0"/>
           <w:i w:val="0"/>
           <w:sz w:val="24"/>
         </w:rPr>
@@ -10422,7 +11492,6 @@
             <w:u w:val="single"/>
             <w:rFonts w:ascii="Times New Roman" w:hAnsi="Times New Roman"/>
             <w:sz w:val="24"/>
-            <w:b/>
           </w:rPr>
           <w:t xml:space="preserve">https://doi.org/10.5465/annals.2015.0134</w:t>
         </w:r>
@@ -10452,6 +11521,22 @@
           <w:b w:val="0"/>
           <w:i w:val="0"/>
           <w:color w:val="000000" w:themeColor="text1"/>
+        </w:rPr>
+      </w:r>
+      <w:r>
+        <w:rPr>
+          <w:rFonts w:ascii="Times New Roman" w:hAnsi="Times New Roman" w:eastAsia="Times New Roman"/>
+          <w:b w:val="0"/>
+          <w:i w:val="0"/>
+          <w:sz w:val="24"/>
+        </w:rPr>
+      </w:r>
+      <w:r>
+        <w:rPr>
+          <w:rFonts w:ascii="Times New Roman" w:hAnsi="Times New Roman" w:eastAsia="Times New Roman"/>
+          <w:b w:val="0"/>
+          <w:i w:val="0"/>
+          <w:sz w:val="24"/>
         </w:rPr>
       </w:r>
       <w:r>

</xml_diff>

<commit_message>
Add usage tracking log and restore Gibran as an epigraph source.
Record all Week 8 Need, citation, and U.S.-reference passes in one
usage file, and restore The Prophet (1923) for front-matter inclusion
only—not as a scholarly claim.

Co-authored-by: delano2x-Procedurals <delano2x-Procedurals@users.noreply.github.com>
</commit_message>
<xml_diff>
--- a/downloads/MW_Wk5_to_wk8_Edit_6Sep26.docx
+++ b/downloads/MW_Wk5_to_wk8_Edit_6Sep26.docx
@@ -8780,6 +8780,34 @@
           <w:t xml:space="preserve">https://doi.org/10.1002/sd.2840</w:t>
         </w:r>
       </w:hyperlink>
+    </w:p>
+    <w:p>
+      <w:pPr>
+        <w:spacing w:line="480" w:lineRule="auto"/>
+        <w:ind w:left="720" w:hanging="720"/>
+      </w:pPr>
+      <w:r>
+        <w:rPr>
+          <w:rFonts w:ascii="Times New Roman" w:hAnsi="Times New Roman" w:eastAsia="Times New Roman"/>
+          <w:sz w:val="24"/>
+        </w:rPr>
+        <w:t xml:space="preserve">Gibran, K. (1923). </w:t>
+      </w:r>
+      <w:r>
+        <w:rPr>
+          <w:rFonts w:ascii="Times New Roman" w:hAnsi="Times New Roman" w:eastAsia="Times New Roman"/>
+          <w:i/>
+          <w:sz w:val="24"/>
+        </w:rPr>
+        <w:t>The prophet.</w:t>
+      </w:r>
+      <w:r>
+        <w:rPr>
+          <w:rFonts w:ascii="Times New Roman" w:hAnsi="Times New Roman" w:eastAsia="Times New Roman"/>
+          <w:sz w:val="24"/>
+        </w:rPr>
+        <w:t xml:space="preserve"> Alfred A. Knopf.</w:t>
+      </w:r>
     </w:p>
     <w:p>
       <w:pPr>

</xml_diff>

<commit_message>
Revise Ethical Considerations to answer the header with bolded fixes.
Replace Miteu with Resnik, name re-identification as the issue, lock
interviews-only collection, and label privacy, confidentiality, and
data security. Header text and Word comments stay unchanged.

Co-authored-by: delano2x-Procedurals <delano2x-Procedurals@users.noreply.github.com>
</commit_message>
<xml_diff>
--- a/downloads/MW_Wk5_to_wk8_Edit_6Sep26.docx
+++ b/downloads/MW_Wk5_to_wk8_Edit_6Sep26.docx
@@ -6770,16 +6770,17 @@
     <w:p>
       <w:pPr>
         <w:pStyle w:val="ui-markdownparagraph"/>
+        <w:spacing w:line="480" w:lineRule="auto"/>
         <w:ind w:firstLine="720"/>
       </w:pPr>
       <w:r>
         <w:rPr>
           <w:rFonts w:ascii="Times New Roman" w:hAnsi="Times New Roman" w:eastAsia="Times New Roman"/>
-          <w:b w:val="0"/>
+          <w:b/>
           <w:sz w:val="24"/>
           <w:highlight w:val="yellow"/>
         </w:rPr>
-        <w:t>Ethics is a guiding principle in qualitative research. It shapes study design, the process of discovery, and the significance of the findings, and it requires the researcher to weigh the human cost of inquiry (Resnik, 2018). This generic qualitative inquiry will utilize U.S. small and medium-sized enterprise (SME) IT, network, systems, infrastructure, or operations managers in firms of 10 to 200 personnel. In that setting, ethical risk is concentrated: a named recovery event, a role title, and a platform type can re-identify a person or firm more easily than in a large enterprise. The study will therefore treat data management, respect for persons, honesty and integrity, and responsible dissemination as operational requirements, not as a checklist (Resnik, 2018). The researcher will not begin identification, screening, or scheduling until the Capella University Institutional Review Board has granted written approval. The design follows the Belmont Report’s principles of respect for persons, beneficence, and justice (National Commission for the Protection of Human Subjects of Biomedical and Behavioral Research, 1979). Respect for persons will be enacted through voluntary participation, signed electronic consent, a recorded permission-to-record check, and the right to skip any question or stop at any time without penalty. Beneficence will be enacted by treating SME organizational disclosure as both a compliance issue and a Gap-data threat: the researcher will not recruit through a supervisor, owner, employer command chain, or vendor account manager; collection remains interviews only; identifiers will be stripped to P##, role only, SME-X, and Platform-X; and member checking will be a seven-day factual review of sequence, roles, and named proof so contested recovery decisions are not edited out. Justice will be enacted by placing the research burden on operational U.S. SME managers who can name a qualifying event, and by excluding vendor-only staff and command-visible recruitment paths.</w:t>
+        <w:t xml:space="preserve">Ethical Considerations for this generic qualitative inquiry name the ethical issues and the plan that will meet Capella’s privacy, confidentiality, and data security standard (Resnik, 2018). </w:t>
       </w:r>
       <w:r>
         <w:rPr>
@@ -6807,10 +6808,99 @@
         </w:rPr>
       </w:r>
       <w:r/>
+      <w:r>
+        <w:rPr>
+          <w:rFonts w:ascii="Times New Roman" w:hAnsi="Times New Roman" w:eastAsia="Times New Roman"/>
+          <w:b w:val="0"/>
+          <w:sz w:val="24"/>
+        </w:rPr>
+        <w:t xml:space="preserve">Ethics shapes study design, the process of discovery, and the significance of the findings, and it requires the researcher to weigh the human cost of inquiry </w:t>
+      </w:r>
+      <w:r>
+        <w:rPr>
+          <w:rFonts w:ascii="Times New Roman" w:hAnsi="Times New Roman" w:eastAsia="Times New Roman"/>
+          <w:b/>
+          <w:sz w:val="24"/>
+        </w:rPr>
+        <w:t>(Resnik, 2018)</w:t>
+      </w:r>
+      <w:r>
+        <w:rPr>
+          <w:rFonts w:ascii="Times New Roman" w:hAnsi="Times New Roman" w:eastAsia="Times New Roman"/>
+          <w:b w:val="0"/>
+          <w:sz w:val="24"/>
+        </w:rPr>
+        <w:t xml:space="preserve">. Participants will be U.S. small and medium-sized enterprise (SME) IT, network, systems, infrastructure, or operations managers in firms of 10 to 200 personnel. In that setting </w:t>
+      </w:r>
+      <w:r>
+        <w:rPr>
+          <w:rFonts w:ascii="Times New Roman" w:hAnsi="Times New Roman" w:eastAsia="Times New Roman"/>
+          <w:b/>
+          <w:sz w:val="24"/>
+        </w:rPr>
+        <w:t>the primary ethical issue is re-identification</w:t>
+      </w:r>
+      <w:r>
+        <w:rPr>
+          <w:rFonts w:ascii="Times New Roman" w:hAnsi="Times New Roman" w:eastAsia="Times New Roman"/>
+          <w:b w:val="0"/>
+          <w:sz w:val="24"/>
+        </w:rPr>
+        <w:t xml:space="preserve">: a named recovery event, a role title, and a platform type can expose a person or firm more easily than in a large enterprise. The researcher will not begin identification, screening, or scheduling until the Capella University Institutional Review Board has granted written approval. The design follows the Belmont Report’s principles of respect for persons, beneficence, and justice (National Commission for the Protection of Human Subjects of Biomedical and Behavioral Research, 1979). Respect for persons will be enacted through voluntary participation, signed electronic consent, a recorded permission-to-record check, and the right to skip any question or stop at any time without penalty. Beneficence will be enacted by treating SME organizational disclosure as both a </w:t>
+      </w:r>
+      <w:r>
+        <w:rPr>
+          <w:rFonts w:ascii="Times New Roman" w:hAnsi="Times New Roman" w:eastAsia="Times New Roman"/>
+          <w:b/>
+          <w:sz w:val="24"/>
+        </w:rPr>
+        <w:t>privacy issue and a threat to candid Gap data</w:t>
+      </w:r>
+      <w:r>
+        <w:rPr>
+          <w:rFonts w:ascii="Times New Roman" w:hAnsi="Times New Roman" w:eastAsia="Times New Roman"/>
+          <w:b w:val="0"/>
+          <w:sz w:val="24"/>
+        </w:rPr>
+        <w:t xml:space="preserve">: the researcher will not recruit through a supervisor, owner, employer command chain, or vendor account manager; </w:t>
+      </w:r>
+      <w:r>
+        <w:rPr>
+          <w:rFonts w:ascii="Times New Roman" w:hAnsi="Times New Roman" w:eastAsia="Times New Roman"/>
+          <w:b/>
+          <w:sz w:val="24"/>
+        </w:rPr>
+        <w:t>collection remains interviews only</w:t>
+      </w:r>
+      <w:r>
+        <w:rPr>
+          <w:rFonts w:ascii="Times New Roman" w:hAnsi="Times New Roman" w:eastAsia="Times New Roman"/>
+          <w:b w:val="0"/>
+          <w:sz w:val="24"/>
+        </w:rPr>
+        <w:t xml:space="preserve">; identifiers will be stripped to P##, role only, SME-X, and Platform-X; and member checking will be a seven-day factual review of sequence, roles, and </w:t>
+      </w:r>
+      <w:r>
+        <w:rPr>
+          <w:rFonts w:ascii="Times New Roman" w:hAnsi="Times New Roman" w:eastAsia="Times New Roman"/>
+          <w:b/>
+          <w:sz w:val="24"/>
+        </w:rPr>
+        <w:t>named proof</w:t>
+      </w:r>
+      <w:r>
+        <w:rPr>
+          <w:rFonts w:ascii="Times New Roman" w:hAnsi="Times New Roman" w:eastAsia="Times New Roman"/>
+          <w:b w:val="0"/>
+          <w:sz w:val="24"/>
+        </w:rPr>
+        <w:t xml:space="preserve"> so contested recovery decisions are not edited out. Justice will be enacted by placing the research burden on operational U.S. SME managers who can name a qualifying event, and by excluding vendor-only staff and command-visible recruitment paths.</w:t>
+      </w:r>
     </w:p>
     <w:p>
       <w:pPr>
         <w:pStyle w:val="ui-markdownparagraph"/>
+        <w:spacing w:line="480" w:lineRule="auto"/>
         <w:ind w:firstLine="720"/>
       </w:pPr>
       <w:r>
@@ -6821,7 +6911,7 @@
           <w:sz w:val="24"/>
           <w:highlight w:val="yellow"/>
         </w:rPr>
-        <w:t>Honesty and integrity will govern collection, storage, analysis, reporting, and any later discussion of the study (</w:t>
+        <w:t xml:space="preserve">Honesty and integrity will govern collection, storage, analysis, reporting, and any later discussion of the study </w:t>
       </w:r>
       <w:r>
         <w:rPr>
@@ -6840,7 +6930,6 @@
           <w:color w:val="000000"/>
           <w:sz w:val="24"/>
         </w:rPr>
-        <w:t>Resnik, 2018</w:t>
       </w:r>
       <w:r>
         <w:rPr>
@@ -6849,7 +6938,94 @@
           <w:color w:val="000000"/>
           <w:sz w:val="24"/>
         </w:rPr>
-        <w:t>). Recordings and RAW notes will be stored in an encrypted, password-protected directory separate from CLEAN transcripts and the Delve audit nest. The researcher will not continue a session from memory if recording fails, will not invent artifact contents a manager did not state, and will not claim that Delve performed the analysis. Findings will be disseminated as de-identified patterned accounts of named U.S. SME recovery events, without employer, owner, vendor, or product names, so the study can report how managers enacted whose claim counted, who decided, and what counted as enough proof without exposing the participant or the firm.</w:t>
+      </w:r>
+      <w:r>
+        <w:rPr>
+          <w:rFonts w:ascii="Times New Roman" w:hAnsi="Times New Roman" w:eastAsia="Times New Roman"/>
+          <w:b/>
+          <w:sz w:val="24"/>
+        </w:rPr>
+        <w:t>(Resnik, 2018)</w:t>
+      </w:r>
+      <w:r>
+        <w:rPr>
+          <w:rFonts w:ascii="Times New Roman" w:hAnsi="Times New Roman" w:eastAsia="Times New Roman"/>
+          <w:b w:val="0"/>
+          <w:sz w:val="24"/>
+        </w:rPr>
+        <w:t xml:space="preserve">. </w:t>
+      </w:r>
+      <w:r>
+        <w:rPr>
+          <w:rFonts w:ascii="Times New Roman" w:hAnsi="Times New Roman" w:eastAsia="Times New Roman"/>
+          <w:b/>
+          <w:sz w:val="24"/>
+        </w:rPr>
+        <w:t xml:space="preserve">Data security: </w:t>
+      </w:r>
+      <w:r>
+        <w:rPr>
+          <w:rFonts w:ascii="Times New Roman" w:hAnsi="Times New Roman" w:eastAsia="Times New Roman"/>
+          <w:b w:val="0"/>
+          <w:sz w:val="24"/>
+        </w:rPr>
+        <w:t xml:space="preserve">recordings and RAW notes will be stored in an encrypted, password-protected directory separate from CLEAN transcripts and the Delve audit nest. </w:t>
+      </w:r>
+      <w:r>
+        <w:rPr>
+          <w:rFonts w:ascii="Times New Roman" w:hAnsi="Times New Roman" w:eastAsia="Times New Roman"/>
+          <w:b/>
+          <w:sz w:val="24"/>
+        </w:rPr>
+        <w:t xml:space="preserve">Confidentiality: </w:t>
+      </w:r>
+      <w:r>
+        <w:rPr>
+          <w:rFonts w:ascii="Times New Roman" w:hAnsi="Times New Roman" w:eastAsia="Times New Roman"/>
+          <w:b w:val="0"/>
+          <w:sz w:val="24"/>
+        </w:rPr>
+        <w:t xml:space="preserve">the researcher will not continue a session from memory if recording fails, will not invent contents a manager did not state, and will </w:t>
+      </w:r>
+      <w:r>
+        <w:rPr>
+          <w:rFonts w:ascii="Times New Roman" w:hAnsi="Times New Roman" w:eastAsia="Times New Roman"/>
+          <w:b/>
+          <w:sz w:val="24"/>
+        </w:rPr>
+        <w:t>not claim that Delve performed the analysis</w:t>
+      </w:r>
+      <w:r>
+        <w:rPr>
+          <w:rFonts w:ascii="Times New Roman" w:hAnsi="Times New Roman" w:eastAsia="Times New Roman"/>
+          <w:b w:val="0"/>
+          <w:sz w:val="24"/>
+        </w:rPr>
+        <w:t xml:space="preserve">. </w:t>
+      </w:r>
+      <w:r>
+        <w:rPr>
+          <w:rFonts w:ascii="Times New Roman" w:hAnsi="Times New Roman" w:eastAsia="Times New Roman"/>
+          <w:b/>
+          <w:sz w:val="24"/>
+        </w:rPr>
+        <w:t xml:space="preserve">Privacy: </w:t>
+      </w:r>
+      <w:r>
+        <w:rPr>
+          <w:rFonts w:ascii="Times New Roman" w:hAnsi="Times New Roman" w:eastAsia="Times New Roman"/>
+          <w:b/>
+          <w:sz w:val="24"/>
+        </w:rPr>
+        <w:t>findings will be disseminated</w:t>
+      </w:r>
+      <w:r>
+        <w:rPr>
+          <w:rFonts w:ascii="Times New Roman" w:hAnsi="Times New Roman" w:eastAsia="Times New Roman"/>
+          <w:b w:val="0"/>
+          <w:sz w:val="24"/>
+        </w:rPr>
+        <w:t xml:space="preserve"> as de-identified patterned accounts of named U.S. SME recovery events, without employer, owner, vendor, or product names, so the study can report how managers enacted whose claim counted, who decided, and what counted as enough proof without exposing the participant or the firm.</w:t>
       </w:r>
     </w:p>
     <w:p>

</xml_diff>

<commit_message>
Revise the data-analysis offering in third person with current citations.
Tie hybrid codebook TA to the salience framework, replace Braun/Naeem
with Saldaña and Guest, use sentence-case raw/clean, and bold the
changes. Header and Word comments stay unchanged.

Co-authored-by: delano2x-Procedurals <delano2x-Procedurals@users.noreply.github.com>
</commit_message>
<xml_diff>
--- a/downloads/MW_Wk5_to_wk8_Edit_6Sep26.docx
+++ b/downloads/MW_Wk5_to_wk8_Edit_6Sep26.docx
@@ -6945,6 +6945,83 @@
           <w:b/>
           <w:sz w:val="24"/>
         </w:rPr>
+      </w:r>
+      <w:r>
+        <w:rPr>
+          <w:rFonts w:ascii="Times New Roman" w:hAnsi="Times New Roman" w:eastAsia="Times New Roman"/>
+          <w:b w:val="0"/>
+          <w:sz w:val="24"/>
+        </w:rPr>
+      </w:r>
+      <w:r>
+        <w:rPr>
+          <w:rFonts w:ascii="Times New Roman" w:hAnsi="Times New Roman" w:eastAsia="Times New Roman"/>
+          <w:b/>
+          <w:sz w:val="24"/>
+        </w:rPr>
+      </w:r>
+      <w:r>
+        <w:rPr>
+          <w:rFonts w:ascii="Times New Roman" w:hAnsi="Times New Roman" w:eastAsia="Times New Roman"/>
+          <w:b w:val="0"/>
+          <w:sz w:val="24"/>
+        </w:rPr>
+      </w:r>
+      <w:r>
+        <w:rPr>
+          <w:rFonts w:ascii="Times New Roman" w:hAnsi="Times New Roman" w:eastAsia="Times New Roman"/>
+          <w:b/>
+          <w:sz w:val="24"/>
+        </w:rPr>
+      </w:r>
+      <w:r>
+        <w:rPr>
+          <w:rFonts w:ascii="Times New Roman" w:hAnsi="Times New Roman" w:eastAsia="Times New Roman"/>
+          <w:b w:val="0"/>
+          <w:sz w:val="24"/>
+        </w:rPr>
+      </w:r>
+      <w:r>
+        <w:rPr>
+          <w:rFonts w:ascii="Times New Roman" w:hAnsi="Times New Roman" w:eastAsia="Times New Roman"/>
+          <w:b/>
+          <w:sz w:val="24"/>
+        </w:rPr>
+      </w:r>
+      <w:r>
+        <w:rPr>
+          <w:rFonts w:ascii="Times New Roman" w:hAnsi="Times New Roman" w:eastAsia="Times New Roman"/>
+          <w:b w:val="0"/>
+          <w:sz w:val="24"/>
+        </w:rPr>
+      </w:r>
+      <w:r>
+        <w:rPr>
+          <w:rFonts w:ascii="Times New Roman" w:hAnsi="Times New Roman" w:eastAsia="Times New Roman"/>
+          <w:b/>
+          <w:sz w:val="24"/>
+        </w:rPr>
+      </w:r>
+      <w:r>
+        <w:rPr>
+          <w:rFonts w:ascii="Times New Roman" w:hAnsi="Times New Roman" w:eastAsia="Times New Roman"/>
+          <w:b/>
+          <w:sz w:val="24"/>
+        </w:rPr>
+      </w:r>
+      <w:r>
+        <w:rPr>
+          <w:rFonts w:ascii="Times New Roman" w:hAnsi="Times New Roman" w:eastAsia="Times New Roman"/>
+          <w:b w:val="0"/>
+          <w:sz w:val="24"/>
+        </w:rPr>
+      </w:r>
+      <w:r>
+        <w:rPr>
+          <w:rFonts w:ascii="Times New Roman" w:hAnsi="Times New Roman" w:eastAsia="Times New Roman"/>
+          <w:b/>
+          <w:sz w:val="24"/>
+        </w:rPr>
         <w:t>(Resnik, 2018)</w:t>
       </w:r>
       <w:r>
@@ -6969,7 +7046,39 @@
           <w:b w:val="0"/>
           <w:sz w:val="24"/>
         </w:rPr>
-        <w:t xml:space="preserve">recordings and RAW notes will be stored in an encrypted, password-protected directory separate from CLEAN transcripts and the Delve audit nest. </w:t>
+        <w:t xml:space="preserve">recordings and </w:t>
+      </w:r>
+      <w:r>
+        <w:rPr>
+          <w:rFonts w:ascii="Times New Roman" w:hAnsi="Times New Roman" w:eastAsia="Times New Roman"/>
+          <w:b/>
+          <w:sz w:val="24"/>
+        </w:rPr>
+        <w:t>raw notes</w:t>
+      </w:r>
+      <w:r>
+        <w:rPr>
+          <w:rFonts w:ascii="Times New Roman" w:hAnsi="Times New Roman" w:eastAsia="Times New Roman"/>
+          <w:b w:val="0"/>
+          <w:sz w:val="24"/>
+        </w:rPr>
+        <w:t xml:space="preserve"> will be stored in an encrypted, password-protected directory separate from </w:t>
+      </w:r>
+      <w:r>
+        <w:rPr>
+          <w:rFonts w:ascii="Times New Roman" w:hAnsi="Times New Roman" w:eastAsia="Times New Roman"/>
+          <w:b/>
+          <w:sz w:val="24"/>
+        </w:rPr>
+        <w:t>clean transcripts</w:t>
+      </w:r>
+      <w:r>
+        <w:rPr>
+          <w:rFonts w:ascii="Times New Roman" w:hAnsi="Times New Roman" w:eastAsia="Times New Roman"/>
+          <w:b w:val="0"/>
+          <w:sz w:val="24"/>
+        </w:rPr>
+        <w:t xml:space="preserve"> and the Delve audit nest. </w:t>
       </w:r>
       <w:r>
         <w:rPr>
@@ -7130,13 +7239,15 @@
     <w:p>
       <w:pPr>
         <w:pStyle w:val="ui-markdownparagraph"/>
-      </w:pPr>
-      <w:r>
-        <w:rPr>
-          <w:rFonts w:ascii="Times New Roman" w:hAnsi="Times New Roman" w:eastAsia="Times New Roman"/>
-          <w:sz w:val="24"/>
-        </w:rPr>
-        <w:t>The researcher will analyze de-identified critical-incident interviews from the locked sample of 12 U.S. SME IT, network, systems, infrastructure, or operations managers using hybrid deductive–inductive codebook thematic analysis within a generic qualitative inquiry (Caelli et al., 2003; Fereday &amp; Muir-Cochrane, 2006; Kahlke, 2014; Percy et al., 2015). Before coding, the researcher will complete a scope register that records the purpose, research question, framework role, eligibility rules, participant count, and required deliverables, and will keep three work areas separate: preserved RAW recordings, CLEAN analytic files, and presentation outputs. Each interview will receive a stable identifier. The researcher will produce a verbatim transcript, strip person, firm, vendor, and product names, complete a seven-day factual member check, and read each CLEAN transcript in full before formal coding (Lincoln &amp; Guba, 1985). Delve will store CLEAN transcripts, the versioned codebook, memos, and snippet URLs. Delve will not perform the analysis.</w:t>
+        <w:spacing w:line="480" w:lineRule="auto"/>
+      </w:pPr>
+      <w:r>
+        <w:rPr>
+          <w:rFonts w:ascii="Times New Roman" w:hAnsi="Times New Roman" w:eastAsia="Times New Roman"/>
+          <w:b w:val="0"/>
+          <w:sz w:val="24"/>
+        </w:rPr>
+        <w:t xml:space="preserve">The researcher will analyze de-identified critical-incident interviews from the locked sample of 12 U.S. SME IT, network, systems, infrastructure, or operations managers using hybrid deductive–inductive codebook thematic analysis within a generic qualitative inquiry (Caelli et al., 2003; Fereday &amp; Muir-Cochrane, 2006; Kahlke, 2014; Percy et al., 2015). </w:t>
       </w:r>
       <w:r>
         <w:rPr>
@@ -7157,18 +7268,99 @@
       </w:r>
       <w:r/>
       <w:r/>
+      <w:r>
+        <w:rPr>
+          <w:rFonts w:ascii="Times New Roman" w:hAnsi="Times New Roman" w:eastAsia="Times New Roman"/>
+          <w:b/>
+          <w:sz w:val="24"/>
+        </w:rPr>
+        <w:t xml:space="preserve">That technique is appropriate to the project framework because power, legitimacy, and urgency remain sensitizing probes (Mitchell et al., 1997), while value-creation stakeholder theory remains on Need / What We Know and is not imported as a codebook theme (Freeman et al., 2020). </w:t>
+      </w:r>
+      <w:r>
+        <w:rPr>
+          <w:rFonts w:ascii="Times New Roman" w:hAnsi="Times New Roman" w:eastAsia="Times New Roman"/>
+          <w:b w:val="0"/>
+          <w:sz w:val="24"/>
+        </w:rPr>
+        <w:t xml:space="preserve">Before coding, the researcher will complete a scope register that records the purpose, research question, framework role, eligibility rules, participant count, and required deliverables, and will keep three work areas separate: </w:t>
+      </w:r>
+      <w:r>
+        <w:rPr>
+          <w:rFonts w:ascii="Times New Roman" w:hAnsi="Times New Roman" w:eastAsia="Times New Roman"/>
+          <w:b/>
+          <w:sz w:val="24"/>
+        </w:rPr>
+        <w:t>raw recordings, clean analytic files, and presentation outputs</w:t>
+      </w:r>
+      <w:r>
+        <w:rPr>
+          <w:rFonts w:ascii="Times New Roman" w:hAnsi="Times New Roman" w:eastAsia="Times New Roman"/>
+          <w:b w:val="0"/>
+          <w:sz w:val="24"/>
+        </w:rPr>
+        <w:t xml:space="preserve">. Each interview will receive a stable identifier. The researcher will produce a verbatim transcript, strip person, firm, vendor, and product names, complete a seven-day factual member check, and read each </w:t>
+      </w:r>
+      <w:r>
+        <w:rPr>
+          <w:rFonts w:ascii="Times New Roman" w:hAnsi="Times New Roman" w:eastAsia="Times New Roman"/>
+          <w:b/>
+          <w:sz w:val="24"/>
+        </w:rPr>
+        <w:t>clean transcript</w:t>
+      </w:r>
+      <w:r>
+        <w:rPr>
+          <w:rFonts w:ascii="Times New Roman" w:hAnsi="Times New Roman" w:eastAsia="Times New Roman"/>
+          <w:b w:val="0"/>
+          <w:sz w:val="24"/>
+        </w:rPr>
+        <w:t xml:space="preserve"> in full before formal coding (Lincoln &amp; Guba, 1985). Delve will store </w:t>
+      </w:r>
+      <w:r>
+        <w:rPr>
+          <w:rFonts w:ascii="Times New Roman" w:hAnsi="Times New Roman" w:eastAsia="Times New Roman"/>
+          <w:b/>
+          <w:sz w:val="24"/>
+        </w:rPr>
+        <w:t>clean transcripts</w:t>
+      </w:r>
+      <w:r>
+        <w:rPr>
+          <w:rFonts w:ascii="Times New Roman" w:hAnsi="Times New Roman" w:eastAsia="Times New Roman"/>
+          <w:b w:val="0"/>
+          <w:sz w:val="24"/>
+        </w:rPr>
+        <w:t xml:space="preserve">, the versioned codebook, memos, and snippet URLs. Delve will not perform the analysis </w:t>
+      </w:r>
+      <w:r>
+        <w:rPr>
+          <w:rFonts w:ascii="Times New Roman" w:hAnsi="Times New Roman" w:eastAsia="Times New Roman"/>
+          <w:b/>
+          <w:sz w:val="24"/>
+        </w:rPr>
+        <w:t>(Paulus, 2023)</w:t>
+      </w:r>
+      <w:r>
+        <w:rPr>
+          <w:rFonts w:ascii="Times New Roman" w:hAnsi="Times New Roman" w:eastAsia="Times New Roman"/>
+          <w:b w:val="0"/>
+          <w:sz w:val="24"/>
+        </w:rPr>
+        <w:t>.</w:t>
+      </w:r>
     </w:p>
     <w:p>
       <w:pPr>
         <w:pStyle w:val="ui-markdownparagraph"/>
-      </w:pPr>
-      <w:r>
-        <w:rPr>
-          <w:rFonts w:ascii="Times New Roman" w:hAnsi="Times New Roman" w:eastAsia="Times New Roman"/>
-          <w:b w:val="0"/>
-          <w:sz w:val="24"/>
-        </w:rPr>
-        <w:t>Second, the researcher will import the nested start-list of STRUCTURAL, FRAMEWORK_DEDUCTIVE, and BOUNDARY codes and create one excerpt record for each bounded passage that requires analysis, attaching its source locator, speaker, incident context, and provisional code (Fereday &amp; Muir-Cochrane, 2006; Paulus, 2023). A passage may receive more than one code when it conveys distinct ideas. Power, legitimacy, and urgency will function as sensitizing probes, not predetermined theme titles (Mitchell et al., 1997). Decision rights, escalation, evidentiary standards, and recoverability assurance will be coded as enactment evidence, not as a fourth salience attribute. Each code definition will state its meaning, inclusion criteria, exclusion criteria, and a source-linked example; uncertain assignments will be flagged for review. EMERGENT child codes will remain empty until meaning units are locked (Saldaña, 2021; Taylor &amp; Bogdan, 1998). Coding changes will be recorded with the date, reason, and affected records. Spreadsheet lookup and Delve retrieval may support these records; interpretive approval will remain with the researcher (Fereday &amp; Muir-Cochrane, 2006).</w:t>
+        <w:spacing w:line="480" w:lineRule="auto"/>
+      </w:pPr>
+      <w:r>
+        <w:rPr>
+          <w:rFonts w:ascii="Times New Roman" w:hAnsi="Times New Roman" w:eastAsia="Times New Roman"/>
+          <w:b w:val="0"/>
+          <w:sz w:val="24"/>
+        </w:rPr>
+        <w:t xml:space="preserve">Second, the researcher will import the nested start-list of STRUCTURAL, FRAMEWORK_DEDUCTIVE, and BOUNDARY codes and create one excerpt record for each bounded passage that requires analysis, attaching its source locator, speaker, incident context, and provisional code (Fereday &amp; Muir-Cochrane, 2006; Paulus, 2023). A passage may receive more than one code when it conveys distinct ideas. Power, legitimacy, and urgency will function as sensitizing probes, not predetermined theme titles (Mitchell et al., 1997). Decision rights, escalation, evidentiary standards, and recoverability assurance will be coded as enactment evidence, not as a fourth salience attribute. Each code definition will state its meaning, inclusion criteria, exclusion criteria, and a source-linked example; uncertain assignments will be flagged for review. EMERGENT child codes will remain empty until meaning units are locked </w:t>
       </w:r>
       <w:r>
         <w:rPr>
@@ -7197,18 +7389,35 @@
       </w:r>
       <w:r/>
       <w:r/>
+      <w:r>
+        <w:rPr>
+          <w:rFonts w:ascii="Times New Roman" w:hAnsi="Times New Roman" w:eastAsia="Times New Roman"/>
+          <w:b/>
+          <w:sz w:val="24"/>
+        </w:rPr>
+        <w:t>(Saldaña, 2021; Taylor &amp; Bogdan, 1998)</w:t>
+      </w:r>
+      <w:r>
+        <w:rPr>
+          <w:rFonts w:ascii="Times New Roman" w:hAnsi="Times New Roman" w:eastAsia="Times New Roman"/>
+          <w:b w:val="0"/>
+          <w:sz w:val="24"/>
+        </w:rPr>
+        <w:t>. Coding changes will be recorded with the date, reason, and affected records. Spreadsheet lookup and Delve retrieval may support these records; interpretive approval will remain with the researcher (Fereday &amp; Muir-Cochrane, 2006).</w:t>
+      </w:r>
     </w:p>
     <w:p>
       <w:pPr>
         <w:pStyle w:val="ui-markdownparagraph"/>
-      </w:pPr>
-      <w:r>
-        <w:rPr>
-          <w:rFonts w:ascii="Times New Roman" w:hAnsi="Times New Roman" w:eastAsia="Times New Roman"/>
-          <w:b w:val="0"/>
-          <w:sz w:val="24"/>
-        </w:rPr>
-        <w:t>Third, the researcher will lock meaning units that state a practice claim before any theme name is written, confirm each unit with a named excerpt and a negative or boundary case, and group related units only when they describe the same salience-to-assurance bargain rather than the same recovery topic (Saldaña, 2021; Taylor &amp; Bogdan, 1998; Walker, 2026). For every proposed theme, the researcher will record its central claim, contributing categories, representative excerpts, exceptions, and research-question relevance, then return to the original passages to inspect context. Candidate categories may be retained, revised, split, combined, or rejected, with earlier versions preserved. This is iterative interpretive work, not an automatic promotion of frequently used labels into themes, and it is not reflexive thematic analysis as the analytic method (Saldaña, 2021; Fereday &amp; Muir-Cochrane, 2006). The locked n = 12 will be reported as the planned participant count, not as proof of saturation; adequacy will be assessed through richness, relevant variation, question coverage, and whether later interviews still change the meaning-unit inventory (Malterud et al., 2016; Guest et al., 2020).</w:t>
+        <w:spacing w:line="480" w:lineRule="auto"/>
+      </w:pPr>
+      <w:r>
+        <w:rPr>
+          <w:rFonts w:ascii="Times New Roman" w:hAnsi="Times New Roman" w:eastAsia="Times New Roman"/>
+          <w:b w:val="0"/>
+          <w:sz w:val="24"/>
+        </w:rPr>
+        <w:t xml:space="preserve">Third, the researcher will lock meaning units that state a practice claim before any theme name is written, confirm each unit with a named excerpt and a negative or boundary case, and group related units only when they describe the same salience-to-assurance bargain rather than the same recovery topic </w:t>
       </w:r>
       <w:r>
         <w:rPr>
@@ -7249,18 +7458,67 @@
         </w:rPr>
       </w:r>
       <w:r/>
+      <w:r>
+        <w:rPr>
+          <w:rFonts w:ascii="Times New Roman" w:hAnsi="Times New Roman" w:eastAsia="Times New Roman"/>
+          <w:b/>
+          <w:sz w:val="24"/>
+        </w:rPr>
+        <w:t>(Saldaña, 2021; Taylor &amp; Bogdan, 1998; Walker, 2026)</w:t>
+      </w:r>
+      <w:r>
+        <w:rPr>
+          <w:rFonts w:ascii="Times New Roman" w:hAnsi="Times New Roman" w:eastAsia="Times New Roman"/>
+          <w:b w:val="0"/>
+          <w:sz w:val="24"/>
+        </w:rPr>
+        <w:t xml:space="preserve">. For every proposed theme, the researcher will record its central claim, contributing categories, representative excerpts, exceptions, and research-question relevance, then return to the original passages to inspect context. Candidate categories may be retained, revised, split, combined, or rejected, with earlier versions preserved. This is iterative interpretive work, not an automatic promotion of frequently used labels into themes, and it is </w:t>
+      </w:r>
+      <w:r>
+        <w:rPr>
+          <w:rFonts w:ascii="Times New Roman" w:hAnsi="Times New Roman" w:eastAsia="Times New Roman"/>
+          <w:b/>
+          <w:sz w:val="24"/>
+        </w:rPr>
+        <w:t>not reflexive thematic analysis as the analytic method (Saldaña, 2021; Fereday &amp; Muir-Cochrane, 2006)</w:t>
+      </w:r>
+      <w:r>
+        <w:rPr>
+          <w:rFonts w:ascii="Times New Roman" w:hAnsi="Times New Roman" w:eastAsia="Times New Roman"/>
+          <w:b w:val="0"/>
+          <w:sz w:val="24"/>
+        </w:rPr>
+        <w:t xml:space="preserve">. The locked n = 12 will be reported as the planned participant count, not as proof of saturation; adequacy will be assessed through richness, relevant variation, question coverage, and whether later interviews still change the meaning-unit inventory </w:t>
+      </w:r>
+      <w:r>
+        <w:rPr>
+          <w:rFonts w:ascii="Times New Roman" w:hAnsi="Times New Roman" w:eastAsia="Times New Roman"/>
+          <w:b/>
+          <w:sz w:val="24"/>
+        </w:rPr>
+        <w:t>(Malterud et al., 2016; Guest et al., 2020)</w:t>
+      </w:r>
+      <w:r>
+        <w:rPr>
+          <w:rFonts w:ascii="Times New Roman" w:hAnsi="Times New Roman" w:eastAsia="Times New Roman"/>
+          <w:b w:val="0"/>
+          <w:sz w:val="24"/>
+        </w:rPr>
+        <w:t>.</w:t>
+      </w:r>
     </w:p>
     <w:p>
       <w:pPr>
         <w:pStyle w:val="ui-markdownparagraph"/>
-      </w:pPr>
-      <w:r>
-        <w:rPr>
-          <w:rFonts w:ascii="Times New Roman" w:hAnsi="Times New Roman" w:eastAsia="Times New Roman"/>
-          <w:b w:val="0"/>
-          <w:sz w:val="24"/>
-        </w:rPr>
-        <w:t>Fourth, the researcher will write two separate syntheses from the reviewed theme records: one for stakeholder-claim management and salience shifts, and one for decision rights, escalation, and recoverability assurance (Lester et al., 2020; Percy et al., 2015). Presentation will include a meaning-unit evidence table, a theme-to-question map, and a narrative that pairs each interpretive claim with source-verified excerpts and relevant boundary cases, including Every published quotation, participant label, source locator, and thematic claim will receive a source check; table titles and theme names will be compared with the narrative. Participant counts, excerpt counts, and source counts will remain separate. The researcher will close the revision log, record unresolved gaps, and release a dated version of the report, codebook, and CSV nest (Paulus, 2023). Clerical software and retrieval aids will not replace researcher interpretation; every quotation and thematic claim will remain grounded in the CLEAN transcript and the dated audit trail (Tracy, 2010). Findings will distinguish managers’ reported interpretations from independently documented actions and will not claim statistical generalization.</w:t>
+        <w:spacing w:line="480" w:lineRule="auto"/>
+      </w:pPr>
+      <w:r>
+        <w:rPr>
+          <w:rFonts w:ascii="Times New Roman" w:hAnsi="Times New Roman" w:eastAsia="Times New Roman"/>
+          <w:b w:val="0"/>
+          <w:sz w:val="24"/>
+        </w:rPr>
+        <w:t xml:space="preserve">Fourth, the researcher will write two separate syntheses from the reviewed theme records: one for stakeholder-claim management and salience shifts, and one for decision rights, escalation, and recoverability assurance (Lester et al., 2020; Percy et al., 2015). Presentation will include a meaning-unit evidence table, a theme-to-question map, and a narrative that pairs each interpretive claim with source-verified excerpts and relevant boundary cases. </w:t>
       </w:r>
       <w:r/>
       <w:r>
@@ -7276,6 +7534,38 @@
           <w:b w:val="0"/>
           <w:sz w:val="24"/>
         </w:rPr>
+      </w:r>
+      <w:r>
+        <w:rPr>
+          <w:rFonts w:ascii="Times New Roman" w:hAnsi="Times New Roman" w:eastAsia="Times New Roman"/>
+          <w:b/>
+          <w:sz w:val="24"/>
+        </w:rPr>
+        <w:t>Every published quotation, participant label, source locator, and thematic claim will receive a source check</w:t>
+      </w:r>
+      <w:r>
+        <w:rPr>
+          <w:rFonts w:ascii="Times New Roman" w:hAnsi="Times New Roman" w:eastAsia="Times New Roman"/>
+          <w:b w:val="0"/>
+          <w:sz w:val="24"/>
+        </w:rPr>
+        <w:t xml:space="preserve">; table titles and theme names will be compared with the narrative. Participant counts, excerpt counts, and source counts will remain separate. The researcher will close the revision log, record unresolved gaps, and release a dated version of the report, codebook, and CSV nest (Paulus, 2023). Clerical software and retrieval aids will not replace researcher interpretation; every quotation and thematic claim will remain grounded in the </w:t>
+      </w:r>
+      <w:r>
+        <w:rPr>
+          <w:rFonts w:ascii="Times New Roman" w:hAnsi="Times New Roman" w:eastAsia="Times New Roman"/>
+          <w:b/>
+          <w:sz w:val="24"/>
+        </w:rPr>
+        <w:t>clean transcript</w:t>
+      </w:r>
+      <w:r>
+        <w:rPr>
+          <w:rFonts w:ascii="Times New Roman" w:hAnsi="Times New Roman" w:eastAsia="Times New Roman"/>
+          <w:b w:val="0"/>
+          <w:sz w:val="24"/>
+        </w:rPr>
+        <w:t xml:space="preserve"> and the dated audit trail (Tracy, 2010). Findings will distinguish managers’ reported interpretations from independently documented actions and will not claim statistical generalization.</w:t>
       </w:r>
     </w:p>
     <w:p>

</xml_diff>